<commit_message>
IT lab4: additional task4 slightly improved; report is done except for result section
</commit_message>
<xml_diff>
--- a/it/lab4/report.docx
+++ b/it/lab4/report.docx
@@ -81,7 +81,6 @@
         <w:rPr>
           <w:b/>
           <w:bCs/>
-          <w:lang w:val="en-US"/>
         </w:rPr>
       </w:pPr>
       <w:r>
@@ -105,13 +104,29 @@
           <w:b/>
           <w:bCs/>
         </w:rPr>
-        <w:t xml:space="preserve">Вариант </w:t>
-      </w:r>
-      <w:r>
+        <w:t>Информатика</w:t>
+      </w:r>
+    </w:p>
+    <w:p>
+      <w:pPr>
+        <w:jc w:val="center"/>
         <w:rPr>
           <w:b/>
           <w:bCs/>
         </w:rPr>
+      </w:pPr>
+      <w:r>
+        <w:rPr>
+          <w:b/>
+          <w:bCs/>
+        </w:rPr>
+        <w:t xml:space="preserve">Вариант </w:t>
+      </w:r>
+      <w:r>
+        <w:rPr>
+          <w:b/>
+          <w:bCs/>
+        </w:rPr>
         <w:t>121</w:t>
       </w:r>
     </w:p>
@@ -181,11 +196,6 @@
       <w:r>
         <w:t>Балакшин Павел Валерьевич</w:t>
       </w:r>
-    </w:p>
-    <w:p>
-      <w:pPr>
-        <w:jc w:val="center"/>
-      </w:pPr>
     </w:p>
     <w:p>
       <w:pPr>
@@ -278,7 +288,7 @@
           <w:r>
             <w:fldChar w:fldCharType="separate"/>
           </w:r>
-          <w:hyperlink w:anchor="_Toc212907063" w:history="1">
+          <w:hyperlink w:anchor="_Toc213000643" w:history="1">
             <w:r>
               <w:rPr>
                 <w:rStyle w:val="Hyperlink"/>
@@ -307,7 +317,7 @@
                 <w:noProof/>
                 <w:webHidden/>
               </w:rPr>
-              <w:instrText xml:space="preserve"> PAGEREF _Toc212907063 \h </w:instrText>
+              <w:instrText xml:space="preserve"> PAGEREF _Toc213000643 \h </w:instrText>
             </w:r>
             <w:r>
               <w:rPr>
@@ -351,7 +361,7 @@
               <w:lang w:val="en-RU" w:eastAsia="en-GB"/>
             </w:rPr>
           </w:pPr>
-          <w:hyperlink w:anchor="_Toc212907064" w:history="1">
+          <w:hyperlink w:anchor="_Toc213000644" w:history="1">
             <w:r>
               <w:rPr>
                 <w:rStyle w:val="Hyperlink"/>
@@ -378,7 +388,7 @@
                 <w:noProof/>
                 <w:webHidden/>
               </w:rPr>
-              <w:instrText xml:space="preserve"> PAGEREF _Toc212907064 \h </w:instrText>
+              <w:instrText xml:space="preserve"> PAGEREF _Toc213000644 \h </w:instrText>
             </w:r>
             <w:r>
               <w:rPr>
@@ -422,7 +432,7 @@
               <w:lang w:val="en-RU" w:eastAsia="en-GB"/>
             </w:rPr>
           </w:pPr>
-          <w:hyperlink w:anchor="_Toc212907065" w:history="1">
+          <w:hyperlink w:anchor="_Toc213000645" w:history="1">
             <w:r>
               <w:rPr>
                 <w:rStyle w:val="Hyperlink"/>
@@ -449,7 +459,7 @@
                 <w:noProof/>
                 <w:webHidden/>
               </w:rPr>
-              <w:instrText xml:space="preserve"> PAGEREF _Toc212907065 \h </w:instrText>
+              <w:instrText xml:space="preserve"> PAGEREF _Toc213000645 \h </w:instrText>
             </w:r>
             <w:r>
               <w:rPr>
@@ -493,7 +503,7 @@
               <w:lang w:val="en-RU" w:eastAsia="en-GB"/>
             </w:rPr>
           </w:pPr>
-          <w:hyperlink w:anchor="_Toc212907066" w:history="1">
+          <w:hyperlink w:anchor="_Toc213000646" w:history="1">
             <w:r>
               <w:rPr>
                 <w:rStyle w:val="Hyperlink"/>
@@ -520,7 +530,7 @@
                 <w:noProof/>
                 <w:webHidden/>
               </w:rPr>
-              <w:instrText xml:space="preserve"> PAGEREF _Toc212907066 \h </w:instrText>
+              <w:instrText xml:space="preserve"> PAGEREF _Toc213000646 \h </w:instrText>
             </w:r>
             <w:r>
               <w:rPr>
@@ -564,7 +574,7 @@
               <w:lang w:val="en-RU" w:eastAsia="en-GB"/>
             </w:rPr>
           </w:pPr>
-          <w:hyperlink w:anchor="_Toc212907067" w:history="1">
+          <w:hyperlink w:anchor="_Toc213000647" w:history="1">
             <w:r>
               <w:rPr>
                 <w:rStyle w:val="Hyperlink"/>
@@ -591,7 +601,7 @@
                 <w:noProof/>
                 <w:webHidden/>
               </w:rPr>
-              <w:instrText xml:space="preserve"> PAGEREF _Toc212907067 \h </w:instrText>
+              <w:instrText xml:space="preserve"> PAGEREF _Toc213000647 \h </w:instrText>
             </w:r>
             <w:r>
               <w:rPr>
@@ -611,7 +621,7 @@
                 <w:noProof/>
                 <w:webHidden/>
               </w:rPr>
-              <w:t>3</w:t>
+              <w:t>4</w:t>
             </w:r>
             <w:r>
               <w:rPr>
@@ -635,7 +645,7 @@
               <w:lang w:val="en-RU" w:eastAsia="en-GB"/>
             </w:rPr>
           </w:pPr>
-          <w:hyperlink w:anchor="_Toc212907068" w:history="1">
+          <w:hyperlink w:anchor="_Toc213000648" w:history="1">
             <w:r>
               <w:rPr>
                 <w:rStyle w:val="Hyperlink"/>
@@ -662,7 +672,7 @@
                 <w:noProof/>
                 <w:webHidden/>
               </w:rPr>
-              <w:instrText xml:space="preserve"> PAGEREF _Toc212907068 \h </w:instrText>
+              <w:instrText xml:space="preserve"> PAGEREF _Toc213000648 \h </w:instrText>
             </w:r>
             <w:r>
               <w:rPr>
@@ -706,7 +716,7 @@
               <w:lang w:val="en-RU" w:eastAsia="en-GB"/>
             </w:rPr>
           </w:pPr>
-          <w:hyperlink w:anchor="_Toc212907069" w:history="1">
+          <w:hyperlink w:anchor="_Toc213000649" w:history="1">
             <w:r>
               <w:rPr>
                 <w:rStyle w:val="Hyperlink"/>
@@ -733,7 +743,7 @@
                 <w:noProof/>
                 <w:webHidden/>
               </w:rPr>
-              <w:instrText xml:space="preserve"> PAGEREF _Toc212907069 \h </w:instrText>
+              <w:instrText xml:space="preserve"> PAGEREF _Toc213000649 \h </w:instrText>
             </w:r>
             <w:r>
               <w:rPr>
@@ -777,7 +787,7 @@
               <w:lang w:val="en-RU" w:eastAsia="en-GB"/>
             </w:rPr>
           </w:pPr>
-          <w:hyperlink w:anchor="_Toc212907070" w:history="1">
+          <w:hyperlink w:anchor="_Toc213000650" w:history="1">
             <w:r>
               <w:rPr>
                 <w:rStyle w:val="Hyperlink"/>
@@ -806,7 +816,7 @@
                 <w:noProof/>
                 <w:webHidden/>
               </w:rPr>
-              <w:instrText xml:space="preserve"> PAGEREF _Toc212907070 \h </w:instrText>
+              <w:instrText xml:space="preserve"> PAGEREF _Toc213000650 \h </w:instrText>
             </w:r>
             <w:r>
               <w:rPr>
@@ -827,6 +837,361 @@
                 <w:webHidden/>
               </w:rPr>
               <w:t>5</w:t>
+            </w:r>
+            <w:r>
+              <w:rPr>
+                <w:noProof/>
+                <w:webHidden/>
+              </w:rPr>
+              <w:fldChar w:fldCharType="end"/>
+            </w:r>
+          </w:hyperlink>
+        </w:p>
+        <w:p>
+          <w:pPr>
+            <w:pStyle w:val="TOC2"/>
+            <w:tabs>
+              <w:tab w:val="right" w:leader="dot" w:pos="9344"/>
+            </w:tabs>
+            <w:rPr>
+              <w:rFonts w:asciiTheme="minorHAnsi" w:eastAsiaTheme="minorEastAsia" w:hAnsiTheme="minorHAnsi"/>
+              <w:noProof/>
+              <w:sz w:val="24"/>
+              <w:lang w:val="en-RU" w:eastAsia="en-GB"/>
+            </w:rPr>
+          </w:pPr>
+          <w:hyperlink w:anchor="_Toc213000651" w:history="1">
+            <w:r>
+              <w:rPr>
+                <w:rStyle w:val="Hyperlink"/>
+                <w:noProof/>
+              </w:rPr>
+              <w:t>Обязательное задание</w:t>
+            </w:r>
+            <w:r>
+              <w:rPr>
+                <w:noProof/>
+                <w:webHidden/>
+              </w:rPr>
+              <w:tab/>
+            </w:r>
+            <w:r>
+              <w:rPr>
+                <w:noProof/>
+                <w:webHidden/>
+              </w:rPr>
+              <w:fldChar w:fldCharType="begin"/>
+            </w:r>
+            <w:r>
+              <w:rPr>
+                <w:noProof/>
+                <w:webHidden/>
+              </w:rPr>
+              <w:instrText xml:space="preserve"> PAGEREF _Toc213000651 \h </w:instrText>
+            </w:r>
+            <w:r>
+              <w:rPr>
+                <w:noProof/>
+                <w:webHidden/>
+              </w:rPr>
+            </w:r>
+            <w:r>
+              <w:rPr>
+                <w:noProof/>
+                <w:webHidden/>
+              </w:rPr>
+              <w:fldChar w:fldCharType="separate"/>
+            </w:r>
+            <w:r>
+              <w:rPr>
+                <w:noProof/>
+                <w:webHidden/>
+              </w:rPr>
+              <w:t>5</w:t>
+            </w:r>
+            <w:r>
+              <w:rPr>
+                <w:noProof/>
+                <w:webHidden/>
+              </w:rPr>
+              <w:fldChar w:fldCharType="end"/>
+            </w:r>
+          </w:hyperlink>
+        </w:p>
+        <w:p>
+          <w:pPr>
+            <w:pStyle w:val="TOC2"/>
+            <w:tabs>
+              <w:tab w:val="right" w:leader="dot" w:pos="9344"/>
+            </w:tabs>
+            <w:rPr>
+              <w:rFonts w:asciiTheme="minorHAnsi" w:eastAsiaTheme="minorEastAsia" w:hAnsiTheme="minorHAnsi"/>
+              <w:noProof/>
+              <w:sz w:val="24"/>
+              <w:lang w:val="en-RU" w:eastAsia="en-GB"/>
+            </w:rPr>
+          </w:pPr>
+          <w:hyperlink w:anchor="_Toc213000652" w:history="1">
+            <w:r>
+              <w:rPr>
+                <w:rStyle w:val="Hyperlink"/>
+                <w:noProof/>
+              </w:rPr>
+              <w:t>Дополнительное задание 1</w:t>
+            </w:r>
+            <w:r>
+              <w:rPr>
+                <w:noProof/>
+                <w:webHidden/>
+              </w:rPr>
+              <w:tab/>
+            </w:r>
+            <w:r>
+              <w:rPr>
+                <w:noProof/>
+                <w:webHidden/>
+              </w:rPr>
+              <w:fldChar w:fldCharType="begin"/>
+            </w:r>
+            <w:r>
+              <w:rPr>
+                <w:noProof/>
+                <w:webHidden/>
+              </w:rPr>
+              <w:instrText xml:space="preserve"> PAGEREF _Toc213000652 \h </w:instrText>
+            </w:r>
+            <w:r>
+              <w:rPr>
+                <w:noProof/>
+                <w:webHidden/>
+              </w:rPr>
+            </w:r>
+            <w:r>
+              <w:rPr>
+                <w:noProof/>
+                <w:webHidden/>
+              </w:rPr>
+              <w:fldChar w:fldCharType="separate"/>
+            </w:r>
+            <w:r>
+              <w:rPr>
+                <w:noProof/>
+                <w:webHidden/>
+              </w:rPr>
+              <w:t>6</w:t>
+            </w:r>
+            <w:r>
+              <w:rPr>
+                <w:noProof/>
+                <w:webHidden/>
+              </w:rPr>
+              <w:fldChar w:fldCharType="end"/>
+            </w:r>
+          </w:hyperlink>
+        </w:p>
+        <w:p>
+          <w:pPr>
+            <w:pStyle w:val="TOC2"/>
+            <w:tabs>
+              <w:tab w:val="right" w:leader="dot" w:pos="9344"/>
+            </w:tabs>
+            <w:rPr>
+              <w:rFonts w:asciiTheme="minorHAnsi" w:eastAsiaTheme="minorEastAsia" w:hAnsiTheme="minorHAnsi"/>
+              <w:noProof/>
+              <w:sz w:val="24"/>
+              <w:lang w:val="en-RU" w:eastAsia="en-GB"/>
+            </w:rPr>
+          </w:pPr>
+          <w:hyperlink w:anchor="_Toc213000653" w:history="1">
+            <w:r>
+              <w:rPr>
+                <w:rStyle w:val="Hyperlink"/>
+                <w:noProof/>
+              </w:rPr>
+              <w:t>Дополнительное задание 2</w:t>
+            </w:r>
+            <w:r>
+              <w:rPr>
+                <w:noProof/>
+                <w:webHidden/>
+              </w:rPr>
+              <w:tab/>
+            </w:r>
+            <w:r>
+              <w:rPr>
+                <w:noProof/>
+                <w:webHidden/>
+              </w:rPr>
+              <w:fldChar w:fldCharType="begin"/>
+            </w:r>
+            <w:r>
+              <w:rPr>
+                <w:noProof/>
+                <w:webHidden/>
+              </w:rPr>
+              <w:instrText xml:space="preserve"> PAGEREF _Toc213000653 \h </w:instrText>
+            </w:r>
+            <w:r>
+              <w:rPr>
+                <w:noProof/>
+                <w:webHidden/>
+              </w:rPr>
+            </w:r>
+            <w:r>
+              <w:rPr>
+                <w:noProof/>
+                <w:webHidden/>
+              </w:rPr>
+              <w:fldChar w:fldCharType="separate"/>
+            </w:r>
+            <w:r>
+              <w:rPr>
+                <w:noProof/>
+                <w:webHidden/>
+              </w:rPr>
+              <w:t>7</w:t>
+            </w:r>
+            <w:r>
+              <w:rPr>
+                <w:noProof/>
+                <w:webHidden/>
+              </w:rPr>
+              <w:fldChar w:fldCharType="end"/>
+            </w:r>
+          </w:hyperlink>
+        </w:p>
+        <w:p>
+          <w:pPr>
+            <w:pStyle w:val="TOC2"/>
+            <w:tabs>
+              <w:tab w:val="right" w:leader="dot" w:pos="9344"/>
+            </w:tabs>
+            <w:rPr>
+              <w:rFonts w:asciiTheme="minorHAnsi" w:eastAsiaTheme="minorEastAsia" w:hAnsiTheme="minorHAnsi"/>
+              <w:noProof/>
+              <w:sz w:val="24"/>
+              <w:lang w:val="en-RU" w:eastAsia="en-GB"/>
+            </w:rPr>
+          </w:pPr>
+          <w:hyperlink w:anchor="_Toc213000654" w:history="1">
+            <w:r>
+              <w:rPr>
+                <w:rStyle w:val="Hyperlink"/>
+                <w:noProof/>
+              </w:rPr>
+              <w:t>Дополнительное задание 3</w:t>
+            </w:r>
+            <w:r>
+              <w:rPr>
+                <w:noProof/>
+                <w:webHidden/>
+              </w:rPr>
+              <w:tab/>
+            </w:r>
+            <w:r>
+              <w:rPr>
+                <w:noProof/>
+                <w:webHidden/>
+              </w:rPr>
+              <w:fldChar w:fldCharType="begin"/>
+            </w:r>
+            <w:r>
+              <w:rPr>
+                <w:noProof/>
+                <w:webHidden/>
+              </w:rPr>
+              <w:instrText xml:space="preserve"> PAGEREF _Toc213000654 \h </w:instrText>
+            </w:r>
+            <w:r>
+              <w:rPr>
+                <w:noProof/>
+                <w:webHidden/>
+              </w:rPr>
+            </w:r>
+            <w:r>
+              <w:rPr>
+                <w:noProof/>
+                <w:webHidden/>
+              </w:rPr>
+              <w:fldChar w:fldCharType="separate"/>
+            </w:r>
+            <w:r>
+              <w:rPr>
+                <w:noProof/>
+                <w:webHidden/>
+              </w:rPr>
+              <w:t>8</w:t>
+            </w:r>
+            <w:r>
+              <w:rPr>
+                <w:noProof/>
+                <w:webHidden/>
+              </w:rPr>
+              <w:fldChar w:fldCharType="end"/>
+            </w:r>
+          </w:hyperlink>
+        </w:p>
+        <w:p>
+          <w:pPr>
+            <w:pStyle w:val="TOC2"/>
+            <w:tabs>
+              <w:tab w:val="right" w:leader="dot" w:pos="9344"/>
+            </w:tabs>
+            <w:rPr>
+              <w:rFonts w:asciiTheme="minorHAnsi" w:eastAsiaTheme="minorEastAsia" w:hAnsiTheme="minorHAnsi"/>
+              <w:noProof/>
+              <w:sz w:val="24"/>
+              <w:lang w:val="en-RU" w:eastAsia="en-GB"/>
+            </w:rPr>
+          </w:pPr>
+          <w:hyperlink w:anchor="_Toc213000655" w:history="1">
+            <w:r>
+              <w:rPr>
+                <w:rStyle w:val="Hyperlink"/>
+                <w:noProof/>
+              </w:rPr>
+              <w:t>Дополнительное задание 4</w:t>
+            </w:r>
+            <w:r>
+              <w:rPr>
+                <w:noProof/>
+                <w:webHidden/>
+              </w:rPr>
+              <w:tab/>
+            </w:r>
+            <w:r>
+              <w:rPr>
+                <w:noProof/>
+                <w:webHidden/>
+              </w:rPr>
+              <w:fldChar w:fldCharType="begin"/>
+            </w:r>
+            <w:r>
+              <w:rPr>
+                <w:noProof/>
+                <w:webHidden/>
+              </w:rPr>
+              <w:instrText xml:space="preserve"> PAGEREF _Toc213000655 \h </w:instrText>
+            </w:r>
+            <w:r>
+              <w:rPr>
+                <w:noProof/>
+                <w:webHidden/>
+              </w:rPr>
+            </w:r>
+            <w:r>
+              <w:rPr>
+                <w:noProof/>
+                <w:webHidden/>
+              </w:rPr>
+              <w:fldChar w:fldCharType="separate"/>
+            </w:r>
+            <w:r>
+              <w:rPr>
+                <w:noProof/>
+                <w:webHidden/>
+              </w:rPr>
+              <w:t>9</w:t>
             </w:r>
             <w:r>
               <w:rPr>
@@ -850,7 +1215,7 @@
               <w:lang w:val="en-RU" w:eastAsia="en-GB"/>
             </w:rPr>
           </w:pPr>
-          <w:hyperlink w:anchor="_Toc212907071" w:history="1">
+          <w:hyperlink w:anchor="_Toc213000656" w:history="1">
             <w:r>
               <w:rPr>
                 <w:rStyle w:val="Hyperlink"/>
@@ -879,7 +1244,7 @@
                 <w:noProof/>
                 <w:webHidden/>
               </w:rPr>
-              <w:instrText xml:space="preserve"> PAGEREF _Toc212907071 \h </w:instrText>
+              <w:instrText xml:space="preserve"> PAGEREF _Toc213000656 \h </w:instrText>
             </w:r>
             <w:r>
               <w:rPr>
@@ -899,7 +1264,7 @@
                 <w:noProof/>
                 <w:webHidden/>
               </w:rPr>
-              <w:t>6</w:t>
+              <w:t>10</w:t>
             </w:r>
             <w:r>
               <w:rPr>
@@ -923,7 +1288,7 @@
               <w:lang w:val="en-RU" w:eastAsia="en-GB"/>
             </w:rPr>
           </w:pPr>
-          <w:hyperlink w:anchor="_Toc212907072" w:history="1">
+          <w:hyperlink w:anchor="_Toc213000657" w:history="1">
             <w:r>
               <w:rPr>
                 <w:rStyle w:val="Hyperlink"/>
@@ -952,7 +1317,7 @@
                 <w:noProof/>
                 <w:webHidden/>
               </w:rPr>
-              <w:instrText xml:space="preserve"> PAGEREF _Toc212907072 \h </w:instrText>
+              <w:instrText xml:space="preserve"> PAGEREF _Toc213000657 \h </w:instrText>
             </w:r>
             <w:r>
               <w:rPr>
@@ -972,7 +1337,7 @@
                 <w:noProof/>
                 <w:webHidden/>
               </w:rPr>
-              <w:t>7</w:t>
+              <w:t>11</w:t>
             </w:r>
             <w:r>
               <w:rPr>
@@ -999,17 +1364,6 @@
     <w:p/>
     <w:p/>
     <w:p/>
-    <w:p/>
-    <w:p/>
-    <w:p/>
-    <w:p>
-      <w:pPr>
-        <w:rPr>
-          <w:lang w:val="en-US"/>
-        </w:rPr>
-      </w:pPr>
-    </w:p>
-    <w:p/>
     <w:p>
       <w:pPr>
         <w:pStyle w:val="Heading1"/>
@@ -1020,7 +1374,7 @@
           <w:lang w:val="en-US"/>
         </w:rPr>
       </w:pPr>
-      <w:bookmarkStart w:id="0" w:name="_Toc212907063"/>
+      <w:bookmarkStart w:id="0" w:name="_Toc213000643"/>
       <w:r>
         <w:rPr>
           <w:b/>
@@ -1171,7 +1525,7 @@
         <w:pStyle w:val="Heading2"/>
         <w:jc w:val="center"/>
       </w:pPr>
-      <w:bookmarkStart w:id="1" w:name="_Toc212907064"/>
+      <w:bookmarkStart w:id="1" w:name="_Toc213000644"/>
       <w:r>
         <w:t>Обязательное задание</w:t>
       </w:r>
@@ -1238,7 +1592,7 @@
         <w:pStyle w:val="Heading2"/>
         <w:jc w:val="center"/>
       </w:pPr>
-      <w:bookmarkStart w:id="2" w:name="_Toc212907065"/>
+      <w:bookmarkStart w:id="2" w:name="_Toc213000645"/>
       <w:r>
         <w:t>Дополнительные задания</w:t>
       </w:r>
@@ -1249,7 +1603,7 @@
         <w:pStyle w:val="Heading3"/>
         <w:jc w:val="center"/>
       </w:pPr>
-      <w:bookmarkStart w:id="3" w:name="_Toc212907066"/>
+      <w:bookmarkStart w:id="3" w:name="_Toc213000646"/>
       <w:r>
         <w:t>1</w:t>
       </w:r>
@@ -1281,13 +1635,7 @@
         <w:jc w:val="both"/>
       </w:pPr>
       <w:r>
-        <w:t>•</w:t>
-      </w:r>
-      <w:r>
-        <w:t xml:space="preserve"> </w:t>
-      </w:r>
-      <w:r>
-        <w:t xml:space="preserve">для решения задачи использует формальные грамматики; </w:t>
+        <w:t xml:space="preserve">• для решения задачи использует формальные грамматики; </w:t>
       </w:r>
     </w:p>
     <w:p>
@@ -1296,13 +1644,7 @@
         <w:jc w:val="both"/>
       </w:pPr>
       <w:r>
-        <w:t>•</w:t>
-      </w:r>
-      <w:r>
-        <w:t xml:space="preserve"> </w:t>
-      </w:r>
-      <w:r>
-        <w:t xml:space="preserve">не </w:t>
+        <w:t xml:space="preserve">• не </w:t>
       </w:r>
       <w:proofErr w:type="spellStart"/>
       <w:r>
@@ -1321,7 +1663,7 @@
           <w:color w:val="000000" w:themeColor="text1"/>
         </w:rPr>
       </w:pPr>
-      <w:bookmarkStart w:id="4" w:name="_Toc212907067"/>
+      <w:bookmarkStart w:id="4" w:name="_Toc213000647"/>
       <w:r>
         <w:rPr>
           <w:color w:val="000000" w:themeColor="text1"/>
@@ -1374,7 +1716,7 @@
         <w:pStyle w:val="Heading3"/>
         <w:jc w:val="center"/>
       </w:pPr>
-      <w:bookmarkStart w:id="5" w:name="_Toc212907068"/>
+      <w:bookmarkStart w:id="5" w:name="_Toc213000648"/>
       <w:r>
         <w:t>3</w:t>
       </w:r>
@@ -1388,19 +1730,7 @@
         <w:jc w:val="both"/>
       </w:pPr>
       <w:r>
-        <w:t>Переписать код из дополнительного задания №1, чтобы сер</w:t>
-      </w:r>
-      <w:r>
-        <w:t>и</w:t>
-      </w:r>
-      <w:r>
-        <w:t>ализация прои</w:t>
-      </w:r>
-      <w:r>
-        <w:t>з</w:t>
-      </w:r>
-      <w:r>
-        <w:t>водилась в XML файл.</w:t>
+        <w:t>Переписать код из дополнительного задания №1, чтобы сериализация производилась в XML файл.</w:t>
       </w:r>
     </w:p>
     <w:p>
@@ -1408,7 +1738,7 @@
         <w:pStyle w:val="Heading3"/>
         <w:jc w:val="center"/>
       </w:pPr>
-      <w:bookmarkStart w:id="6" w:name="_Toc212907069"/>
+      <w:bookmarkStart w:id="6" w:name="_Toc213000649"/>
       <w:r>
         <w:t>4 Задание</w:t>
       </w:r>
@@ -1468,9 +1798,6 @@
     <w:p>
       <w:pPr>
         <w:jc w:val="both"/>
-        <w:rPr>
-          <w:lang w:val="en-US"/>
-        </w:rPr>
       </w:pPr>
     </w:p>
     <w:p>
@@ -1487,7 +1814,7 @@
           <w:bCs/>
         </w:rPr>
       </w:pPr>
-      <w:bookmarkStart w:id="7" w:name="_Toc212907070"/>
+      <w:bookmarkStart w:id="7" w:name="_Toc213000650"/>
       <w:r>
         <w:rPr>
           <w:b/>
@@ -1510,9 +1837,11 @@
         <w:pStyle w:val="Heading2"/>
         <w:jc w:val="center"/>
       </w:pPr>
+      <w:bookmarkStart w:id="8" w:name="_Toc213000651"/>
       <w:r>
         <w:t>Обязательное задание</w:t>
       </w:r>
+      <w:bookmarkEnd w:id="8"/>
     </w:p>
     <w:p>
       <w:pPr>
@@ -1752,10 +2081,12 @@
         <w:pStyle w:val="Heading2"/>
         <w:jc w:val="center"/>
       </w:pPr>
+      <w:bookmarkStart w:id="9" w:name="_Toc213000652"/>
       <w:r>
         <w:lastRenderedPageBreak/>
         <w:t>Дополнительное задание 1</w:t>
       </w:r>
+      <w:bookmarkEnd w:id="9"/>
     </w:p>
     <w:p>
       <w:pPr>
@@ -1846,47 +2177,33 @@
             <w:rStyle w:val="Hyperlink"/>
             <w:lang w:val="en-US"/>
           </w:rPr>
-          <w:t>la</w:t>
+          <w:t>lab</w:t>
+        </w:r>
+        <w:r>
+          <w:rPr>
+            <w:rStyle w:val="Hyperlink"/>
+          </w:rPr>
+          <w:t>4/</w:t>
         </w:r>
         <w:r>
           <w:rPr>
             <w:rStyle w:val="Hyperlink"/>
             <w:lang w:val="en-US"/>
           </w:rPr>
-          <w:t>b</w:t>
-        </w:r>
-        <w:r>
-          <w:rPr>
-            <w:rStyle w:val="Hyperlink"/>
-          </w:rPr>
-          <w:t>4/</w:t>
+          <w:t>code</w:t>
+        </w:r>
+        <w:r>
+          <w:rPr>
+            <w:rStyle w:val="Hyperlink"/>
+          </w:rPr>
+          <w:t>/</w:t>
         </w:r>
         <w:r>
           <w:rPr>
             <w:rStyle w:val="Hyperlink"/>
             <w:lang w:val="en-US"/>
           </w:rPr>
-          <w:t>code</w:t>
-        </w:r>
-        <w:r>
-          <w:rPr>
-            <w:rStyle w:val="Hyperlink"/>
-          </w:rPr>
-          <w:t>/</w:t>
-        </w:r>
-        <w:r>
-          <w:rPr>
-            <w:rStyle w:val="Hyperlink"/>
-            <w:lang w:val="en-US"/>
-          </w:rPr>
-          <w:t>ad</w:t>
-        </w:r>
-        <w:r>
-          <w:rPr>
-            <w:rStyle w:val="Hyperlink"/>
-            <w:lang w:val="en-US"/>
-          </w:rPr>
-          <w:t>d</w:t>
+          <w:t>add</w:t>
         </w:r>
         <w:r>
           <w:rPr>
@@ -2054,10 +2371,12 @@
         <w:pStyle w:val="Heading2"/>
         <w:jc w:val="center"/>
       </w:pPr>
+      <w:bookmarkStart w:id="10" w:name="_Toc213000653"/>
       <w:r>
         <w:lastRenderedPageBreak/>
         <w:t>Дополнительное задание 2</w:t>
       </w:r>
+      <w:bookmarkEnd w:id="10"/>
     </w:p>
     <w:p>
       <w:pPr>
@@ -2180,13 +2499,7 @@
           <w:rPr>
             <w:rStyle w:val="Hyperlink"/>
           </w:rPr>
-          <w:t>2</w:t>
-        </w:r>
-        <w:r>
-          <w:rPr>
-            <w:rStyle w:val="Hyperlink"/>
-          </w:rPr>
-          <w:t>.</w:t>
+          <w:t>2.</w:t>
         </w:r>
         <w:proofErr w:type="spellStart"/>
         <w:r>
@@ -2252,19 +2565,7 @@
           <w:rPr>
             <w:rStyle w:val="Hyperlink"/>
           </w:rPr>
-          <w:t>https://pypi.org/proj</w:t>
-        </w:r>
-        <w:r>
-          <w:rPr>
-            <w:rStyle w:val="Hyperlink"/>
-          </w:rPr>
-          <w:t>e</w:t>
-        </w:r>
-        <w:r>
-          <w:rPr>
-            <w:rStyle w:val="Hyperlink"/>
-          </w:rPr>
-          <w:t>ct/python-hcl2/</w:t>
+          <w:t>https://pypi.org/project/python-hcl2/</w:t>
         </w:r>
       </w:hyperlink>
       <w:r>
@@ -2301,7 +2602,265 @@
           <w:rPr>
             <w:rStyle w:val="Hyperlink"/>
           </w:rPr>
-          <w:t>https://pypi</w:t>
+          <w:t>https://pypi.org/project/PyYAML/</w:t>
+        </w:r>
+      </w:hyperlink>
+      <w:r>
+        <w:t xml:space="preserve">, </w:t>
+      </w:r>
+      <w:r>
+        <w:t>дата обращения 08</w:t>
+      </w:r>
+      <w:r>
+        <w:t>.11.2025]</w:t>
+      </w:r>
+      <w:r>
+        <w:t>.</w:t>
+      </w:r>
+    </w:p>
+    <w:p>
+      <w:pPr>
+        <w:jc w:val="both"/>
+      </w:pPr>
+      <w:r>
+        <w:t>Осно</w:t>
+      </w:r>
+      <w:r>
+        <w:t>вное различие между файлом созданным моим алгоритмом</w:t>
+      </w:r>
+      <w:r>
+        <w:t xml:space="preserve"> </w:t>
+      </w:r>
+      <w:r>
+        <w:t>и</w:t>
+      </w:r>
+      <w:r>
+        <w:t xml:space="preserve"> файлом</w:t>
+      </w:r>
+      <w:r>
+        <w:t xml:space="preserve">, </w:t>
+      </w:r>
+      <w:r>
+        <w:t>созданном</w:t>
+      </w:r>
+      <w:r>
+        <w:t xml:space="preserve"> библиотеками</w:t>
+      </w:r>
+      <w:r>
+        <w:t>:</w:t>
+      </w:r>
+    </w:p>
+    <w:p>
+      <w:pPr>
+        <w:pStyle w:val="ListParagraph"/>
+        <w:numPr>
+          <w:ilvl w:val="0"/>
+          <w:numId w:val="6"/>
+        </w:numPr>
+        <w:jc w:val="both"/>
+      </w:pPr>
+      <w:r>
+        <w:t>Р</w:t>
+      </w:r>
+      <w:r>
+        <w:t xml:space="preserve">азные </w:t>
+      </w:r>
+      <w:proofErr w:type="spellStart"/>
+      <w:r>
+        <w:t>индентации</w:t>
+      </w:r>
+      <w:proofErr w:type="spellEnd"/>
+      <w:r>
+        <w:t xml:space="preserve">: </w:t>
+      </w:r>
+      <w:r>
+        <w:t xml:space="preserve">в моем </w:t>
+      </w:r>
+      <w:r>
+        <w:t xml:space="preserve">файле </w:t>
+      </w:r>
+      <w:r>
+        <w:t xml:space="preserve">используется </w:t>
+      </w:r>
+      <w:r>
+        <w:t>табуляция(</w:t>
+      </w:r>
+      <w:r>
+        <w:t>\</w:t>
+      </w:r>
+      <w:r>
+        <w:rPr>
+          <w:lang w:val="en-US"/>
+        </w:rPr>
+        <w:t>t</w:t>
+      </w:r>
+      <w:r>
+        <w:t>)</w:t>
+      </w:r>
+      <w:r>
+        <w:t xml:space="preserve">, </w:t>
+      </w:r>
+      <w:r>
+        <w:t>в библиотеках по 2 пробела</w:t>
+      </w:r>
+      <w:r>
+        <w:t>.</w:t>
+      </w:r>
+    </w:p>
+    <w:p>
+      <w:pPr>
+        <w:pStyle w:val="ListParagraph"/>
+        <w:numPr>
+          <w:ilvl w:val="0"/>
+          <w:numId w:val="6"/>
+        </w:numPr>
+        <w:jc w:val="both"/>
+      </w:pPr>
+      <w:r>
+        <w:t>Мой алгоритм оформляет каждый блок с новой строки</w:t>
+      </w:r>
+      <w:r>
+        <w:t xml:space="preserve">, </w:t>
+      </w:r>
+      <w:r>
+        <w:t>а библиотеки не всегда переходят на новую строку</w:t>
+      </w:r>
+      <w:r>
+        <w:t>.</w:t>
+      </w:r>
+    </w:p>
+    <w:p>
+      <w:pPr>
+        <w:jc w:val="both"/>
+        <w:rPr>
+          <w:sz w:val="24"/>
+        </w:rPr>
+      </w:pPr>
+      <w:r>
+        <w:t xml:space="preserve">В остальном файлы схожи: оба корректны с точки зрения синтаксиса и </w:t>
+      </w:r>
+      <w:proofErr w:type="spellStart"/>
+      <w:r>
+        <w:t>парсятся</w:t>
+      </w:r>
+      <w:proofErr w:type="spellEnd"/>
+      <w:r>
+        <w:t xml:space="preserve"> одинаково.</w:t>
+      </w:r>
+    </w:p>
+    <w:p>
+      <w:pPr>
+        <w:jc w:val="both"/>
+      </w:pPr>
+      <w:r>
+        <w:t xml:space="preserve">Просмотреть примеры сериализации можно на </w:t>
+      </w:r>
+      <w:proofErr w:type="spellStart"/>
+      <w:r>
+        <w:rPr>
+          <w:lang w:val="en-US"/>
+        </w:rPr>
+        <w:t>Github</w:t>
+      </w:r>
+      <w:proofErr w:type="spellEnd"/>
+      <w:r>
+        <w:t>:</w:t>
+      </w:r>
+    </w:p>
+    <w:p>
+      <w:pPr>
+        <w:jc w:val="both"/>
+      </w:pPr>
+      <w:r>
+        <w:t xml:space="preserve">Мой алгоритм - </w:t>
+      </w:r>
+      <w:r>
+        <w:t xml:space="preserve">[Электронный ресурс: </w:t>
+      </w:r>
+      <w:hyperlink r:id="rId13" w:history="1">
+        <w:r>
+          <w:rPr>
+            <w:rStyle w:val="Hyperlink"/>
+          </w:rPr>
+          <w:t>https://github.com/Miwm64/itmo_</w:t>
+        </w:r>
+        <w:r>
+          <w:rPr>
+            <w:rStyle w:val="Hyperlink"/>
+            <w:lang w:val="en-US"/>
+          </w:rPr>
+          <w:t>cse</w:t>
+        </w:r>
+        <w:r>
+          <w:rPr>
+            <w:rStyle w:val="Hyperlink"/>
+          </w:rPr>
+          <w:t>/blob/master/</w:t>
+        </w:r>
+        <w:r>
+          <w:rPr>
+            <w:rStyle w:val="Hyperlink"/>
+            <w:lang w:val="en-US"/>
+          </w:rPr>
+          <w:t>it</w:t>
+        </w:r>
+        <w:r>
+          <w:rPr>
+            <w:rStyle w:val="Hyperlink"/>
+          </w:rPr>
+          <w:t>/</w:t>
+        </w:r>
+        <w:r>
+          <w:rPr>
+            <w:rStyle w:val="Hyperlink"/>
+            <w:lang w:val="en-US"/>
+          </w:rPr>
+          <w:t>lab</w:t>
+        </w:r>
+        <w:r>
+          <w:rPr>
+            <w:rStyle w:val="Hyperlink"/>
+          </w:rPr>
+          <w:t>4/</w:t>
+        </w:r>
+        <w:r>
+          <w:rPr>
+            <w:rStyle w:val="Hyperlink"/>
+            <w:lang w:val="en-US"/>
+          </w:rPr>
+          <w:t>code</w:t>
+        </w:r>
+        <w:r>
+          <w:rPr>
+            <w:rStyle w:val="Hyperlink"/>
+          </w:rPr>
+          <w:t>/</w:t>
+        </w:r>
+        <w:r>
+          <w:rPr>
+            <w:rStyle w:val="Hyperlink"/>
+            <w:lang w:val="en-US"/>
+          </w:rPr>
+          <w:t>output</w:t>
+        </w:r>
+        <w:r>
+          <w:rPr>
+            <w:rStyle w:val="Hyperlink"/>
+          </w:rPr>
+          <w:t>_</w:t>
+        </w:r>
+        <w:r>
+          <w:rPr>
+            <w:rStyle w:val="Hyperlink"/>
+            <w:lang w:val="en-US"/>
+          </w:rPr>
+          <w:t>add</w:t>
+        </w:r>
+        <w:r>
+          <w:rPr>
+            <w:rStyle w:val="Hyperlink"/>
+          </w:rPr>
+          <w:t>1</w:t>
         </w:r>
         <w:r>
           <w:rPr>
@@ -2312,18 +2871,19 @@
         <w:r>
           <w:rPr>
             <w:rStyle w:val="Hyperlink"/>
-          </w:rPr>
-          <w:t>org/project/PyYAML/</w:t>
+            <w:lang w:val="en-US"/>
+          </w:rPr>
+          <w:t>hcl</w:t>
         </w:r>
       </w:hyperlink>
       <w:r>
-        <w:t xml:space="preserve">, </w:t>
-      </w:r>
-      <w:r>
-        <w:t>дата обращения 08</w:t>
-      </w:r>
-      <w:r>
-        <w:t>.11.2025]</w:t>
+        <w:t xml:space="preserve">, дата обращения </w:t>
+      </w:r>
+      <w:r>
+        <w:t>08.11</w:t>
+      </w:r>
+      <w:r>
+        <w:t>.2025]</w:t>
       </w:r>
       <w:r>
         <w:t>.</w:t>
@@ -2334,36 +2894,317 @@
         <w:jc w:val="both"/>
       </w:pPr>
       <w:r>
-        <w:t>Осно</w:t>
-      </w:r>
-      <w:r>
-        <w:t xml:space="preserve">вное различие между файлом созданным моим алгоритмом и библиотеками – разные </w:t>
+        <w:t xml:space="preserve">Библиотеки - </w:t>
+      </w:r>
+      <w:r>
+        <w:t>[Электронный ресурс:</w:t>
+      </w:r>
+      <w:r>
+        <w:t xml:space="preserve"> </w:t>
+      </w:r>
+      <w:hyperlink r:id="rId14" w:history="1">
+        <w:r>
+          <w:rPr>
+            <w:rStyle w:val="Hyperlink"/>
+          </w:rPr>
+          <w:t>https://github.com/Miwm64/itmo_</w:t>
+        </w:r>
+        <w:proofErr w:type="spellStart"/>
+        <w:r>
+          <w:rPr>
+            <w:rStyle w:val="Hyperlink"/>
+            <w:lang w:val="en-US"/>
+          </w:rPr>
+          <w:t>cse</w:t>
+        </w:r>
+        <w:proofErr w:type="spellEnd"/>
+        <w:r>
+          <w:rPr>
+            <w:rStyle w:val="Hyperlink"/>
+          </w:rPr>
+          <w:t>/</w:t>
+        </w:r>
+        <w:proofErr w:type="spellStart"/>
+        <w:r>
+          <w:rPr>
+            <w:rStyle w:val="Hyperlink"/>
+          </w:rPr>
+          <w:t>blob</w:t>
+        </w:r>
+        <w:proofErr w:type="spellEnd"/>
+        <w:r>
+          <w:rPr>
+            <w:rStyle w:val="Hyperlink"/>
+          </w:rPr>
+          <w:t>/</w:t>
+        </w:r>
+        <w:proofErr w:type="spellStart"/>
+        <w:r>
+          <w:rPr>
+            <w:rStyle w:val="Hyperlink"/>
+          </w:rPr>
+          <w:t>master</w:t>
+        </w:r>
+        <w:proofErr w:type="spellEnd"/>
+        <w:r>
+          <w:rPr>
+            <w:rStyle w:val="Hyperlink"/>
+          </w:rPr>
+          <w:t>/</w:t>
+        </w:r>
+        <w:r>
+          <w:rPr>
+            <w:rStyle w:val="Hyperlink"/>
+            <w:lang w:val="en-US"/>
+          </w:rPr>
+          <w:t>it</w:t>
+        </w:r>
+        <w:r>
+          <w:rPr>
+            <w:rStyle w:val="Hyperlink"/>
+          </w:rPr>
+          <w:t>/</w:t>
+        </w:r>
+        <w:r>
+          <w:rPr>
+            <w:rStyle w:val="Hyperlink"/>
+            <w:lang w:val="en-US"/>
+          </w:rPr>
+          <w:t>lab</w:t>
+        </w:r>
+        <w:r>
+          <w:rPr>
+            <w:rStyle w:val="Hyperlink"/>
+          </w:rPr>
+          <w:t>4/</w:t>
+        </w:r>
+        <w:r>
+          <w:rPr>
+            <w:rStyle w:val="Hyperlink"/>
+            <w:lang w:val="en-US"/>
+          </w:rPr>
+          <w:t>code</w:t>
+        </w:r>
+        <w:r>
+          <w:rPr>
+            <w:rStyle w:val="Hyperlink"/>
+          </w:rPr>
+          <w:t>/</w:t>
+        </w:r>
+        <w:r>
+          <w:rPr>
+            <w:rStyle w:val="Hyperlink"/>
+            <w:lang w:val="en-US"/>
+          </w:rPr>
+          <w:t>output</w:t>
+        </w:r>
+        <w:r>
+          <w:rPr>
+            <w:rStyle w:val="Hyperlink"/>
+          </w:rPr>
+          <w:t>_</w:t>
+        </w:r>
+        <w:r>
+          <w:rPr>
+            <w:rStyle w:val="Hyperlink"/>
+            <w:lang w:val="en-US"/>
+          </w:rPr>
+          <w:t>add</w:t>
+        </w:r>
+        <w:r>
+          <w:rPr>
+            <w:rStyle w:val="Hyperlink"/>
+          </w:rPr>
+          <w:t>2.</w:t>
+        </w:r>
+        <w:proofErr w:type="spellStart"/>
+        <w:r>
+          <w:rPr>
+            <w:rStyle w:val="Hyperlink"/>
+            <w:lang w:val="en-US"/>
+          </w:rPr>
+          <w:t>hcl</w:t>
+        </w:r>
+        <w:proofErr w:type="spellEnd"/>
+      </w:hyperlink>
+      <w:r>
+        <w:t xml:space="preserve">, дата обращения </w:t>
+      </w:r>
+      <w:r>
+        <w:t>08.11</w:t>
+      </w:r>
+      <w:r>
+        <w:t>.2025].</w:t>
+      </w:r>
+    </w:p>
+    <w:p>
+      <w:pPr>
+        <w:jc w:val="both"/>
+      </w:pPr>
+    </w:p>
+    <w:p>
+      <w:pPr>
+        <w:jc w:val="both"/>
+      </w:pPr>
+    </w:p>
+    <w:p>
+      <w:pPr>
+        <w:jc w:val="both"/>
+      </w:pPr>
+    </w:p>
+    <w:p>
+      <w:pPr>
+        <w:pStyle w:val="Heading2"/>
+        <w:jc w:val="center"/>
+      </w:pPr>
+      <w:bookmarkStart w:id="11" w:name="_Toc213000654"/>
+      <w:r>
+        <w:lastRenderedPageBreak/>
+        <w:t>Дополнительное задание 3</w:t>
+      </w:r>
+      <w:bookmarkEnd w:id="11"/>
+    </w:p>
+    <w:p>
+      <w:pPr>
+        <w:jc w:val="both"/>
+      </w:pPr>
+      <w:r>
+        <w:t xml:space="preserve">Исходный код можно просмотреть на </w:t>
       </w:r>
       <w:proofErr w:type="spellStart"/>
       <w:r>
-        <w:t>индентации</w:t>
+        <w:t>Git</w:t>
       </w:r>
       <w:proofErr w:type="spellEnd"/>
       <w:r>
-        <w:t xml:space="preserve">(в моем используется </w:t>
-      </w:r>
-      <w:r>
-        <w:t>/</w:t>
-      </w:r>
-      <w:r>
         <w:rPr>
           <w:lang w:val="en-US"/>
         </w:rPr>
-        <w:t>t</w:t>
-      </w:r>
-      <w:r>
-        <w:t xml:space="preserve">, </w:t>
-      </w:r>
-      <w:r>
-        <w:t>в библиотеках по 2 пробела</w:t>
-      </w:r>
-      <w:r>
-        <w:t xml:space="preserve">) и разные </w:t>
+        <w:t>hub</w:t>
+      </w:r>
+      <w:r>
+        <w:t xml:space="preserve"> [Электронный ресурс: </w:t>
+      </w:r>
+      <w:hyperlink r:id="rId15" w:history="1">
+        <w:r>
+          <w:rPr>
+            <w:rStyle w:val="Hyperlink"/>
+          </w:rPr>
+          <w:t>https://github.com/Miwm64/itmo_</w:t>
+        </w:r>
+        <w:proofErr w:type="spellStart"/>
+        <w:r>
+          <w:rPr>
+            <w:rStyle w:val="Hyperlink"/>
+            <w:lang w:val="en-US"/>
+          </w:rPr>
+          <w:t>cse</w:t>
+        </w:r>
+        <w:proofErr w:type="spellEnd"/>
+        <w:r>
+          <w:rPr>
+            <w:rStyle w:val="Hyperlink"/>
+          </w:rPr>
+          <w:t>/</w:t>
+        </w:r>
+        <w:proofErr w:type="spellStart"/>
+        <w:r>
+          <w:rPr>
+            <w:rStyle w:val="Hyperlink"/>
+          </w:rPr>
+          <w:t>blob</w:t>
+        </w:r>
+        <w:proofErr w:type="spellEnd"/>
+        <w:r>
+          <w:rPr>
+            <w:rStyle w:val="Hyperlink"/>
+          </w:rPr>
+          <w:t>/</w:t>
+        </w:r>
+        <w:proofErr w:type="spellStart"/>
+        <w:r>
+          <w:rPr>
+            <w:rStyle w:val="Hyperlink"/>
+          </w:rPr>
+          <w:t>master</w:t>
+        </w:r>
+        <w:proofErr w:type="spellEnd"/>
+        <w:r>
+          <w:rPr>
+            <w:rStyle w:val="Hyperlink"/>
+          </w:rPr>
+          <w:t>/</w:t>
+        </w:r>
+        <w:r>
+          <w:rPr>
+            <w:rStyle w:val="Hyperlink"/>
+            <w:lang w:val="en-US"/>
+          </w:rPr>
+          <w:t>it</w:t>
+        </w:r>
+        <w:r>
+          <w:rPr>
+            <w:rStyle w:val="Hyperlink"/>
+          </w:rPr>
+          <w:t>/</w:t>
+        </w:r>
+        <w:r>
+          <w:rPr>
+            <w:rStyle w:val="Hyperlink"/>
+            <w:lang w:val="en-US"/>
+          </w:rPr>
+          <w:t>lab</w:t>
+        </w:r>
+        <w:r>
+          <w:rPr>
+            <w:rStyle w:val="Hyperlink"/>
+          </w:rPr>
+          <w:t>4/</w:t>
+        </w:r>
+        <w:r>
+          <w:rPr>
+            <w:rStyle w:val="Hyperlink"/>
+            <w:lang w:val="en-US"/>
+          </w:rPr>
+          <w:t>code</w:t>
+        </w:r>
+        <w:r>
+          <w:rPr>
+            <w:rStyle w:val="Hyperlink"/>
+          </w:rPr>
+          <w:t>/</w:t>
+        </w:r>
+        <w:r>
+          <w:rPr>
+            <w:rStyle w:val="Hyperlink"/>
+            <w:lang w:val="en-US"/>
+          </w:rPr>
+          <w:t>add</w:t>
+        </w:r>
+        <w:r>
+          <w:rPr>
+            <w:rStyle w:val="Hyperlink"/>
+          </w:rPr>
+          <w:t>3.</w:t>
+        </w:r>
+        <w:proofErr w:type="spellStart"/>
+        <w:r>
+          <w:rPr>
+            <w:rStyle w:val="Hyperlink"/>
+            <w:lang w:val="en-US"/>
+          </w:rPr>
+          <w:t>py</w:t>
+        </w:r>
+        <w:proofErr w:type="spellEnd"/>
+      </w:hyperlink>
+      <w:r>
+        <w:t xml:space="preserve">, дата обращения </w:t>
+      </w:r>
+      <w:r>
+        <w:t>08.11</w:t>
+      </w:r>
+      <w:r>
+        <w:t>.2025].</w:t>
       </w:r>
     </w:p>
     <w:p>
@@ -2485,6 +3326,7 @@
     </w:p>
     <w:p>
       <w:pPr>
+        <w:pStyle w:val="Heading1"/>
         <w:jc w:val="both"/>
         <w:rPr>
           <w:b/>
@@ -2492,57 +3334,13 @@
         </w:rPr>
       </w:pPr>
     </w:p>
-    <w:p>
-      <w:pPr>
-        <w:jc w:val="both"/>
-        <w:rPr>
-          <w:b/>
-          <w:bCs/>
-        </w:rPr>
-      </w:pPr>
-    </w:p>
-    <w:p>
-      <w:pPr>
-        <w:jc w:val="both"/>
-        <w:rPr>
-          <w:b/>
-          <w:bCs/>
-        </w:rPr>
-      </w:pPr>
-    </w:p>
-    <w:p>
-      <w:pPr>
-        <w:jc w:val="both"/>
-        <w:rPr>
-          <w:b/>
-          <w:bCs/>
-        </w:rPr>
-      </w:pPr>
-    </w:p>
-    <w:p>
-      <w:pPr>
-        <w:jc w:val="both"/>
-        <w:rPr>
-          <w:b/>
-          <w:bCs/>
-        </w:rPr>
-      </w:pPr>
-    </w:p>
-    <w:p>
-      <w:pPr>
-        <w:jc w:val="both"/>
-        <w:rPr>
-          <w:b/>
-          <w:bCs/>
-        </w:rPr>
-      </w:pPr>
-    </w:p>
-    <w:p>
-      <w:pPr>
-        <w:jc w:val="both"/>
-        <w:rPr>
-          <w:b/>
-          <w:bCs/>
+    <w:p/>
+    <w:p/>
+    <w:p/>
+    <w:p>
+      <w:pPr>
+        <w:rPr>
+          <w:lang w:val="en-US"/>
         </w:rPr>
       </w:pPr>
     </w:p>
@@ -2551,286 +3349,410 @@
         <w:pStyle w:val="Heading2"/>
         <w:jc w:val="center"/>
       </w:pPr>
-      <w:r>
-        <w:t xml:space="preserve">Дополнительное задание </w:t>
-      </w:r>
+      <w:bookmarkStart w:id="12" w:name="_Toc213000655"/>
+      <w:r>
+        <w:lastRenderedPageBreak/>
+        <w:t>Дополнительное задание 4</w:t>
+      </w:r>
+      <w:bookmarkEnd w:id="12"/>
+    </w:p>
+    <w:p>
+      <w:pPr>
+        <w:jc w:val="both"/>
+      </w:pPr>
+      <w:r>
+        <w:t xml:space="preserve">Исходный код можно просмотреть на </w:t>
+      </w:r>
+      <w:proofErr w:type="spellStart"/>
+      <w:r>
+        <w:t>Git</w:t>
+      </w:r>
+      <w:proofErr w:type="spellEnd"/>
+      <w:r>
+        <w:rPr>
+          <w:lang w:val="en-US"/>
+        </w:rPr>
+        <w:t>hub</w:t>
+      </w:r>
+      <w:r>
+        <w:t xml:space="preserve"> [Электронный ресурс: </w:t>
+      </w:r>
+      <w:hyperlink r:id="rId16" w:history="1">
+        <w:r>
+          <w:rPr>
+            <w:rStyle w:val="Hyperlink"/>
+          </w:rPr>
+          <w:t>https://github.com/Miwm64/itmo_</w:t>
+        </w:r>
+        <w:r>
+          <w:rPr>
+            <w:rStyle w:val="Hyperlink"/>
+            <w:lang w:val="en-US"/>
+          </w:rPr>
+          <w:t>cse</w:t>
+        </w:r>
+        <w:r>
+          <w:rPr>
+            <w:rStyle w:val="Hyperlink"/>
+          </w:rPr>
+          <w:t>/blob/master/</w:t>
+        </w:r>
+        <w:r>
+          <w:rPr>
+            <w:rStyle w:val="Hyperlink"/>
+            <w:lang w:val="en-US"/>
+          </w:rPr>
+          <w:t>it</w:t>
+        </w:r>
+        <w:r>
+          <w:rPr>
+            <w:rStyle w:val="Hyperlink"/>
+          </w:rPr>
+          <w:t>/</w:t>
+        </w:r>
+        <w:r>
+          <w:rPr>
+            <w:rStyle w:val="Hyperlink"/>
+            <w:lang w:val="en-US"/>
+          </w:rPr>
+          <w:t>lab</w:t>
+        </w:r>
+        <w:r>
+          <w:rPr>
+            <w:rStyle w:val="Hyperlink"/>
+          </w:rPr>
+          <w:t>4/</w:t>
+        </w:r>
+        <w:r>
+          <w:rPr>
+            <w:rStyle w:val="Hyperlink"/>
+            <w:lang w:val="en-US"/>
+          </w:rPr>
+          <w:t>code</w:t>
+        </w:r>
+        <w:r>
+          <w:rPr>
+            <w:rStyle w:val="Hyperlink"/>
+          </w:rPr>
+          <w:t>/</w:t>
+        </w:r>
+        <w:r>
+          <w:rPr>
+            <w:rStyle w:val="Hyperlink"/>
+            <w:lang w:val="en-US"/>
+          </w:rPr>
+          <w:t>add</w:t>
+        </w:r>
+        <w:r>
+          <w:rPr>
+            <w:rStyle w:val="Hyperlink"/>
+          </w:rPr>
+          <w:t>4</w:t>
+        </w:r>
+        <w:r>
+          <w:rPr>
+            <w:rStyle w:val="Hyperlink"/>
+          </w:rPr>
+          <w:t>.</w:t>
+        </w:r>
+        <w:r>
+          <w:rPr>
+            <w:rStyle w:val="Hyperlink"/>
+            <w:lang w:val="en-US"/>
+          </w:rPr>
+          <w:t>py</w:t>
+        </w:r>
+      </w:hyperlink>
+      <w:r>
+        <w:t xml:space="preserve">, дата обращения </w:t>
+      </w:r>
+      <w:r>
+        <w:t>08.11</w:t>
+      </w:r>
+      <w:r>
+        <w:t>.2025].</w:t>
+      </w:r>
+    </w:p>
+    <w:p>
+      <w:pPr>
+        <w:rPr>
+          <w:lang w:val="en-US"/>
+        </w:rPr>
+      </w:pPr>
+      <w:r>
+        <w:t>Результаты стократного выполнения</w:t>
+      </w:r>
+      <w:r>
+        <w:rPr>
+          <w:lang w:val="en-US"/>
+        </w:rPr>
+        <w:t>:</w:t>
+      </w:r>
+    </w:p>
+    <w:tbl>
+      <w:tblPr>
+        <w:tblStyle w:val="TableGrid"/>
+        <w:tblW w:w="0" w:type="auto"/>
+        <w:tblLook w:val="04A0" w:firstRow="1" w:lastRow="0" w:firstColumn="1" w:lastColumn="0" w:noHBand="0" w:noVBand="1"/>
+      </w:tblPr>
+      <w:tblGrid>
+        <w:gridCol w:w="3114"/>
+        <w:gridCol w:w="4819"/>
+      </w:tblGrid>
+      <w:tr>
+        <w:tc>
+          <w:tcPr>
+            <w:tcW w:w="3114" w:type="dxa"/>
+          </w:tcPr>
+          <w:p>
+            <w:pPr>
+              <w:rPr>
+                <w:lang w:val="en-US"/>
+              </w:rPr>
+            </w:pPr>
+            <w:r>
+              <w:t xml:space="preserve">Мой </w:t>
+            </w:r>
+            <w:proofErr w:type="spellStart"/>
+            <w:r>
+              <w:t>yaml</w:t>
+            </w:r>
+            <w:proofErr w:type="spellEnd"/>
+            <w:r>
+              <w:t xml:space="preserve"> -&gt; </w:t>
+            </w:r>
+            <w:proofErr w:type="spellStart"/>
+            <w:r>
+              <w:rPr>
+                <w:lang w:val="en-US"/>
+              </w:rPr>
+              <w:t>hcl</w:t>
+            </w:r>
+            <w:proofErr w:type="spellEnd"/>
+          </w:p>
+        </w:tc>
+        <w:tc>
+          <w:tcPr>
+            <w:tcW w:w="4819" w:type="dxa"/>
+          </w:tcPr>
+          <w:p>
+            <w:pPr>
+              <w:rPr>
+                <w:lang w:val="en-US"/>
+              </w:rPr>
+            </w:pPr>
+            <w:r>
+              <w:rPr>
+                <w:lang w:val="en-US"/>
+              </w:rPr>
+              <w:t>0.03212094306945801</w:t>
+            </w:r>
+          </w:p>
+        </w:tc>
+      </w:tr>
+      <w:tr>
+        <w:tc>
+          <w:tcPr>
+            <w:tcW w:w="3114" w:type="dxa"/>
+          </w:tcPr>
+          <w:p>
+            <w:pPr>
+              <w:rPr>
+                <w:lang w:val="en-US"/>
+              </w:rPr>
+            </w:pPr>
+            <w:r>
+              <w:t xml:space="preserve">Мой </w:t>
+            </w:r>
+            <w:proofErr w:type="spellStart"/>
+            <w:r>
+              <w:rPr>
+                <w:lang w:val="en-US"/>
+              </w:rPr>
+              <w:t>yaml</w:t>
+            </w:r>
+            <w:proofErr w:type="spellEnd"/>
+            <w:r>
+              <w:rPr>
+                <w:lang w:val="en-US"/>
+              </w:rPr>
+              <w:t xml:space="preserve"> -&gt; xml</w:t>
+            </w:r>
+          </w:p>
+        </w:tc>
+        <w:tc>
+          <w:tcPr>
+            <w:tcW w:w="4819" w:type="dxa"/>
+          </w:tcPr>
+          <w:p>
+            <w:pPr>
+              <w:rPr>
+                <w:lang w:val="en-US"/>
+              </w:rPr>
+            </w:pPr>
+            <w:r>
+              <w:t>0</w:t>
+            </w:r>
+            <w:r>
+              <w:rPr>
+                <w:lang w:val="en-US"/>
+              </w:rPr>
+              <w:t>.</w:t>
+            </w:r>
+            <w:r>
+              <w:rPr>
+                <w:lang w:val="en-US"/>
+              </w:rPr>
+              <w:t>02963876724243164</w:t>
+            </w:r>
+          </w:p>
+        </w:tc>
+      </w:tr>
+      <w:tr>
+        <w:tc>
+          <w:tcPr>
+            <w:tcW w:w="3114" w:type="dxa"/>
+          </w:tcPr>
+          <w:p>
+            <w:pPr>
+              <w:rPr>
+                <w:lang w:val="en-US"/>
+              </w:rPr>
+            </w:pPr>
+            <w:r>
+              <w:t xml:space="preserve">Библиотека </w:t>
+            </w:r>
+            <w:proofErr w:type="spellStart"/>
+            <w:r>
+              <w:rPr>
+                <w:lang w:val="en-US"/>
+              </w:rPr>
+              <w:t>yaml</w:t>
+            </w:r>
+            <w:proofErr w:type="spellEnd"/>
+            <w:r>
+              <w:rPr>
+                <w:lang w:val="en-US"/>
+              </w:rPr>
+              <w:t xml:space="preserve"> -&gt; hcl</w:t>
+            </w:r>
+          </w:p>
+        </w:tc>
+        <w:tc>
+          <w:tcPr>
+            <w:tcW w:w="4819" w:type="dxa"/>
+          </w:tcPr>
+          <w:p>
+            <w:pPr>
+              <w:rPr>
+                <w:lang w:val="en-US"/>
+              </w:rPr>
+            </w:pPr>
+            <w:r>
+              <w:rPr>
+                <w:lang w:val="en-US"/>
+              </w:rPr>
+              <w:t>8.071411848068237</w:t>
+            </w:r>
+          </w:p>
+        </w:tc>
+      </w:tr>
+    </w:tbl>
+    <w:p>
+      <w:pPr>
+        <w:rPr>
+          <w:lang w:val="en-US"/>
+        </w:rPr>
+      </w:pPr>
+    </w:p>
+    <w:p>
+      <w:r>
+        <w:t>Преимущество в скорости моего алгоритма может быть объяснено несколькими путями</w:t>
+      </w:r>
+      <w:r>
+        <w:t>:</w:t>
+      </w:r>
+      <w:r>
+        <w:br/>
+        <w:t xml:space="preserve">1. </w:t>
+      </w:r>
+      <w:r>
+        <w:t>Библиотеки обрабатывают все случаи описанные спецификацией</w:t>
+      </w:r>
+      <w:r>
+        <w:t>.</w:t>
+      </w:r>
+    </w:p>
+    <w:p>
+      <w:r>
+        <w:t>2</w:t>
+      </w:r>
+      <w:r>
+        <w:t xml:space="preserve">. </w:t>
+      </w:r>
+      <w:r>
+        <w:t xml:space="preserve">Библиотеки </w:t>
+      </w:r>
+      <w:r>
+        <w:t>создают сложные деревья</w:t>
+      </w:r>
+      <w:r>
+        <w:t>,</w:t>
+      </w:r>
+      <w:r>
+        <w:t xml:space="preserve"> а </w:t>
+      </w:r>
+      <w:r>
+        <w:t>также предоставляют интерфейс для работы с ними</w:t>
+      </w:r>
+      <w:r>
+        <w:t xml:space="preserve">. </w:t>
+      </w:r>
+      <w:r>
+        <w:t>В свою очередь мой алгоритм заточен под единственную конкретную задачу</w:t>
+      </w:r>
+      <w:r>
+        <w:t xml:space="preserve">, </w:t>
+      </w:r>
+      <w:r>
+        <w:t>в связи с чем работает проще и быстрее</w:t>
+      </w:r>
+      <w:r>
+        <w:t>.</w:t>
+      </w:r>
+    </w:p>
+    <w:p>
+      <w:pPr>
+        <w:rPr>
+          <w:lang w:val="en-RU"/>
+        </w:rPr>
+      </w:pPr>
       <w:r>
         <w:t>3</w:t>
       </w:r>
-    </w:p>
-    <w:p>
-      <w:pPr>
-        <w:jc w:val="both"/>
-      </w:pPr>
-      <w:r>
-        <w:t xml:space="preserve">Исходный код можно просмотреть на </w:t>
-      </w:r>
-      <w:proofErr w:type="spellStart"/>
-      <w:r>
-        <w:t>Git</w:t>
-      </w:r>
-      <w:proofErr w:type="spellEnd"/>
-      <w:r>
-        <w:rPr>
-          <w:lang w:val="en-US"/>
-        </w:rPr>
-        <w:t>hub</w:t>
-      </w:r>
-      <w:r>
-        <w:t xml:space="preserve"> [Электронный ресурс: </w:t>
-      </w:r>
-      <w:hyperlink r:id="rId13" w:history="1">
-        <w:r>
-          <w:rPr>
-            <w:rStyle w:val="Hyperlink"/>
-          </w:rPr>
-          <w:t>https://github.com/Miwm64/itmo_</w:t>
-        </w:r>
-        <w:proofErr w:type="spellStart"/>
-        <w:r>
-          <w:rPr>
-            <w:rStyle w:val="Hyperlink"/>
-            <w:lang w:val="en-US"/>
-          </w:rPr>
-          <w:t>cse</w:t>
-        </w:r>
-        <w:proofErr w:type="spellEnd"/>
-        <w:r>
-          <w:rPr>
-            <w:rStyle w:val="Hyperlink"/>
-          </w:rPr>
-          <w:t>/</w:t>
-        </w:r>
-        <w:proofErr w:type="spellStart"/>
-        <w:r>
-          <w:rPr>
-            <w:rStyle w:val="Hyperlink"/>
-          </w:rPr>
-          <w:t>blob</w:t>
-        </w:r>
-        <w:proofErr w:type="spellEnd"/>
-        <w:r>
-          <w:rPr>
-            <w:rStyle w:val="Hyperlink"/>
-          </w:rPr>
-          <w:t>/</w:t>
-        </w:r>
-        <w:proofErr w:type="spellStart"/>
-        <w:r>
-          <w:rPr>
-            <w:rStyle w:val="Hyperlink"/>
-          </w:rPr>
-          <w:t>master</w:t>
-        </w:r>
-        <w:proofErr w:type="spellEnd"/>
-        <w:r>
-          <w:rPr>
-            <w:rStyle w:val="Hyperlink"/>
-          </w:rPr>
-          <w:t>/</w:t>
-        </w:r>
-        <w:r>
-          <w:rPr>
-            <w:rStyle w:val="Hyperlink"/>
-            <w:lang w:val="en-US"/>
-          </w:rPr>
-          <w:t>it</w:t>
-        </w:r>
-        <w:r>
-          <w:rPr>
-            <w:rStyle w:val="Hyperlink"/>
-          </w:rPr>
-          <w:t>/</w:t>
-        </w:r>
-        <w:r>
-          <w:rPr>
-            <w:rStyle w:val="Hyperlink"/>
-            <w:lang w:val="en-US"/>
-          </w:rPr>
-          <w:t>lab</w:t>
-        </w:r>
-        <w:r>
-          <w:rPr>
-            <w:rStyle w:val="Hyperlink"/>
-          </w:rPr>
-          <w:t>4/</w:t>
-        </w:r>
-        <w:r>
-          <w:rPr>
-            <w:rStyle w:val="Hyperlink"/>
-            <w:lang w:val="en-US"/>
-          </w:rPr>
-          <w:t>code</w:t>
-        </w:r>
-        <w:r>
-          <w:rPr>
-            <w:rStyle w:val="Hyperlink"/>
-          </w:rPr>
-          <w:t>/</w:t>
-        </w:r>
-        <w:r>
-          <w:rPr>
-            <w:rStyle w:val="Hyperlink"/>
-            <w:lang w:val="en-US"/>
-          </w:rPr>
-          <w:t>add</w:t>
-        </w:r>
-        <w:r>
-          <w:rPr>
-            <w:rStyle w:val="Hyperlink"/>
-          </w:rPr>
-          <w:t>3</w:t>
-        </w:r>
-        <w:r>
-          <w:rPr>
-            <w:rStyle w:val="Hyperlink"/>
-          </w:rPr>
-          <w:t>.</w:t>
-        </w:r>
-        <w:proofErr w:type="spellStart"/>
-        <w:r>
-          <w:rPr>
-            <w:rStyle w:val="Hyperlink"/>
-            <w:lang w:val="en-US"/>
-          </w:rPr>
-          <w:t>py</w:t>
-        </w:r>
-        <w:proofErr w:type="spellEnd"/>
-      </w:hyperlink>
-      <w:r>
-        <w:t xml:space="preserve">, дата обращения </w:t>
-      </w:r>
-      <w:r>
-        <w:t>08.11</w:t>
-      </w:r>
-      <w:r>
-        <w:t>.2025].</w:t>
-      </w:r>
-    </w:p>
-    <w:p>
-      <w:pPr>
-        <w:jc w:val="both"/>
-        <w:rPr>
-          <w:b/>
-          <w:bCs/>
-        </w:rPr>
-      </w:pPr>
-    </w:p>
-    <w:p>
-      <w:pPr>
-        <w:jc w:val="both"/>
-        <w:rPr>
-          <w:b/>
-          <w:bCs/>
-        </w:rPr>
-      </w:pPr>
-    </w:p>
-    <w:p>
-      <w:pPr>
-        <w:jc w:val="both"/>
-        <w:rPr>
-          <w:b/>
-          <w:bCs/>
-        </w:rPr>
-      </w:pPr>
-    </w:p>
-    <w:p>
-      <w:pPr>
-        <w:jc w:val="both"/>
-        <w:rPr>
-          <w:b/>
-          <w:bCs/>
-        </w:rPr>
-      </w:pPr>
-    </w:p>
-    <w:p>
-      <w:pPr>
-        <w:jc w:val="both"/>
-        <w:rPr>
-          <w:b/>
-          <w:bCs/>
-        </w:rPr>
-      </w:pPr>
-    </w:p>
-    <w:p>
-      <w:pPr>
-        <w:jc w:val="both"/>
-        <w:rPr>
-          <w:b/>
-          <w:bCs/>
-        </w:rPr>
-      </w:pPr>
-    </w:p>
-    <w:p>
-      <w:pPr>
-        <w:jc w:val="both"/>
-        <w:rPr>
-          <w:b/>
-          <w:bCs/>
-        </w:rPr>
-      </w:pPr>
-    </w:p>
-    <w:p>
-      <w:pPr>
-        <w:jc w:val="both"/>
-        <w:rPr>
-          <w:b/>
-          <w:bCs/>
-        </w:rPr>
-      </w:pPr>
-    </w:p>
-    <w:p>
-      <w:pPr>
-        <w:jc w:val="both"/>
-        <w:rPr>
-          <w:b/>
-          <w:bCs/>
-        </w:rPr>
-      </w:pPr>
-    </w:p>
-    <w:p>
-      <w:pPr>
-        <w:jc w:val="both"/>
-        <w:rPr>
-          <w:b/>
-          <w:bCs/>
-        </w:rPr>
-      </w:pPr>
-    </w:p>
-    <w:p>
-      <w:pPr>
-        <w:jc w:val="both"/>
-        <w:rPr>
-          <w:b/>
-          <w:bCs/>
-        </w:rPr>
-      </w:pPr>
-    </w:p>
-    <w:p>
-      <w:pPr>
-        <w:jc w:val="both"/>
-        <w:rPr>
-          <w:b/>
-          <w:bCs/>
-        </w:rPr>
-      </w:pPr>
-    </w:p>
-    <w:p>
-      <w:pPr>
-        <w:jc w:val="both"/>
-        <w:rPr>
-          <w:b/>
-          <w:bCs/>
-        </w:rPr>
-      </w:pPr>
-    </w:p>
-    <w:p>
-      <w:pPr>
-        <w:pStyle w:val="Heading1"/>
-        <w:jc w:val="both"/>
-        <w:rPr>
-          <w:b/>
-          <w:bCs/>
+      <w:r>
+        <w:t xml:space="preserve">. </w:t>
+      </w:r>
+      <w:r>
+        <w:rPr>
+          <w:lang w:val="en-RU"/>
+        </w:rPr>
+        <w:t xml:space="preserve">Библиотеки создают несколько промежуточных структур, что увеличивает расход памяти и время выполнения. </w:t>
+      </w:r>
+      <w:r>
+        <w:t>Мой</w:t>
+      </w:r>
+      <w:r>
+        <w:rPr>
+          <w:lang w:val="en-RU"/>
+        </w:rPr>
+        <w:t xml:space="preserve"> алгоритм сразу преобразует Python-структуры в HCL, минуя сложные объекты.</w:t>
+      </w:r>
+    </w:p>
+    <w:p>
+      <w:pPr>
+        <w:rPr>
+          <w:lang w:val="en-RU"/>
         </w:rPr>
       </w:pPr>
     </w:p>
@@ -2838,16 +3760,42 @@
     <w:p/>
     <w:p/>
     <w:p/>
-    <w:p>
-      <w:pPr>
-        <w:pStyle w:val="Heading2"/>
+    <w:p/>
+    <w:p/>
+    <w:p/>
+    <w:p>
+      <w:pPr>
+        <w:pStyle w:val="Heading1"/>
         <w:jc w:val="center"/>
-      </w:pPr>
-      <w:r>
-        <w:t xml:space="preserve">Дополнительное задание </w:t>
-      </w:r>
-      <w:r>
-        <w:t>4</w:t>
+        <w:rPr>
+          <w:b/>
+          <w:bCs/>
+        </w:rPr>
+      </w:pPr>
+      <w:bookmarkStart w:id="13" w:name="_Toc213000656"/>
+      <w:r>
+        <w:rPr>
+          <w:b/>
+          <w:bCs/>
+        </w:rPr>
+        <w:lastRenderedPageBreak/>
+        <w:t>Заключение</w:t>
+      </w:r>
+      <w:bookmarkEnd w:id="13"/>
+    </w:p>
+    <w:p>
+      <w:pPr>
+        <w:ind w:firstLine="709"/>
+        <w:jc w:val="both"/>
+      </w:pPr>
+      <w:r>
+        <w:t xml:space="preserve">Во </w:t>
+      </w:r>
+      <w:r>
+        <w:t>время выполнения лабораторной работы я</w:t>
+      </w:r>
+      <w:r>
+        <w:t xml:space="preserve"> </w:t>
       </w:r>
     </w:p>
     <w:p/>
@@ -2868,58 +3816,6 @@
     <w:p/>
     <w:p/>
     <w:p/>
-    <w:p/>
-    <w:p/>
-    <w:p/>
-    <w:p>
-      <w:pPr>
-        <w:pStyle w:val="Heading1"/>
-        <w:jc w:val="center"/>
-        <w:rPr>
-          <w:b/>
-          <w:bCs/>
-        </w:rPr>
-      </w:pPr>
-      <w:bookmarkStart w:id="8" w:name="_Toc212907071"/>
-      <w:r>
-        <w:rPr>
-          <w:b/>
-          <w:bCs/>
-        </w:rPr>
-        <w:t>Заключение</w:t>
-      </w:r>
-      <w:bookmarkEnd w:id="8"/>
-    </w:p>
-    <w:p>
-      <w:pPr>
-        <w:ind w:firstLine="709"/>
-        <w:jc w:val="both"/>
-      </w:pPr>
-      <w:r>
-        <w:t xml:space="preserve">Во </w:t>
-      </w:r>
-      <w:r>
-        <w:t>время выполнения лабораторной работы я</w:t>
-      </w:r>
-    </w:p>
-    <w:p/>
-    <w:p/>
-    <w:p/>
-    <w:p/>
-    <w:p/>
-    <w:p/>
-    <w:p/>
-    <w:p/>
-    <w:p/>
-    <w:p/>
-    <w:p/>
-    <w:p/>
-    <w:p/>
-    <w:p/>
-    <w:p/>
-    <w:p/>
-    <w:p/>
-    <w:p/>
     <w:p>
       <w:pPr>
         <w:pStyle w:val="Heading1"/>
@@ -2933,12 +3829,13 @@
           <w:bCs/>
         </w:rPr>
       </w:pPr>
-      <w:bookmarkStart w:id="9" w:name="_Toc212907072"/>
+      <w:bookmarkStart w:id="14" w:name="_Toc213000657"/>
       <w:r>
         <w:rPr>
           <w:b/>
           <w:bCs/>
         </w:rPr>
+        <w:lastRenderedPageBreak/>
         <w:t xml:space="preserve">Список </w:t>
       </w:r>
       <w:r>
@@ -2948,83 +3845,79 @@
         </w:rPr>
         <w:t>источников</w:t>
       </w:r>
-      <w:bookmarkEnd w:id="9"/>
-    </w:p>
-    <w:p>
-      <w:r>
-        <w:t xml:space="preserve">1. </w:t>
-      </w:r>
-      <w:r>
-        <w:t xml:space="preserve">Орлов С. А., </w:t>
+      <w:bookmarkEnd w:id="14"/>
+    </w:p>
+    <w:p>
+      <w:pPr>
+        <w:numPr>
+          <w:ilvl w:val="0"/>
+          <w:numId w:val="7"/>
+        </w:numPr>
+        <w:jc w:val="both"/>
+      </w:pPr>
+      <w:r>
+        <w:t xml:space="preserve">Балакшин П.В., Соснин В.В., Калинин И.В., Малышева Т.А., Раков С.В., </w:t>
       </w:r>
       <w:proofErr w:type="spellStart"/>
       <w:r>
-        <w:t>Цилькер</w:t>
+        <w:t>Рущенко</w:t>
       </w:r>
       <w:proofErr w:type="spellEnd"/>
       <w:r>
-        <w:t xml:space="preserve"> Б. Я.</w:t>
-      </w:r>
-      <w:r>
-        <w:br/>
-      </w:r>
-      <w:r>
-        <w:rPr>
-          <w:b/>
-          <w:bCs/>
-        </w:rPr>
-        <w:t>Организация ЭВМ и систем: учебник для вузов</w:t>
-      </w:r>
-      <w:r>
-        <w:t xml:space="preserve">. – 2-е изд. – СПб.: Питер, 2011. – 688 с.: ил. – Режим доступа: </w:t>
-      </w:r>
-      <w:hyperlink r:id="rId14" w:tgtFrame="_new" w:history="1">
-        <w:r>
-          <w:rPr>
-            <w:rStyle w:val="Hyperlink"/>
-          </w:rPr>
-          <w:t>http://www.nicevt.ru/wp-content/uploads/2019/10/2.-%D0%A6%D0%B8%D0%BB%D1%8C%D0%BA%D0%B5%D1%80-%D0%91.%D0%AF.-%D0%9E%D1%80%D0%BB%D0%BE%D0%B2-%D0%A1.%D0%90.-%D0%9E%D1%80%D0%B3%D0%B0%D0%BD%D0%B8%D0%B7%D0%B0%D1%86%D0%B8%D1%8F-%D0%AD%D0%92%D0%9C-%D0%B8-%D1%81%D0%B8%D1%81%D1%82%D0%B5%D0%BC-%D0%A1%D0%9F%D0%91-%D0%9F%D0%B8%D1%82%D0%B5%D1%80-2011.pdf</w:t>
+        <w:t xml:space="preserve"> Н.Г., Дергачев А.М. Информатика: лабораторные работы и тесты: Учебно-методическое пособие / Рецензент: Поляков В.И. - Санкт-Петербург: Университет ИТМО, 2019. - 56 с. - экз. - Режим доступа:</w:t>
+      </w:r>
+    </w:p>
+    <w:p>
+      <w:pPr>
+        <w:jc w:val="both"/>
+      </w:pPr>
+      <w:hyperlink r:id="rId17" w:history="1">
+        <w:r>
+          <w:rPr>
+            <w:rStyle w:val="Hyperlink"/>
+          </w:rPr>
+          <w:t>https://books.ifmo.ru/book/2248/informatika:_laboratornye_raboty_i_testy:_uchebno-metodicheskoe_posobie_/_recenzent:_polyakov_v.i..htm</w:t>
         </w:r>
       </w:hyperlink>
       <w:r>
-        <w:t xml:space="preserve"> (дата обращения: 13.09.2025).</w:t>
-      </w:r>
-    </w:p>
-    <w:p>
-      <w:r>
-        <w:t xml:space="preserve">2. </w:t>
-      </w:r>
-      <w:r>
-        <w:t>Алексеев Е. Г., Богатырев С. Д.</w:t>
-      </w:r>
-      <w:r>
-        <w:br/>
-      </w:r>
-      <w:r>
-        <w:rPr>
-          <w:b/>
-          <w:bCs/>
-        </w:rPr>
-        <w:t>Информатика. Мультимедийный электронный учебник</w:t>
-      </w:r>
-      <w:r>
-        <w:t xml:space="preserve"> [Электронный ресурс]. – Режим доступа: </w:t>
-      </w:r>
-      <w:hyperlink r:id="rId15" w:tgtFrame="_new" w:history="1">
-        <w:r>
-          <w:rPr>
-            <w:rStyle w:val="Hyperlink"/>
-          </w:rPr>
-          <w:t>http://inf.ealekseev.ru/text/toc.html</w:t>
+        <w:t xml:space="preserve"> </w:t>
+      </w:r>
+    </w:p>
+    <w:p>
+      <w:pPr>
+        <w:numPr>
+          <w:ilvl w:val="0"/>
+          <w:numId w:val="7"/>
+        </w:numPr>
+        <w:jc w:val="both"/>
+      </w:pPr>
+      <w:r>
+        <w:t xml:space="preserve">Грошев А.С. Г89 Информатика: Учебник для вузов / А.С. Грошев. – Архангельск, </w:t>
+      </w:r>
+      <w:proofErr w:type="spellStart"/>
+      <w:r>
+        <w:t>Арханг</w:t>
+      </w:r>
+      <w:proofErr w:type="spellEnd"/>
+      <w:r>
+        <w:t xml:space="preserve">. гос. техн. ун-т, 2010. -470с. -Режим доступа </w:t>
+      </w:r>
+      <w:hyperlink r:id="rId18" w:history="1">
+        <w:r>
+          <w:rPr>
+            <w:rStyle w:val="Hyperlink"/>
+          </w:rPr>
+          <w:t>https://narfu.ru/university/library/books/0690.pdf</w:t>
         </w:r>
       </w:hyperlink>
       <w:r>
-        <w:t xml:space="preserve"> (дата обращения: 13.09.2025).</w:t>
-      </w:r>
-    </w:p>
+        <w:t xml:space="preserve"> </w:t>
+      </w:r>
+    </w:p>
+    <w:p/>
     <w:p/>
     <w:sectPr>
-      <w:footerReference w:type="default" r:id="rId16"/>
+      <w:footerReference w:type="default" r:id="rId19"/>
       <w:pgSz w:w="11906" w:h="16838" w:code="9"/>
       <w:pgMar w:top="1134" w:right="851" w:bottom="1134" w:left="1701" w:header="709" w:footer="709" w:gutter="0"/>
       <w:cols w:space="708"/>
@@ -3125,6 +4018,92 @@
 <file path=word/numbering.xml><?xml version="1.0" encoding="utf-8"?>
 <w:numbering xmlns:wpc="http://schemas.microsoft.com/office/word/2010/wordprocessingCanvas" xmlns:cx="http://schemas.microsoft.com/office/drawing/2014/chartex" xmlns:cx1="http://schemas.microsoft.com/office/drawing/2015/9/8/chartex" xmlns:cx2="http://schemas.microsoft.com/office/drawing/2015/10/21/chartex" xmlns:cx3="http://schemas.microsoft.com/office/drawing/2016/5/9/chartex" xmlns:cx4="http://schemas.microsoft.com/office/drawing/2016/5/10/chartex" xmlns:cx5="http://schemas.microsoft.com/office/drawing/2016/5/11/chartex" xmlns:cx6="http://schemas.microsoft.com/office/drawing/2016/5/12/chartex" xmlns:cx7="http://schemas.microsoft.com/office/drawing/2016/5/13/chartex" xmlns:cx8="http://schemas.microsoft.com/office/drawing/2016/5/14/chartex" xmlns:mc="http://schemas.openxmlformats.org/markup-compatibility/2006" xmlns:aink="http://schemas.microsoft.com/office/drawing/2016/ink" xmlns:am3d="http://schemas.microsoft.com/office/drawing/2017/model3d" xmlns:o="urn:schemas-microsoft-com:office:office" xmlns:oel="http://schemas.microsoft.com/office/2019/extlst" xmlns:r="http://schemas.openxmlformats.org/officeDocument/2006/relationships" xmlns:m="http://schemas.openxmlformats.org/officeDocument/2006/math" xmlns:v="urn:schemas-microsoft-com:vml" xmlns:wp14="http://schemas.microsoft.com/office/word/2010/wordprocessingDrawing" xmlns:wp="http://schemas.openxmlformats.org/drawingml/2006/wordprocessingDrawing" xmlns:w10="urn:schemas-microsoft-com:office:word" xmlns:w="http://schemas.openxmlformats.org/wordprocessingml/2006/main" xmlns:w14="http://schemas.microsoft.com/office/word/2010/wordml" xmlns:w15="http://schemas.microsoft.com/office/word/2012/wordml" xmlns:w16cex="http://schemas.microsoft.com/office/word/2018/wordml/cex" xmlns:w16cid="http://schemas.microsoft.com/office/word/2016/wordml/cid" xmlns:w16="http://schemas.microsoft.com/office/word/2018/wordml" xmlns:w16du="http://schemas.microsoft.com/office/word/2023/wordml/word16du" xmlns:w16sdtdh="http://schemas.microsoft.com/office/word/2020/wordml/sdtdatahash" xmlns:w16sdtfl="http://schemas.microsoft.com/office/word/2024/wordml/sdtformatlock" xmlns:w16se="http://schemas.microsoft.com/office/word/2015/wordml/symex" xmlns:wpg="http://schemas.microsoft.com/office/word/2010/wordprocessingGroup" xmlns:wpi="http://schemas.microsoft.com/office/word/2010/wordprocessingInk" xmlns:wne="http://schemas.microsoft.com/office/word/2006/wordml" xmlns:wps="http://schemas.microsoft.com/office/word/2010/wordprocessingShape" mc:Ignorable="w14 w15 w16se w16cid w16 w16cex w16sdtdh w16sdtfl w16du wp14">
   <w:abstractNum w:abstractNumId="0" w15:restartNumberingAfterBreak="0">
+    <w:nsid w:val="0A9B0519"/>
+    <w:multiLevelType w:val="hybridMultilevel"/>
+    <w:tmpl w:val="6C684E04"/>
+    <w:lvl w:ilvl="0" w:tplc="0419000F">
+      <w:start w:val="1"/>
+      <w:numFmt w:val="decimal"/>
+      <w:lvlText w:val="%1."/>
+      <w:lvlJc w:val="left"/>
+      <w:pPr>
+        <w:ind w:left="720" w:hanging="360"/>
+      </w:pPr>
+    </w:lvl>
+    <w:lvl w:ilvl="1" w:tplc="04190019" w:tentative="1">
+      <w:start w:val="1"/>
+      <w:numFmt w:val="lowerLetter"/>
+      <w:lvlText w:val="%2."/>
+      <w:lvlJc w:val="left"/>
+      <w:pPr>
+        <w:ind w:left="1440" w:hanging="360"/>
+      </w:pPr>
+    </w:lvl>
+    <w:lvl w:ilvl="2" w:tplc="0419001B" w:tentative="1">
+      <w:start w:val="1"/>
+      <w:numFmt w:val="lowerRoman"/>
+      <w:lvlText w:val="%3."/>
+      <w:lvlJc w:val="right"/>
+      <w:pPr>
+        <w:ind w:left="2160" w:hanging="180"/>
+      </w:pPr>
+    </w:lvl>
+    <w:lvl w:ilvl="3" w:tplc="0419000F" w:tentative="1">
+      <w:start w:val="1"/>
+      <w:numFmt w:val="decimal"/>
+      <w:lvlText w:val="%4."/>
+      <w:lvlJc w:val="left"/>
+      <w:pPr>
+        <w:ind w:left="2880" w:hanging="360"/>
+      </w:pPr>
+    </w:lvl>
+    <w:lvl w:ilvl="4" w:tplc="04190019" w:tentative="1">
+      <w:start w:val="1"/>
+      <w:numFmt w:val="lowerLetter"/>
+      <w:lvlText w:val="%5."/>
+      <w:lvlJc w:val="left"/>
+      <w:pPr>
+        <w:ind w:left="3600" w:hanging="360"/>
+      </w:pPr>
+    </w:lvl>
+    <w:lvl w:ilvl="5" w:tplc="0419001B" w:tentative="1">
+      <w:start w:val="1"/>
+      <w:numFmt w:val="lowerRoman"/>
+      <w:lvlText w:val="%6."/>
+      <w:lvlJc w:val="right"/>
+      <w:pPr>
+        <w:ind w:left="4320" w:hanging="180"/>
+      </w:pPr>
+    </w:lvl>
+    <w:lvl w:ilvl="6" w:tplc="0419000F" w:tentative="1">
+      <w:start w:val="1"/>
+      <w:numFmt w:val="decimal"/>
+      <w:lvlText w:val="%7."/>
+      <w:lvlJc w:val="left"/>
+      <w:pPr>
+        <w:ind w:left="5040" w:hanging="360"/>
+      </w:pPr>
+    </w:lvl>
+    <w:lvl w:ilvl="7" w:tplc="04190019" w:tentative="1">
+      <w:start w:val="1"/>
+      <w:numFmt w:val="lowerLetter"/>
+      <w:lvlText w:val="%8."/>
+      <w:lvlJc w:val="left"/>
+      <w:pPr>
+        <w:ind w:left="5760" w:hanging="360"/>
+      </w:pPr>
+    </w:lvl>
+    <w:lvl w:ilvl="8" w:tplc="0419001B" w:tentative="1">
+      <w:start w:val="1"/>
+      <w:numFmt w:val="lowerRoman"/>
+      <w:lvlText w:val="%9."/>
+      <w:lvlJc w:val="right"/>
+      <w:pPr>
+        <w:ind w:left="6480" w:hanging="180"/>
+      </w:pPr>
+    </w:lvl>
+  </w:abstractNum>
+  <w:abstractNum w:abstractNumId="1" w15:restartNumberingAfterBreak="0">
     <w:nsid w:val="10444291"/>
     <w:multiLevelType w:val="hybridMultilevel"/>
     <w:tmpl w:val="24B69DBE"/>
@@ -3213,7 +4192,213 @@
       </w:pPr>
     </w:lvl>
   </w:abstractNum>
-  <w:abstractNum w:abstractNumId="1" w15:restartNumberingAfterBreak="0">
+  <w:abstractNum w:abstractNumId="2" w15:restartNumberingAfterBreak="0">
+    <w:nsid w:val="29682FED"/>
+    <w:multiLevelType w:val="hybridMultilevel"/>
+    <w:tmpl w:val="9866F186"/>
+    <w:lvl w:ilvl="0" w:tplc="0809000F">
+      <w:start w:val="1"/>
+      <w:numFmt w:val="decimal"/>
+      <w:lvlText w:val="%1."/>
+      <w:lvlJc w:val="left"/>
+      <w:pPr>
+        <w:ind w:left="720" w:hanging="360"/>
+      </w:pPr>
+      <w:rPr>
+        <w:rFonts w:hint="default"/>
+      </w:rPr>
+    </w:lvl>
+    <w:lvl w:ilvl="1" w:tplc="08090019" w:tentative="1">
+      <w:start w:val="1"/>
+      <w:numFmt w:val="lowerLetter"/>
+      <w:lvlText w:val="%2."/>
+      <w:lvlJc w:val="left"/>
+      <w:pPr>
+        <w:ind w:left="1440" w:hanging="360"/>
+      </w:pPr>
+    </w:lvl>
+    <w:lvl w:ilvl="2" w:tplc="0809001B" w:tentative="1">
+      <w:start w:val="1"/>
+      <w:numFmt w:val="lowerRoman"/>
+      <w:lvlText w:val="%3."/>
+      <w:lvlJc w:val="right"/>
+      <w:pPr>
+        <w:ind w:left="2160" w:hanging="180"/>
+      </w:pPr>
+    </w:lvl>
+    <w:lvl w:ilvl="3" w:tplc="0809000F" w:tentative="1">
+      <w:start w:val="1"/>
+      <w:numFmt w:val="decimal"/>
+      <w:lvlText w:val="%4."/>
+      <w:lvlJc w:val="left"/>
+      <w:pPr>
+        <w:ind w:left="2880" w:hanging="360"/>
+      </w:pPr>
+    </w:lvl>
+    <w:lvl w:ilvl="4" w:tplc="08090019" w:tentative="1">
+      <w:start w:val="1"/>
+      <w:numFmt w:val="lowerLetter"/>
+      <w:lvlText w:val="%5."/>
+      <w:lvlJc w:val="left"/>
+      <w:pPr>
+        <w:ind w:left="3600" w:hanging="360"/>
+      </w:pPr>
+    </w:lvl>
+    <w:lvl w:ilvl="5" w:tplc="0809001B" w:tentative="1">
+      <w:start w:val="1"/>
+      <w:numFmt w:val="lowerRoman"/>
+      <w:lvlText w:val="%6."/>
+      <w:lvlJc w:val="right"/>
+      <w:pPr>
+        <w:ind w:left="4320" w:hanging="180"/>
+      </w:pPr>
+    </w:lvl>
+    <w:lvl w:ilvl="6" w:tplc="0809000F" w:tentative="1">
+      <w:start w:val="1"/>
+      <w:numFmt w:val="decimal"/>
+      <w:lvlText w:val="%7."/>
+      <w:lvlJc w:val="left"/>
+      <w:pPr>
+        <w:ind w:left="5040" w:hanging="360"/>
+      </w:pPr>
+    </w:lvl>
+    <w:lvl w:ilvl="7" w:tplc="08090019" w:tentative="1">
+      <w:start w:val="1"/>
+      <w:numFmt w:val="lowerLetter"/>
+      <w:lvlText w:val="%8."/>
+      <w:lvlJc w:val="left"/>
+      <w:pPr>
+        <w:ind w:left="5760" w:hanging="360"/>
+      </w:pPr>
+    </w:lvl>
+    <w:lvl w:ilvl="8" w:tplc="0809001B" w:tentative="1">
+      <w:start w:val="1"/>
+      <w:numFmt w:val="lowerRoman"/>
+      <w:lvlText w:val="%9."/>
+      <w:lvlJc w:val="right"/>
+      <w:pPr>
+        <w:ind w:left="6480" w:hanging="180"/>
+      </w:pPr>
+    </w:lvl>
+  </w:abstractNum>
+  <w:abstractNum w:abstractNumId="3" w15:restartNumberingAfterBreak="0">
+    <w:nsid w:val="478F79CB"/>
+    <w:multiLevelType w:val="multilevel"/>
+    <w:tmpl w:val="50F4FB04"/>
+    <w:lvl w:ilvl="0">
+      <w:start w:val="4"/>
+      <w:numFmt w:val="decimal"/>
+      <w:lvlText w:val="%1."/>
+      <w:lvlJc w:val="left"/>
+      <w:pPr>
+        <w:tabs>
+          <w:tab w:val="num" w:pos="720"/>
+        </w:tabs>
+        <w:ind w:left="720" w:hanging="360"/>
+      </w:pPr>
+    </w:lvl>
+    <w:lvl w:ilvl="1">
+      <w:start w:val="1"/>
+      <w:numFmt w:val="bullet"/>
+      <w:lvlText w:val="o"/>
+      <w:lvlJc w:val="left"/>
+      <w:pPr>
+        <w:tabs>
+          <w:tab w:val="num" w:pos="1440"/>
+        </w:tabs>
+        <w:ind w:left="1440" w:hanging="360"/>
+      </w:pPr>
+      <w:rPr>
+        <w:rFonts w:ascii="Courier New" w:hAnsi="Courier New" w:hint="default"/>
+        <w:sz w:val="20"/>
+      </w:rPr>
+    </w:lvl>
+    <w:lvl w:ilvl="2" w:tentative="1">
+      <w:start w:val="1"/>
+      <w:numFmt w:val="decimal"/>
+      <w:lvlText w:val="%3."/>
+      <w:lvlJc w:val="left"/>
+      <w:pPr>
+        <w:tabs>
+          <w:tab w:val="num" w:pos="2160"/>
+        </w:tabs>
+        <w:ind w:left="2160" w:hanging="360"/>
+      </w:pPr>
+    </w:lvl>
+    <w:lvl w:ilvl="3" w:tentative="1">
+      <w:start w:val="1"/>
+      <w:numFmt w:val="decimal"/>
+      <w:lvlText w:val="%4."/>
+      <w:lvlJc w:val="left"/>
+      <w:pPr>
+        <w:tabs>
+          <w:tab w:val="num" w:pos="2880"/>
+        </w:tabs>
+        <w:ind w:left="2880" w:hanging="360"/>
+      </w:pPr>
+    </w:lvl>
+    <w:lvl w:ilvl="4" w:tentative="1">
+      <w:start w:val="1"/>
+      <w:numFmt w:val="decimal"/>
+      <w:lvlText w:val="%5."/>
+      <w:lvlJc w:val="left"/>
+      <w:pPr>
+        <w:tabs>
+          <w:tab w:val="num" w:pos="3600"/>
+        </w:tabs>
+        <w:ind w:left="3600" w:hanging="360"/>
+      </w:pPr>
+    </w:lvl>
+    <w:lvl w:ilvl="5" w:tentative="1">
+      <w:start w:val="1"/>
+      <w:numFmt w:val="decimal"/>
+      <w:lvlText w:val="%6."/>
+      <w:lvlJc w:val="left"/>
+      <w:pPr>
+        <w:tabs>
+          <w:tab w:val="num" w:pos="4320"/>
+        </w:tabs>
+        <w:ind w:left="4320" w:hanging="360"/>
+      </w:pPr>
+    </w:lvl>
+    <w:lvl w:ilvl="6" w:tentative="1">
+      <w:start w:val="1"/>
+      <w:numFmt w:val="decimal"/>
+      <w:lvlText w:val="%7."/>
+      <w:lvlJc w:val="left"/>
+      <w:pPr>
+        <w:tabs>
+          <w:tab w:val="num" w:pos="5040"/>
+        </w:tabs>
+        <w:ind w:left="5040" w:hanging="360"/>
+      </w:pPr>
+    </w:lvl>
+    <w:lvl w:ilvl="7" w:tentative="1">
+      <w:start w:val="1"/>
+      <w:numFmt w:val="decimal"/>
+      <w:lvlText w:val="%8."/>
+      <w:lvlJc w:val="left"/>
+      <w:pPr>
+        <w:tabs>
+          <w:tab w:val="num" w:pos="5760"/>
+        </w:tabs>
+        <w:ind w:left="5760" w:hanging="360"/>
+      </w:pPr>
+    </w:lvl>
+    <w:lvl w:ilvl="8" w:tentative="1">
+      <w:start w:val="1"/>
+      <w:numFmt w:val="decimal"/>
+      <w:lvlText w:val="%9."/>
+      <w:lvlJc w:val="left"/>
+      <w:pPr>
+        <w:tabs>
+          <w:tab w:val="num" w:pos="6480"/>
+        </w:tabs>
+        <w:ind w:left="6480" w:hanging="360"/>
+      </w:pPr>
+    </w:lvl>
+  </w:abstractNum>
+  <w:abstractNum w:abstractNumId="4" w15:restartNumberingAfterBreak="0">
     <w:nsid w:val="549A720B"/>
     <w:multiLevelType w:val="hybridMultilevel"/>
     <w:tmpl w:val="71843932"/>
@@ -3302,7 +4487,7 @@
       </w:pPr>
     </w:lvl>
   </w:abstractNum>
-  <w:abstractNum w:abstractNumId="2" w15:restartNumberingAfterBreak="0">
+  <w:abstractNum w:abstractNumId="5" w15:restartNumberingAfterBreak="0">
     <w:nsid w:val="68485FBB"/>
     <w:multiLevelType w:val="hybridMultilevel"/>
     <w:tmpl w:val="BFD498BE"/>
@@ -3391,7 +4576,7 @@
       </w:pPr>
     </w:lvl>
   </w:abstractNum>
-  <w:abstractNum w:abstractNumId="3" w15:restartNumberingAfterBreak="0">
+  <w:abstractNum w:abstractNumId="6" w15:restartNumberingAfterBreak="0">
     <w:nsid w:val="70943128"/>
     <w:multiLevelType w:val="hybridMultilevel"/>
     <w:tmpl w:val="45A0603E"/>
@@ -3480,7 +4665,7 @@
       </w:pPr>
     </w:lvl>
   </w:abstractNum>
-  <w:abstractNum w:abstractNumId="4" w15:restartNumberingAfterBreak="0">
+  <w:abstractNum w:abstractNumId="7" w15:restartNumberingAfterBreak="0">
     <w:nsid w:val="733C0BE0"/>
     <w:multiLevelType w:val="hybridMultilevel"/>
     <w:tmpl w:val="95186468"/>
@@ -3567,19 +4752,28 @@
     </w:lvl>
   </w:abstractNum>
   <w:num w:numId="1" w16cid:durableId="1067338956">
+    <w:abstractNumId w:val="7"/>
+  </w:num>
+  <w:num w:numId="2" w16cid:durableId="590284260">
     <w:abstractNumId w:val="4"/>
   </w:num>
-  <w:num w:numId="2" w16cid:durableId="590284260">
+  <w:num w:numId="3" w16cid:durableId="294259356">
+    <w:abstractNumId w:val="6"/>
+  </w:num>
+  <w:num w:numId="4" w16cid:durableId="170342946">
+    <w:abstractNumId w:val="5"/>
+  </w:num>
+  <w:num w:numId="5" w16cid:durableId="724839393">
     <w:abstractNumId w:val="1"/>
   </w:num>
-  <w:num w:numId="3" w16cid:durableId="294259356">
-    <w:abstractNumId w:val="3"/>
-  </w:num>
-  <w:num w:numId="4" w16cid:durableId="170342946">
+  <w:num w:numId="6" w16cid:durableId="1743481551">
     <w:abstractNumId w:val="2"/>
   </w:num>
-  <w:num w:numId="5" w16cid:durableId="724839393">
+  <w:num w:numId="7" w16cid:durableId="1058477180">
     <w:abstractNumId w:val="0"/>
+  </w:num>
+  <w:num w:numId="8" w16cid:durableId="1186557064">
+    <w:abstractNumId w:val="3"/>
   </w:num>
 </w:numbering>
 </file>
@@ -4725,6 +5919,21 @@
       </w:tblBorders>
     </w:tblPr>
   </w:style>
+  <w:style w:type="paragraph" w:customStyle="1" w:styleId="p1">
+    <w:name w:val="p1"/>
+    <w:basedOn w:val="Normal"/>
+    <w:rsid w:val="00C3779A"/>
+    <w:pPr>
+      <w:spacing w:before="100" w:beforeAutospacing="1" w:after="100" w:afterAutospacing="1" w:line="240" w:lineRule="auto"/>
+    </w:pPr>
+    <w:rPr>
+      <w:rFonts w:eastAsia="Times New Roman" w:cs="Times New Roman"/>
+      <w:kern w:val="0"/>
+      <w:sz w:val="24"/>
+      <w:lang w:val="en-RU" w:eastAsia="en-GB"/>
+      <w14:ligatures w14:val="none"/>
+    </w:rPr>
+  </w:style>
 </w:styles>
 </file>
 

</xml_diff>

<commit_message>
IT lab4: final refactoring and report completed
</commit_message>
<xml_diff>
--- a/it/lab4/report.docx
+++ b/it/lab4/report.docx
@@ -1,6 +1,6 @@
 
 <file path=word/document.xml><?xml version="1.0" encoding="utf-8"?>
-<w:document xmlns:wpc="http://schemas.microsoft.com/office/word/2010/wordprocessingCanvas" xmlns:cx="http://schemas.microsoft.com/office/drawing/2014/chartex" xmlns:cx1="http://schemas.microsoft.com/office/drawing/2015/9/8/chartex" xmlns:cx2="http://schemas.microsoft.com/office/drawing/2015/10/21/chartex" xmlns:cx3="http://schemas.microsoft.com/office/drawing/2016/5/9/chartex" xmlns:cx4="http://schemas.microsoft.com/office/drawing/2016/5/10/chartex" xmlns:cx5="http://schemas.microsoft.com/office/drawing/2016/5/11/chartex" xmlns:cx6="http://schemas.microsoft.com/office/drawing/2016/5/12/chartex" xmlns:cx7="http://schemas.microsoft.com/office/drawing/2016/5/13/chartex" xmlns:cx8="http://schemas.microsoft.com/office/drawing/2016/5/14/chartex" xmlns:mc="http://schemas.openxmlformats.org/markup-compatibility/2006" xmlns:aink="http://schemas.microsoft.com/office/drawing/2016/ink" xmlns:am3d="http://schemas.microsoft.com/office/drawing/2017/model3d" xmlns:o="urn:schemas-microsoft-com:office:office" xmlns:oel="http://schemas.microsoft.com/office/2019/extlst" xmlns:r="http://schemas.openxmlformats.org/officeDocument/2006/relationships" xmlns:m="http://schemas.openxmlformats.org/officeDocument/2006/math" xmlns:v="urn:schemas-microsoft-com:vml" xmlns:wp14="http://schemas.microsoft.com/office/word/2010/wordprocessingDrawing" xmlns:wp="http://schemas.openxmlformats.org/drawingml/2006/wordprocessingDrawing" xmlns:w10="urn:schemas-microsoft-com:office:word" xmlns:w="http://schemas.openxmlformats.org/wordprocessingml/2006/main" xmlns:w14="http://schemas.microsoft.com/office/word/2010/wordml" xmlns:w15="http://schemas.microsoft.com/office/word/2012/wordml" xmlns:w16cex="http://schemas.microsoft.com/office/word/2018/wordml/cex" xmlns:w16cid="http://schemas.microsoft.com/office/word/2016/wordml/cid" xmlns:w16="http://schemas.microsoft.com/office/word/2018/wordml" xmlns:w16du="http://schemas.microsoft.com/office/word/2023/wordml/word16du" xmlns:w16sdtdh="http://schemas.microsoft.com/office/word/2020/wordml/sdtdatahash" xmlns:w16sdtfl="http://schemas.microsoft.com/office/word/2024/wordml/sdtformatlock" xmlns:w16se="http://schemas.microsoft.com/office/word/2015/wordml/symex" xmlns:wpg="http://schemas.microsoft.com/office/word/2010/wordprocessingGroup" xmlns:wpi="http://schemas.microsoft.com/office/word/2010/wordprocessingInk" xmlns:wne="http://schemas.microsoft.com/office/word/2006/wordml" xmlns:wps="http://schemas.microsoft.com/office/word/2010/wordprocessingShape" mc:Ignorable="w14 w15 w16se w16cid w16 w16cex w16sdtdh w16sdtfl w16du wp14">
+<w:document xmlns:wpc="http://schemas.microsoft.com/office/word/2010/wordprocessingCanvas" xmlns:cx="http://schemas.microsoft.com/office/drawing/2014/chartex" xmlns:cx1="http://schemas.microsoft.com/office/drawing/2015/9/8/chartex" xmlns:cx2="http://schemas.microsoft.com/office/drawing/2015/10/21/chartex" xmlns:cx3="http://schemas.microsoft.com/office/drawing/2016/5/9/chartex" xmlns:cx4="http://schemas.microsoft.com/office/drawing/2016/5/10/chartex" xmlns:cx5="http://schemas.microsoft.com/office/drawing/2016/5/11/chartex" xmlns:cx6="http://schemas.microsoft.com/office/drawing/2016/5/12/chartex" xmlns:cx7="http://schemas.microsoft.com/office/drawing/2016/5/13/chartex" xmlns:cx8="http://schemas.microsoft.com/office/drawing/2016/5/14/chartex" xmlns:mc="http://schemas.openxmlformats.org/markup-compatibility/2006" xmlns:aink="http://schemas.microsoft.com/office/drawing/2016/ink" xmlns:am3d="http://schemas.microsoft.com/office/drawing/2017/model3d" xmlns:o="urn:schemas-microsoft-com:office:office" xmlns:oel="http://schemas.microsoft.com/office/2019/extlst" xmlns:r="http://schemas.openxmlformats.org/officeDocument/2006/relationships" xmlns:m="http://schemas.openxmlformats.org/officeDocument/2006/math" xmlns:v="urn:schemas-microsoft-com:vml" xmlns:wp14="http://schemas.microsoft.com/office/word/2010/wordprocessingDrawing" xmlns:wp="http://schemas.openxmlformats.org/drawingml/2006/wordprocessingDrawing" xmlns:w10="urn:schemas-microsoft-com:office:word" xmlns:w="http://schemas.openxmlformats.org/wordprocessingml/2006/main" xmlns:w14="http://schemas.microsoft.com/office/word/2010/wordml" xmlns:w15="http://schemas.microsoft.com/office/word/2012/wordml" xmlns:w16cex="http://schemas.microsoft.com/office/word/2018/wordml/cex" xmlns:w16cid="http://schemas.microsoft.com/office/word/2016/wordml/cid" xmlns:w16="http://schemas.microsoft.com/office/word/2018/wordml" xmlns:w16sdtdh="http://schemas.microsoft.com/office/word/2020/wordml/sdtdatahash" xmlns:w16se="http://schemas.microsoft.com/office/word/2015/wordml/symex" xmlns:wpg="http://schemas.microsoft.com/office/word/2010/wordprocessingGroup" xmlns:wpi="http://schemas.microsoft.com/office/word/2010/wordprocessingInk" xmlns:wne="http://schemas.microsoft.com/office/word/2006/wordml" xmlns:wps="http://schemas.microsoft.com/office/word/2010/wordprocessingShape" mc:Ignorable="w14 w15 w16se w16cid w16 w16cex w16sdtdh wp14">
   <w:body>
     <w:p>
       <w:pPr>
@@ -244,16 +244,16 @@
       <w:sdtContent>
         <w:p>
           <w:pPr>
-            <w:pStyle w:val="TOCHeading"/>
+            <w:pStyle w:val="af2"/>
             <w:jc w:val="center"/>
             <w:rPr>
-              <w:rStyle w:val="Heading1Char"/>
+              <w:rStyle w:val="10"/>
               <w:color w:val="auto"/>
             </w:rPr>
           </w:pPr>
           <w:r>
             <w:rPr>
-              <w:rStyle w:val="Heading1Char"/>
+              <w:rStyle w:val="10"/>
               <w:color w:val="auto"/>
             </w:rPr>
             <w:t>Содержание</w:t>
@@ -268,7 +268,7 @@
         </w:p>
         <w:p>
           <w:pPr>
-            <w:pStyle w:val="TOC1"/>
+            <w:pStyle w:val="11"/>
             <w:tabs>
               <w:tab w:val="right" w:leader="dot" w:pos="9344"/>
             </w:tabs>
@@ -276,7 +276,7 @@
               <w:rFonts w:asciiTheme="minorHAnsi" w:eastAsiaTheme="minorEastAsia" w:hAnsiTheme="minorHAnsi"/>
               <w:noProof/>
               <w:sz w:val="24"/>
-              <w:lang w:val="en-RU" w:eastAsia="en-GB"/>
+              <w:lang w:eastAsia="en-GB"/>
             </w:rPr>
           </w:pPr>
           <w:r>
@@ -291,7 +291,7 @@
           <w:hyperlink w:anchor="_Toc213000643" w:history="1">
             <w:r>
               <w:rPr>
-                <w:rStyle w:val="Hyperlink"/>
+                <w:rStyle w:val="af3"/>
                 <w:b/>
                 <w:bCs/>
                 <w:noProof/>
@@ -350,7 +350,7 @@
         </w:p>
         <w:p>
           <w:pPr>
-            <w:pStyle w:val="TOC2"/>
+            <w:pStyle w:val="23"/>
             <w:tabs>
               <w:tab w:val="right" w:leader="dot" w:pos="9344"/>
             </w:tabs>
@@ -358,13 +358,13 @@
               <w:rFonts w:asciiTheme="minorHAnsi" w:eastAsiaTheme="minorEastAsia" w:hAnsiTheme="minorHAnsi"/>
               <w:noProof/>
               <w:sz w:val="24"/>
-              <w:lang w:val="en-RU" w:eastAsia="en-GB"/>
+              <w:lang w:eastAsia="en-GB"/>
             </w:rPr>
           </w:pPr>
           <w:hyperlink w:anchor="_Toc213000644" w:history="1">
             <w:r>
               <w:rPr>
-                <w:rStyle w:val="Hyperlink"/>
+                <w:rStyle w:val="af3"/>
                 <w:noProof/>
               </w:rPr>
               <w:t>Обязательное задание</w:t>
@@ -421,7 +421,7 @@
         </w:p>
         <w:p>
           <w:pPr>
-            <w:pStyle w:val="TOC2"/>
+            <w:pStyle w:val="23"/>
             <w:tabs>
               <w:tab w:val="right" w:leader="dot" w:pos="9344"/>
             </w:tabs>
@@ -429,13 +429,13 @@
               <w:rFonts w:asciiTheme="minorHAnsi" w:eastAsiaTheme="minorEastAsia" w:hAnsiTheme="minorHAnsi"/>
               <w:noProof/>
               <w:sz w:val="24"/>
-              <w:lang w:val="en-RU" w:eastAsia="en-GB"/>
+              <w:lang w:eastAsia="en-GB"/>
             </w:rPr>
           </w:pPr>
           <w:hyperlink w:anchor="_Toc213000645" w:history="1">
             <w:r>
               <w:rPr>
-                <w:rStyle w:val="Hyperlink"/>
+                <w:rStyle w:val="af3"/>
                 <w:noProof/>
               </w:rPr>
               <w:t>Дополнительные задания</w:t>
@@ -492,7 +492,7 @@
         </w:p>
         <w:p>
           <w:pPr>
-            <w:pStyle w:val="TOC3"/>
+            <w:pStyle w:val="31"/>
             <w:tabs>
               <w:tab w:val="right" w:leader="dot" w:pos="9344"/>
             </w:tabs>
@@ -500,13 +500,13 @@
               <w:rFonts w:asciiTheme="minorHAnsi" w:eastAsiaTheme="minorEastAsia" w:hAnsiTheme="minorHAnsi"/>
               <w:noProof/>
               <w:sz w:val="24"/>
-              <w:lang w:val="en-RU" w:eastAsia="en-GB"/>
+              <w:lang w:eastAsia="en-GB"/>
             </w:rPr>
           </w:pPr>
           <w:hyperlink w:anchor="_Toc213000646" w:history="1">
             <w:r>
               <w:rPr>
-                <w:rStyle w:val="Hyperlink"/>
+                <w:rStyle w:val="af3"/>
                 <w:noProof/>
               </w:rPr>
               <w:t>1 Задание</w:t>
@@ -563,7 +563,7 @@
         </w:p>
         <w:p>
           <w:pPr>
-            <w:pStyle w:val="TOC3"/>
+            <w:pStyle w:val="31"/>
             <w:tabs>
               <w:tab w:val="right" w:leader="dot" w:pos="9344"/>
             </w:tabs>
@@ -571,13 +571,13 @@
               <w:rFonts w:asciiTheme="minorHAnsi" w:eastAsiaTheme="minorEastAsia" w:hAnsiTheme="minorHAnsi"/>
               <w:noProof/>
               <w:sz w:val="24"/>
-              <w:lang w:val="en-RU" w:eastAsia="en-GB"/>
+              <w:lang w:eastAsia="en-GB"/>
             </w:rPr>
           </w:pPr>
           <w:hyperlink w:anchor="_Toc213000647" w:history="1">
             <w:r>
               <w:rPr>
-                <w:rStyle w:val="Hyperlink"/>
+                <w:rStyle w:val="af3"/>
                 <w:noProof/>
               </w:rPr>
               <w:t>2 Задание</w:t>
@@ -634,7 +634,7 @@
         </w:p>
         <w:p>
           <w:pPr>
-            <w:pStyle w:val="TOC3"/>
+            <w:pStyle w:val="31"/>
             <w:tabs>
               <w:tab w:val="right" w:leader="dot" w:pos="9344"/>
             </w:tabs>
@@ -642,13 +642,13 @@
               <w:rFonts w:asciiTheme="minorHAnsi" w:eastAsiaTheme="minorEastAsia" w:hAnsiTheme="minorHAnsi"/>
               <w:noProof/>
               <w:sz w:val="24"/>
-              <w:lang w:val="en-RU" w:eastAsia="en-GB"/>
+              <w:lang w:eastAsia="en-GB"/>
             </w:rPr>
           </w:pPr>
           <w:hyperlink w:anchor="_Toc213000648" w:history="1">
             <w:r>
               <w:rPr>
-                <w:rStyle w:val="Hyperlink"/>
+                <w:rStyle w:val="af3"/>
                 <w:noProof/>
               </w:rPr>
               <w:t>3 Задание</w:t>
@@ -705,7 +705,7 @@
         </w:p>
         <w:p>
           <w:pPr>
-            <w:pStyle w:val="TOC3"/>
+            <w:pStyle w:val="31"/>
             <w:tabs>
               <w:tab w:val="right" w:leader="dot" w:pos="9344"/>
             </w:tabs>
@@ -713,13 +713,13 @@
               <w:rFonts w:asciiTheme="minorHAnsi" w:eastAsiaTheme="minorEastAsia" w:hAnsiTheme="minorHAnsi"/>
               <w:noProof/>
               <w:sz w:val="24"/>
-              <w:lang w:val="en-RU" w:eastAsia="en-GB"/>
+              <w:lang w:eastAsia="en-GB"/>
             </w:rPr>
           </w:pPr>
           <w:hyperlink w:anchor="_Toc213000649" w:history="1">
             <w:r>
               <w:rPr>
-                <w:rStyle w:val="Hyperlink"/>
+                <w:rStyle w:val="af3"/>
                 <w:noProof/>
               </w:rPr>
               <w:t>4 Задание</w:t>
@@ -776,7 +776,7 @@
         </w:p>
         <w:p>
           <w:pPr>
-            <w:pStyle w:val="TOC1"/>
+            <w:pStyle w:val="11"/>
             <w:tabs>
               <w:tab w:val="right" w:leader="dot" w:pos="9344"/>
             </w:tabs>
@@ -784,13 +784,13 @@
               <w:rFonts w:asciiTheme="minorHAnsi" w:eastAsiaTheme="minorEastAsia" w:hAnsiTheme="minorHAnsi"/>
               <w:noProof/>
               <w:sz w:val="24"/>
-              <w:lang w:val="en-RU" w:eastAsia="en-GB"/>
+              <w:lang w:eastAsia="en-GB"/>
             </w:rPr>
           </w:pPr>
           <w:hyperlink w:anchor="_Toc213000650" w:history="1">
             <w:r>
               <w:rPr>
-                <w:rStyle w:val="Hyperlink"/>
+                <w:rStyle w:val="af3"/>
                 <w:b/>
                 <w:bCs/>
                 <w:noProof/>
@@ -849,7 +849,7 @@
         </w:p>
         <w:p>
           <w:pPr>
-            <w:pStyle w:val="TOC2"/>
+            <w:pStyle w:val="23"/>
             <w:tabs>
               <w:tab w:val="right" w:leader="dot" w:pos="9344"/>
             </w:tabs>
@@ -857,13 +857,13 @@
               <w:rFonts w:asciiTheme="minorHAnsi" w:eastAsiaTheme="minorEastAsia" w:hAnsiTheme="minorHAnsi"/>
               <w:noProof/>
               <w:sz w:val="24"/>
-              <w:lang w:val="en-RU" w:eastAsia="en-GB"/>
+              <w:lang w:eastAsia="en-GB"/>
             </w:rPr>
           </w:pPr>
           <w:hyperlink w:anchor="_Toc213000651" w:history="1">
             <w:r>
               <w:rPr>
-                <w:rStyle w:val="Hyperlink"/>
+                <w:rStyle w:val="af3"/>
                 <w:noProof/>
               </w:rPr>
               <w:t>Обязательное задание</w:t>
@@ -920,7 +920,7 @@
         </w:p>
         <w:p>
           <w:pPr>
-            <w:pStyle w:val="TOC2"/>
+            <w:pStyle w:val="23"/>
             <w:tabs>
               <w:tab w:val="right" w:leader="dot" w:pos="9344"/>
             </w:tabs>
@@ -928,13 +928,13 @@
               <w:rFonts w:asciiTheme="minorHAnsi" w:eastAsiaTheme="minorEastAsia" w:hAnsiTheme="minorHAnsi"/>
               <w:noProof/>
               <w:sz w:val="24"/>
-              <w:lang w:val="en-RU" w:eastAsia="en-GB"/>
+              <w:lang w:eastAsia="en-GB"/>
             </w:rPr>
           </w:pPr>
           <w:hyperlink w:anchor="_Toc213000652" w:history="1">
             <w:r>
               <w:rPr>
-                <w:rStyle w:val="Hyperlink"/>
+                <w:rStyle w:val="af3"/>
                 <w:noProof/>
               </w:rPr>
               <w:t>Дополнительное задание 1</w:t>
@@ -991,7 +991,7 @@
         </w:p>
         <w:p>
           <w:pPr>
-            <w:pStyle w:val="TOC2"/>
+            <w:pStyle w:val="23"/>
             <w:tabs>
               <w:tab w:val="right" w:leader="dot" w:pos="9344"/>
             </w:tabs>
@@ -999,13 +999,13 @@
               <w:rFonts w:asciiTheme="minorHAnsi" w:eastAsiaTheme="minorEastAsia" w:hAnsiTheme="minorHAnsi"/>
               <w:noProof/>
               <w:sz w:val="24"/>
-              <w:lang w:val="en-RU" w:eastAsia="en-GB"/>
+              <w:lang w:eastAsia="en-GB"/>
             </w:rPr>
           </w:pPr>
           <w:hyperlink w:anchor="_Toc213000653" w:history="1">
             <w:r>
               <w:rPr>
-                <w:rStyle w:val="Hyperlink"/>
+                <w:rStyle w:val="af3"/>
                 <w:noProof/>
               </w:rPr>
               <w:t>Дополнительное задание 2</w:t>
@@ -1062,7 +1062,7 @@
         </w:p>
         <w:p>
           <w:pPr>
-            <w:pStyle w:val="TOC2"/>
+            <w:pStyle w:val="23"/>
             <w:tabs>
               <w:tab w:val="right" w:leader="dot" w:pos="9344"/>
             </w:tabs>
@@ -1070,13 +1070,13 @@
               <w:rFonts w:asciiTheme="minorHAnsi" w:eastAsiaTheme="minorEastAsia" w:hAnsiTheme="minorHAnsi"/>
               <w:noProof/>
               <w:sz w:val="24"/>
-              <w:lang w:val="en-RU" w:eastAsia="en-GB"/>
+              <w:lang w:eastAsia="en-GB"/>
             </w:rPr>
           </w:pPr>
           <w:hyperlink w:anchor="_Toc213000654" w:history="1">
             <w:r>
               <w:rPr>
-                <w:rStyle w:val="Hyperlink"/>
+                <w:rStyle w:val="af3"/>
                 <w:noProof/>
               </w:rPr>
               <w:t>Дополнительное задание 3</w:t>
@@ -1133,7 +1133,7 @@
         </w:p>
         <w:p>
           <w:pPr>
-            <w:pStyle w:val="TOC2"/>
+            <w:pStyle w:val="23"/>
             <w:tabs>
               <w:tab w:val="right" w:leader="dot" w:pos="9344"/>
             </w:tabs>
@@ -1141,13 +1141,13 @@
               <w:rFonts w:asciiTheme="minorHAnsi" w:eastAsiaTheme="minorEastAsia" w:hAnsiTheme="minorHAnsi"/>
               <w:noProof/>
               <w:sz w:val="24"/>
-              <w:lang w:val="en-RU" w:eastAsia="en-GB"/>
+              <w:lang w:eastAsia="en-GB"/>
             </w:rPr>
           </w:pPr>
           <w:hyperlink w:anchor="_Toc213000655" w:history="1">
             <w:r>
               <w:rPr>
-                <w:rStyle w:val="Hyperlink"/>
+                <w:rStyle w:val="af3"/>
                 <w:noProof/>
               </w:rPr>
               <w:t>Дополнительное задание 4</w:t>
@@ -1204,7 +1204,7 @@
         </w:p>
         <w:p>
           <w:pPr>
-            <w:pStyle w:val="TOC1"/>
+            <w:pStyle w:val="11"/>
             <w:tabs>
               <w:tab w:val="right" w:leader="dot" w:pos="9344"/>
             </w:tabs>
@@ -1212,13 +1212,13 @@
               <w:rFonts w:asciiTheme="minorHAnsi" w:eastAsiaTheme="minorEastAsia" w:hAnsiTheme="minorHAnsi"/>
               <w:noProof/>
               <w:sz w:val="24"/>
-              <w:lang w:val="en-RU" w:eastAsia="en-GB"/>
+              <w:lang w:eastAsia="en-GB"/>
             </w:rPr>
           </w:pPr>
           <w:hyperlink w:anchor="_Toc213000656" w:history="1">
             <w:r>
               <w:rPr>
-                <w:rStyle w:val="Hyperlink"/>
+                <w:rStyle w:val="af3"/>
                 <w:b/>
                 <w:bCs/>
                 <w:noProof/>
@@ -1277,7 +1277,7 @@
         </w:p>
         <w:p>
           <w:pPr>
-            <w:pStyle w:val="TOC1"/>
+            <w:pStyle w:val="11"/>
             <w:tabs>
               <w:tab w:val="right" w:leader="dot" w:pos="9344"/>
             </w:tabs>
@@ -1285,13 +1285,13 @@
               <w:rFonts w:asciiTheme="minorHAnsi" w:eastAsiaTheme="minorEastAsia" w:hAnsiTheme="minorHAnsi"/>
               <w:noProof/>
               <w:sz w:val="24"/>
-              <w:lang w:val="en-RU" w:eastAsia="en-GB"/>
+              <w:lang w:eastAsia="en-GB"/>
             </w:rPr>
           </w:pPr>
           <w:hyperlink w:anchor="_Toc213000657" w:history="1">
             <w:r>
               <w:rPr>
-                <w:rStyle w:val="Hyperlink"/>
+                <w:rStyle w:val="af3"/>
                 <w:b/>
                 <w:bCs/>
                 <w:noProof/>
@@ -1366,7 +1366,7 @@
     <w:p/>
     <w:p>
       <w:pPr>
-        <w:pStyle w:val="Heading1"/>
+        <w:pStyle w:val="1"/>
         <w:jc w:val="center"/>
         <w:rPr>
           <w:b/>
@@ -1387,7 +1387,7 @@
     </w:p>
     <w:tbl>
       <w:tblPr>
-        <w:tblStyle w:val="TableGrid"/>
+        <w:tblStyle w:val="af8"/>
         <w:tblW w:w="0" w:type="auto"/>
         <w:tblLook w:val="04A0" w:firstRow="1" w:lastRow="0" w:firstColumn="1" w:lastColumn="0" w:noHBand="0" w:noVBand="1"/>
       </w:tblPr>
@@ -1522,7 +1522,7 @@
     <w:p/>
     <w:p>
       <w:pPr>
-        <w:pStyle w:val="Heading2"/>
+        <w:pStyle w:val="2"/>
         <w:jc w:val="center"/>
       </w:pPr>
       <w:bookmarkStart w:id="1" w:name="_Toc213000644"/>
@@ -1589,7 +1589,7 @@
     </w:p>
     <w:p>
       <w:pPr>
-        <w:pStyle w:val="Heading2"/>
+        <w:pStyle w:val="2"/>
         <w:jc w:val="center"/>
       </w:pPr>
       <w:bookmarkStart w:id="2" w:name="_Toc213000645"/>
@@ -1600,7 +1600,7 @@
     </w:p>
     <w:p>
       <w:pPr>
-        <w:pStyle w:val="Heading3"/>
+        <w:pStyle w:val="3"/>
         <w:jc w:val="center"/>
       </w:pPr>
       <w:bookmarkStart w:id="3" w:name="_Toc213000646"/>
@@ -1657,7 +1657,7 @@
     </w:p>
     <w:p>
       <w:pPr>
-        <w:pStyle w:val="Heading3"/>
+        <w:pStyle w:val="3"/>
         <w:jc w:val="center"/>
         <w:rPr>
           <w:color w:val="000000" w:themeColor="text1"/>
@@ -1713,7 +1713,7 @@
     </w:p>
     <w:p>
       <w:pPr>
-        <w:pStyle w:val="Heading3"/>
+        <w:pStyle w:val="3"/>
         <w:jc w:val="center"/>
       </w:pPr>
       <w:bookmarkStart w:id="5" w:name="_Toc213000648"/>
@@ -1735,7 +1735,7 @@
     </w:p>
     <w:p>
       <w:pPr>
-        <w:pStyle w:val="Heading3"/>
+        <w:pStyle w:val="3"/>
         <w:jc w:val="center"/>
       </w:pPr>
       <w:bookmarkStart w:id="6" w:name="_Toc213000649"/>
@@ -1807,7 +1807,7 @@
     </w:p>
     <w:p>
       <w:pPr>
-        <w:pStyle w:val="Heading1"/>
+        <w:pStyle w:val="1"/>
         <w:jc w:val="center"/>
         <w:rPr>
           <w:b/>
@@ -1834,7 +1834,7 @@
     </w:p>
     <w:p>
       <w:pPr>
-        <w:pStyle w:val="Heading2"/>
+        <w:pStyle w:val="2"/>
         <w:jc w:val="center"/>
       </w:pPr>
       <w:bookmarkStart w:id="8" w:name="_Toc213000651"/>
@@ -1867,14 +1867,14 @@
       <w:hyperlink r:id="rId8" w:history="1">
         <w:r>
           <w:rPr>
-            <w:rStyle w:val="Hyperlink"/>
+            <w:rStyle w:val="af3"/>
           </w:rPr>
           <w:t>https://github.com/Miwm64/itmo_</w:t>
         </w:r>
         <w:proofErr w:type="spellStart"/>
         <w:r>
           <w:rPr>
-            <w:rStyle w:val="Hyperlink"/>
+            <w:rStyle w:val="af3"/>
             <w:lang w:val="en-US"/>
           </w:rPr>
           <w:t>cse</w:t>
@@ -1882,94 +1882,94 @@
         <w:proofErr w:type="spellEnd"/>
         <w:r>
           <w:rPr>
-            <w:rStyle w:val="Hyperlink"/>
+            <w:rStyle w:val="af3"/>
           </w:rPr>
           <w:t>/</w:t>
         </w:r>
         <w:proofErr w:type="spellStart"/>
         <w:r>
           <w:rPr>
-            <w:rStyle w:val="Hyperlink"/>
+            <w:rStyle w:val="af3"/>
           </w:rPr>
           <w:t>blob</w:t>
         </w:r>
         <w:proofErr w:type="spellEnd"/>
         <w:r>
           <w:rPr>
-            <w:rStyle w:val="Hyperlink"/>
+            <w:rStyle w:val="af3"/>
           </w:rPr>
           <w:t>/</w:t>
         </w:r>
         <w:proofErr w:type="spellStart"/>
         <w:r>
           <w:rPr>
-            <w:rStyle w:val="Hyperlink"/>
+            <w:rStyle w:val="af3"/>
           </w:rPr>
           <w:t>master</w:t>
         </w:r>
         <w:proofErr w:type="spellEnd"/>
         <w:r>
           <w:rPr>
-            <w:rStyle w:val="Hyperlink"/>
+            <w:rStyle w:val="af3"/>
           </w:rPr>
           <w:t>/</w:t>
         </w:r>
         <w:r>
           <w:rPr>
-            <w:rStyle w:val="Hyperlink"/>
+            <w:rStyle w:val="af3"/>
             <w:lang w:val="en-US"/>
           </w:rPr>
           <w:t>it</w:t>
         </w:r>
         <w:r>
           <w:rPr>
-            <w:rStyle w:val="Hyperlink"/>
+            <w:rStyle w:val="af3"/>
           </w:rPr>
           <w:t>/</w:t>
         </w:r>
         <w:r>
           <w:rPr>
-            <w:rStyle w:val="Hyperlink"/>
+            <w:rStyle w:val="af3"/>
             <w:lang w:val="en-US"/>
           </w:rPr>
           <w:t>lab</w:t>
         </w:r>
         <w:r>
           <w:rPr>
-            <w:rStyle w:val="Hyperlink"/>
+            <w:rStyle w:val="af3"/>
           </w:rPr>
           <w:t>4/</w:t>
         </w:r>
         <w:r>
           <w:rPr>
-            <w:rStyle w:val="Hyperlink"/>
+            <w:rStyle w:val="af3"/>
             <w:lang w:val="en-US"/>
           </w:rPr>
           <w:t>code</w:t>
         </w:r>
         <w:r>
           <w:rPr>
-            <w:rStyle w:val="Hyperlink"/>
+            <w:rStyle w:val="af3"/>
           </w:rPr>
           <w:t>/</w:t>
         </w:r>
         <w:r>
           <w:rPr>
-            <w:rStyle w:val="Hyperlink"/>
+            <w:rStyle w:val="af3"/>
             <w:lang w:val="en-US"/>
           </w:rPr>
           <w:t>main</w:t>
         </w:r>
         <w:r>
           <w:rPr>
-            <w:rStyle w:val="Hyperlink"/>
+            <w:rStyle w:val="af3"/>
           </w:rPr>
           <w:t>.</w:t>
         </w:r>
         <w:proofErr w:type="spellStart"/>
         <w:r>
           <w:rPr>
-            <w:rStyle w:val="Hyperlink"/>
+            <w:rStyle w:val="af3"/>
             <w:lang w:val="en-US"/>
           </w:rPr>
           <w:t>py</w:t>
@@ -2078,7 +2078,7 @@
     </w:p>
     <w:p>
       <w:pPr>
-        <w:pStyle w:val="Heading2"/>
+        <w:pStyle w:val="2"/>
         <w:jc w:val="center"/>
       </w:pPr>
       <w:bookmarkStart w:id="9" w:name="_Toc213000652"/>
@@ -2112,14 +2112,14 @@
       <w:hyperlink r:id="rId9" w:history="1">
         <w:r>
           <w:rPr>
-            <w:rStyle w:val="Hyperlink"/>
+            <w:rStyle w:val="af3"/>
           </w:rPr>
           <w:t>https://github.com/Miwm64/itmo_</w:t>
         </w:r>
         <w:proofErr w:type="spellStart"/>
         <w:r>
           <w:rPr>
-            <w:rStyle w:val="Hyperlink"/>
+            <w:rStyle w:val="af3"/>
             <w:lang w:val="en-US"/>
           </w:rPr>
           <w:t>cse</w:t>
@@ -2127,94 +2127,94 @@
         <w:proofErr w:type="spellEnd"/>
         <w:r>
           <w:rPr>
-            <w:rStyle w:val="Hyperlink"/>
+            <w:rStyle w:val="af3"/>
           </w:rPr>
           <w:t>/</w:t>
         </w:r>
         <w:proofErr w:type="spellStart"/>
         <w:r>
           <w:rPr>
-            <w:rStyle w:val="Hyperlink"/>
+            <w:rStyle w:val="af3"/>
           </w:rPr>
           <w:t>blob</w:t>
         </w:r>
         <w:proofErr w:type="spellEnd"/>
         <w:r>
           <w:rPr>
-            <w:rStyle w:val="Hyperlink"/>
+            <w:rStyle w:val="af3"/>
           </w:rPr>
           <w:t>/</w:t>
         </w:r>
         <w:proofErr w:type="spellStart"/>
         <w:r>
           <w:rPr>
-            <w:rStyle w:val="Hyperlink"/>
+            <w:rStyle w:val="af3"/>
           </w:rPr>
           <w:t>master</w:t>
         </w:r>
         <w:proofErr w:type="spellEnd"/>
         <w:r>
           <w:rPr>
-            <w:rStyle w:val="Hyperlink"/>
+            <w:rStyle w:val="af3"/>
           </w:rPr>
           <w:t>/</w:t>
         </w:r>
         <w:r>
           <w:rPr>
-            <w:rStyle w:val="Hyperlink"/>
+            <w:rStyle w:val="af3"/>
             <w:lang w:val="en-US"/>
           </w:rPr>
           <w:t>it</w:t>
         </w:r>
         <w:r>
           <w:rPr>
-            <w:rStyle w:val="Hyperlink"/>
+            <w:rStyle w:val="af3"/>
           </w:rPr>
           <w:t>/</w:t>
         </w:r>
         <w:r>
           <w:rPr>
-            <w:rStyle w:val="Hyperlink"/>
+            <w:rStyle w:val="af3"/>
             <w:lang w:val="en-US"/>
           </w:rPr>
           <w:t>lab</w:t>
         </w:r>
         <w:r>
           <w:rPr>
-            <w:rStyle w:val="Hyperlink"/>
+            <w:rStyle w:val="af3"/>
           </w:rPr>
           <w:t>4/</w:t>
         </w:r>
         <w:r>
           <w:rPr>
-            <w:rStyle w:val="Hyperlink"/>
+            <w:rStyle w:val="af3"/>
             <w:lang w:val="en-US"/>
           </w:rPr>
           <w:t>code</w:t>
         </w:r>
         <w:r>
           <w:rPr>
-            <w:rStyle w:val="Hyperlink"/>
+            <w:rStyle w:val="af3"/>
           </w:rPr>
           <w:t>/</w:t>
         </w:r>
         <w:r>
           <w:rPr>
-            <w:rStyle w:val="Hyperlink"/>
+            <w:rStyle w:val="af3"/>
             <w:lang w:val="en-US"/>
           </w:rPr>
           <w:t>add</w:t>
         </w:r>
         <w:r>
           <w:rPr>
-            <w:rStyle w:val="Hyperlink"/>
+            <w:rStyle w:val="af3"/>
           </w:rPr>
           <w:t>1.</w:t>
         </w:r>
         <w:proofErr w:type="spellStart"/>
         <w:r>
           <w:rPr>
-            <w:rStyle w:val="Hyperlink"/>
+            <w:rStyle w:val="af3"/>
             <w:lang w:val="en-US"/>
           </w:rPr>
           <w:t>py</w:t>
@@ -2368,7 +2368,7 @@
     </w:p>
     <w:p>
       <w:pPr>
-        <w:pStyle w:val="Heading2"/>
+        <w:pStyle w:val="2"/>
         <w:jc w:val="center"/>
       </w:pPr>
       <w:bookmarkStart w:id="10" w:name="_Toc213000653"/>
@@ -2402,14 +2402,14 @@
       <w:hyperlink r:id="rId10" w:history="1">
         <w:r>
           <w:rPr>
-            <w:rStyle w:val="Hyperlink"/>
+            <w:rStyle w:val="af3"/>
           </w:rPr>
           <w:t>https://github.com/Miwm64/itmo_</w:t>
         </w:r>
         <w:proofErr w:type="spellStart"/>
         <w:r>
           <w:rPr>
-            <w:rStyle w:val="Hyperlink"/>
+            <w:rStyle w:val="af3"/>
             <w:lang w:val="en-US"/>
           </w:rPr>
           <w:t>cse</w:t>
@@ -2417,94 +2417,94 @@
         <w:proofErr w:type="spellEnd"/>
         <w:r>
           <w:rPr>
-            <w:rStyle w:val="Hyperlink"/>
+            <w:rStyle w:val="af3"/>
           </w:rPr>
           <w:t>/</w:t>
         </w:r>
         <w:proofErr w:type="spellStart"/>
         <w:r>
           <w:rPr>
-            <w:rStyle w:val="Hyperlink"/>
+            <w:rStyle w:val="af3"/>
           </w:rPr>
           <w:t>blob</w:t>
         </w:r>
         <w:proofErr w:type="spellEnd"/>
         <w:r>
           <w:rPr>
-            <w:rStyle w:val="Hyperlink"/>
+            <w:rStyle w:val="af3"/>
           </w:rPr>
           <w:t>/</w:t>
         </w:r>
         <w:proofErr w:type="spellStart"/>
         <w:r>
           <w:rPr>
-            <w:rStyle w:val="Hyperlink"/>
+            <w:rStyle w:val="af3"/>
           </w:rPr>
           <w:t>master</w:t>
         </w:r>
         <w:proofErr w:type="spellEnd"/>
         <w:r>
           <w:rPr>
-            <w:rStyle w:val="Hyperlink"/>
+            <w:rStyle w:val="af3"/>
           </w:rPr>
           <w:t>/</w:t>
         </w:r>
         <w:r>
           <w:rPr>
-            <w:rStyle w:val="Hyperlink"/>
+            <w:rStyle w:val="af3"/>
             <w:lang w:val="en-US"/>
           </w:rPr>
           <w:t>it</w:t>
         </w:r>
         <w:r>
           <w:rPr>
-            <w:rStyle w:val="Hyperlink"/>
+            <w:rStyle w:val="af3"/>
           </w:rPr>
           <w:t>/</w:t>
         </w:r>
         <w:r>
           <w:rPr>
-            <w:rStyle w:val="Hyperlink"/>
+            <w:rStyle w:val="af3"/>
             <w:lang w:val="en-US"/>
           </w:rPr>
           <w:t>lab</w:t>
         </w:r>
         <w:r>
           <w:rPr>
-            <w:rStyle w:val="Hyperlink"/>
+            <w:rStyle w:val="af3"/>
           </w:rPr>
           <w:t>4/</w:t>
         </w:r>
         <w:r>
           <w:rPr>
-            <w:rStyle w:val="Hyperlink"/>
+            <w:rStyle w:val="af3"/>
             <w:lang w:val="en-US"/>
           </w:rPr>
           <w:t>code</w:t>
         </w:r>
         <w:r>
           <w:rPr>
-            <w:rStyle w:val="Hyperlink"/>
+            <w:rStyle w:val="af3"/>
           </w:rPr>
           <w:t>/</w:t>
         </w:r>
         <w:r>
           <w:rPr>
-            <w:rStyle w:val="Hyperlink"/>
+            <w:rStyle w:val="af3"/>
             <w:lang w:val="en-US"/>
           </w:rPr>
           <w:t>add</w:t>
         </w:r>
         <w:r>
           <w:rPr>
-            <w:rStyle w:val="Hyperlink"/>
+            <w:rStyle w:val="af3"/>
           </w:rPr>
           <w:t>2.</w:t>
         </w:r>
         <w:proofErr w:type="spellStart"/>
         <w:r>
           <w:rPr>
-            <w:rStyle w:val="Hyperlink"/>
+            <w:rStyle w:val="af3"/>
             <w:lang w:val="en-US"/>
           </w:rPr>
           <w:t>py</w:t>
@@ -2563,7 +2563,7 @@
       <w:hyperlink r:id="rId11" w:history="1">
         <w:r>
           <w:rPr>
-            <w:rStyle w:val="Hyperlink"/>
+            <w:rStyle w:val="af3"/>
           </w:rPr>
           <w:t>https://pypi.org/project/python-hcl2/</w:t>
         </w:r>
@@ -2600,7 +2600,7 @@
       <w:hyperlink r:id="rId12" w:history="1">
         <w:r>
           <w:rPr>
-            <w:rStyle w:val="Hyperlink"/>
+            <w:rStyle w:val="af3"/>
           </w:rPr>
           <w:t>https://pypi.org/project/PyYAML/</w:t>
         </w:r>
@@ -2652,7 +2652,7 @@
     </w:p>
     <w:p>
       <w:pPr>
-        <w:pStyle w:val="ListParagraph"/>
+        <w:pStyle w:val="a7"/>
         <w:numPr>
           <w:ilvl w:val="0"/>
           <w:numId w:val="6"/>
@@ -2709,7 +2709,7 @@
     </w:p>
     <w:p>
       <w:pPr>
-        <w:pStyle w:val="ListParagraph"/>
+        <w:pStyle w:val="a7"/>
         <w:numPr>
           <w:ilvl w:val="0"/>
           <w:numId w:val="6"/>
@@ -2780,97 +2780,97 @@
       <w:hyperlink r:id="rId13" w:history="1">
         <w:r>
           <w:rPr>
-            <w:rStyle w:val="Hyperlink"/>
+            <w:rStyle w:val="af3"/>
           </w:rPr>
           <w:t>https://github.com/Miwm64/itmo_</w:t>
         </w:r>
         <w:r>
           <w:rPr>
-            <w:rStyle w:val="Hyperlink"/>
+            <w:rStyle w:val="af3"/>
             <w:lang w:val="en-US"/>
           </w:rPr>
           <w:t>cse</w:t>
         </w:r>
         <w:r>
           <w:rPr>
-            <w:rStyle w:val="Hyperlink"/>
+            <w:rStyle w:val="af3"/>
           </w:rPr>
           <w:t>/blob/master/</w:t>
         </w:r>
         <w:r>
           <w:rPr>
-            <w:rStyle w:val="Hyperlink"/>
+            <w:rStyle w:val="af3"/>
             <w:lang w:val="en-US"/>
           </w:rPr>
           <w:t>it</w:t>
         </w:r>
         <w:r>
           <w:rPr>
-            <w:rStyle w:val="Hyperlink"/>
+            <w:rStyle w:val="af3"/>
           </w:rPr>
           <w:t>/</w:t>
         </w:r>
         <w:r>
           <w:rPr>
-            <w:rStyle w:val="Hyperlink"/>
+            <w:rStyle w:val="af3"/>
             <w:lang w:val="en-US"/>
           </w:rPr>
           <w:t>lab</w:t>
         </w:r>
         <w:r>
           <w:rPr>
-            <w:rStyle w:val="Hyperlink"/>
+            <w:rStyle w:val="af3"/>
           </w:rPr>
           <w:t>4/</w:t>
         </w:r>
         <w:r>
           <w:rPr>
-            <w:rStyle w:val="Hyperlink"/>
+            <w:rStyle w:val="af3"/>
             <w:lang w:val="en-US"/>
           </w:rPr>
           <w:t>code</w:t>
         </w:r>
         <w:r>
           <w:rPr>
-            <w:rStyle w:val="Hyperlink"/>
+            <w:rStyle w:val="af3"/>
           </w:rPr>
           <w:t>/</w:t>
         </w:r>
         <w:r>
           <w:rPr>
-            <w:rStyle w:val="Hyperlink"/>
+            <w:rStyle w:val="af3"/>
             <w:lang w:val="en-US"/>
           </w:rPr>
           <w:t>output</w:t>
         </w:r>
         <w:r>
           <w:rPr>
-            <w:rStyle w:val="Hyperlink"/>
+            <w:rStyle w:val="af3"/>
           </w:rPr>
           <w:t>_</w:t>
         </w:r>
         <w:r>
           <w:rPr>
-            <w:rStyle w:val="Hyperlink"/>
+            <w:rStyle w:val="af3"/>
             <w:lang w:val="en-US"/>
           </w:rPr>
           <w:t>add</w:t>
         </w:r>
         <w:r>
           <w:rPr>
-            <w:rStyle w:val="Hyperlink"/>
+            <w:rStyle w:val="af3"/>
           </w:rPr>
           <w:t>1</w:t>
         </w:r>
         <w:r>
           <w:rPr>
-            <w:rStyle w:val="Hyperlink"/>
+            <w:rStyle w:val="af3"/>
           </w:rPr>
           <w:t>.</w:t>
         </w:r>
         <w:r>
           <w:rPr>
-            <w:rStyle w:val="Hyperlink"/>
+            <w:rStyle w:val="af3"/>
             <w:lang w:val="en-US"/>
           </w:rPr>
           <w:t>hcl</w:t>
@@ -2905,14 +2905,14 @@
       <w:hyperlink r:id="rId14" w:history="1">
         <w:r>
           <w:rPr>
-            <w:rStyle w:val="Hyperlink"/>
+            <w:rStyle w:val="af3"/>
           </w:rPr>
           <w:t>https://github.com/Miwm64/itmo_</w:t>
         </w:r>
         <w:proofErr w:type="spellStart"/>
         <w:r>
           <w:rPr>
-            <w:rStyle w:val="Hyperlink"/>
+            <w:rStyle w:val="af3"/>
             <w:lang w:val="en-US"/>
           </w:rPr>
           <w:t>cse</w:t>
@@ -2920,107 +2920,107 @@
         <w:proofErr w:type="spellEnd"/>
         <w:r>
           <w:rPr>
-            <w:rStyle w:val="Hyperlink"/>
+            <w:rStyle w:val="af3"/>
           </w:rPr>
           <w:t>/</w:t>
         </w:r>
         <w:proofErr w:type="spellStart"/>
         <w:r>
           <w:rPr>
-            <w:rStyle w:val="Hyperlink"/>
+            <w:rStyle w:val="af3"/>
           </w:rPr>
           <w:t>blob</w:t>
         </w:r>
         <w:proofErr w:type="spellEnd"/>
         <w:r>
           <w:rPr>
-            <w:rStyle w:val="Hyperlink"/>
+            <w:rStyle w:val="af3"/>
           </w:rPr>
           <w:t>/</w:t>
         </w:r>
         <w:proofErr w:type="spellStart"/>
         <w:r>
           <w:rPr>
-            <w:rStyle w:val="Hyperlink"/>
+            <w:rStyle w:val="af3"/>
           </w:rPr>
           <w:t>master</w:t>
         </w:r>
         <w:proofErr w:type="spellEnd"/>
         <w:r>
           <w:rPr>
-            <w:rStyle w:val="Hyperlink"/>
+            <w:rStyle w:val="af3"/>
           </w:rPr>
           <w:t>/</w:t>
         </w:r>
         <w:r>
           <w:rPr>
-            <w:rStyle w:val="Hyperlink"/>
+            <w:rStyle w:val="af3"/>
             <w:lang w:val="en-US"/>
           </w:rPr>
           <w:t>it</w:t>
         </w:r>
         <w:r>
           <w:rPr>
-            <w:rStyle w:val="Hyperlink"/>
+            <w:rStyle w:val="af3"/>
           </w:rPr>
           <w:t>/</w:t>
         </w:r>
         <w:r>
           <w:rPr>
-            <w:rStyle w:val="Hyperlink"/>
+            <w:rStyle w:val="af3"/>
             <w:lang w:val="en-US"/>
           </w:rPr>
           <w:t>lab</w:t>
         </w:r>
         <w:r>
           <w:rPr>
-            <w:rStyle w:val="Hyperlink"/>
+            <w:rStyle w:val="af3"/>
           </w:rPr>
           <w:t>4/</w:t>
         </w:r>
         <w:r>
           <w:rPr>
-            <w:rStyle w:val="Hyperlink"/>
+            <w:rStyle w:val="af3"/>
             <w:lang w:val="en-US"/>
           </w:rPr>
           <w:t>code</w:t>
         </w:r>
         <w:r>
           <w:rPr>
-            <w:rStyle w:val="Hyperlink"/>
+            <w:rStyle w:val="af3"/>
           </w:rPr>
           <w:t>/</w:t>
         </w:r>
         <w:r>
           <w:rPr>
-            <w:rStyle w:val="Hyperlink"/>
+            <w:rStyle w:val="af3"/>
             <w:lang w:val="en-US"/>
           </w:rPr>
           <w:t>output</w:t>
         </w:r>
         <w:r>
           <w:rPr>
-            <w:rStyle w:val="Hyperlink"/>
+            <w:rStyle w:val="af3"/>
           </w:rPr>
           <w:t>_</w:t>
         </w:r>
         <w:r>
           <w:rPr>
-            <w:rStyle w:val="Hyperlink"/>
+            <w:rStyle w:val="af3"/>
             <w:lang w:val="en-US"/>
           </w:rPr>
           <w:t>add</w:t>
         </w:r>
         <w:r>
           <w:rPr>
-            <w:rStyle w:val="Hyperlink"/>
+            <w:rStyle w:val="af3"/>
           </w:rPr>
           <w:t>2.</w:t>
         </w:r>
         <w:proofErr w:type="spellStart"/>
         <w:r>
           <w:rPr>
-            <w:rStyle w:val="Hyperlink"/>
+            <w:rStyle w:val="af3"/>
             <w:lang w:val="en-US"/>
           </w:rPr>
           <w:t>hcl</w:t>
@@ -3054,7 +3054,7 @@
     </w:p>
     <w:p>
       <w:pPr>
-        <w:pStyle w:val="Heading2"/>
+        <w:pStyle w:val="2"/>
         <w:jc w:val="center"/>
       </w:pPr>
       <w:bookmarkStart w:id="11" w:name="_Toc213000654"/>
@@ -3088,14 +3088,14 @@
       <w:hyperlink r:id="rId15" w:history="1">
         <w:r>
           <w:rPr>
-            <w:rStyle w:val="Hyperlink"/>
+            <w:rStyle w:val="af3"/>
           </w:rPr>
           <w:t>https://github.com/Miwm64/itmo_</w:t>
         </w:r>
         <w:proofErr w:type="spellStart"/>
         <w:r>
           <w:rPr>
-            <w:rStyle w:val="Hyperlink"/>
+            <w:rStyle w:val="af3"/>
             <w:lang w:val="en-US"/>
           </w:rPr>
           <w:t>cse</w:t>
@@ -3103,94 +3103,94 @@
         <w:proofErr w:type="spellEnd"/>
         <w:r>
           <w:rPr>
-            <w:rStyle w:val="Hyperlink"/>
+            <w:rStyle w:val="af3"/>
           </w:rPr>
           <w:t>/</w:t>
         </w:r>
         <w:proofErr w:type="spellStart"/>
         <w:r>
           <w:rPr>
-            <w:rStyle w:val="Hyperlink"/>
+            <w:rStyle w:val="af3"/>
           </w:rPr>
           <w:t>blob</w:t>
         </w:r>
         <w:proofErr w:type="spellEnd"/>
         <w:r>
           <w:rPr>
-            <w:rStyle w:val="Hyperlink"/>
+            <w:rStyle w:val="af3"/>
           </w:rPr>
           <w:t>/</w:t>
         </w:r>
         <w:proofErr w:type="spellStart"/>
         <w:r>
           <w:rPr>
-            <w:rStyle w:val="Hyperlink"/>
+            <w:rStyle w:val="af3"/>
           </w:rPr>
           <w:t>master</w:t>
         </w:r>
         <w:proofErr w:type="spellEnd"/>
         <w:r>
           <w:rPr>
-            <w:rStyle w:val="Hyperlink"/>
+            <w:rStyle w:val="af3"/>
           </w:rPr>
           <w:t>/</w:t>
         </w:r>
         <w:r>
           <w:rPr>
-            <w:rStyle w:val="Hyperlink"/>
+            <w:rStyle w:val="af3"/>
             <w:lang w:val="en-US"/>
           </w:rPr>
           <w:t>it</w:t>
         </w:r>
         <w:r>
           <w:rPr>
-            <w:rStyle w:val="Hyperlink"/>
+            <w:rStyle w:val="af3"/>
           </w:rPr>
           <w:t>/</w:t>
         </w:r>
         <w:r>
           <w:rPr>
-            <w:rStyle w:val="Hyperlink"/>
+            <w:rStyle w:val="af3"/>
             <w:lang w:val="en-US"/>
           </w:rPr>
           <w:t>lab</w:t>
         </w:r>
         <w:r>
           <w:rPr>
-            <w:rStyle w:val="Hyperlink"/>
+            <w:rStyle w:val="af3"/>
           </w:rPr>
           <w:t>4/</w:t>
         </w:r>
         <w:r>
           <w:rPr>
-            <w:rStyle w:val="Hyperlink"/>
+            <w:rStyle w:val="af3"/>
             <w:lang w:val="en-US"/>
           </w:rPr>
           <w:t>code</w:t>
         </w:r>
         <w:r>
           <w:rPr>
-            <w:rStyle w:val="Hyperlink"/>
+            <w:rStyle w:val="af3"/>
           </w:rPr>
           <w:t>/</w:t>
         </w:r>
         <w:r>
           <w:rPr>
-            <w:rStyle w:val="Hyperlink"/>
+            <w:rStyle w:val="af3"/>
             <w:lang w:val="en-US"/>
           </w:rPr>
           <w:t>add</w:t>
         </w:r>
         <w:r>
           <w:rPr>
-            <w:rStyle w:val="Hyperlink"/>
+            <w:rStyle w:val="af3"/>
           </w:rPr>
           <w:t>3.</w:t>
         </w:r>
         <w:proofErr w:type="spellStart"/>
         <w:r>
           <w:rPr>
-            <w:rStyle w:val="Hyperlink"/>
+            <w:rStyle w:val="af3"/>
             <w:lang w:val="en-US"/>
           </w:rPr>
           <w:t>py</w:t>
@@ -3326,7 +3326,7 @@
     </w:p>
     <w:p>
       <w:pPr>
-        <w:pStyle w:val="Heading1"/>
+        <w:pStyle w:val="1"/>
         <w:jc w:val="both"/>
         <w:rPr>
           <w:b/>
@@ -3337,16 +3337,10 @@
     <w:p/>
     <w:p/>
     <w:p/>
-    <w:p>
-      <w:pPr>
-        <w:rPr>
-          <w:lang w:val="en-US"/>
-        </w:rPr>
-      </w:pPr>
-    </w:p>
-    <w:p>
-      <w:pPr>
-        <w:pStyle w:val="Heading2"/>
+    <w:p/>
+    <w:p>
+      <w:pPr>
+        <w:pStyle w:val="2"/>
         <w:jc w:val="center"/>
       </w:pPr>
       <w:bookmarkStart w:id="12" w:name="_Toc213000655"/>
@@ -3380,88 +3374,114 @@
       <w:hyperlink r:id="rId16" w:history="1">
         <w:r>
           <w:rPr>
-            <w:rStyle w:val="Hyperlink"/>
+            <w:rStyle w:val="af3"/>
           </w:rPr>
           <w:t>https://github.com/Miwm64/itmo_</w:t>
         </w:r>
-        <w:r>
-          <w:rPr>
-            <w:rStyle w:val="Hyperlink"/>
+        <w:proofErr w:type="spellStart"/>
+        <w:r>
+          <w:rPr>
+            <w:rStyle w:val="af3"/>
             <w:lang w:val="en-US"/>
           </w:rPr>
           <w:t>cse</w:t>
         </w:r>
-        <w:r>
-          <w:rPr>
-            <w:rStyle w:val="Hyperlink"/>
-          </w:rPr>
-          <w:t>/blob/master/</w:t>
-        </w:r>
-        <w:r>
-          <w:rPr>
-            <w:rStyle w:val="Hyperlink"/>
+        <w:proofErr w:type="spellEnd"/>
+        <w:r>
+          <w:rPr>
+            <w:rStyle w:val="af3"/>
+          </w:rPr>
+          <w:t>/</w:t>
+        </w:r>
+        <w:proofErr w:type="spellStart"/>
+        <w:r>
+          <w:rPr>
+            <w:rStyle w:val="af3"/>
+          </w:rPr>
+          <w:t>blob</w:t>
+        </w:r>
+        <w:proofErr w:type="spellEnd"/>
+        <w:r>
+          <w:rPr>
+            <w:rStyle w:val="af3"/>
+          </w:rPr>
+          <w:t>/</w:t>
+        </w:r>
+        <w:proofErr w:type="spellStart"/>
+        <w:r>
+          <w:rPr>
+            <w:rStyle w:val="af3"/>
+          </w:rPr>
+          <w:t>master</w:t>
+        </w:r>
+        <w:proofErr w:type="spellEnd"/>
+        <w:r>
+          <w:rPr>
+            <w:rStyle w:val="af3"/>
+          </w:rPr>
+          <w:t>/</w:t>
+        </w:r>
+        <w:r>
+          <w:rPr>
+            <w:rStyle w:val="af3"/>
             <w:lang w:val="en-US"/>
           </w:rPr>
           <w:t>it</w:t>
         </w:r>
         <w:r>
           <w:rPr>
-            <w:rStyle w:val="Hyperlink"/>
+            <w:rStyle w:val="af3"/>
           </w:rPr>
           <w:t>/</w:t>
         </w:r>
         <w:r>
           <w:rPr>
-            <w:rStyle w:val="Hyperlink"/>
+            <w:rStyle w:val="af3"/>
             <w:lang w:val="en-US"/>
           </w:rPr>
           <w:t>lab</w:t>
         </w:r>
         <w:r>
           <w:rPr>
-            <w:rStyle w:val="Hyperlink"/>
+            <w:rStyle w:val="af3"/>
           </w:rPr>
           <w:t>4/</w:t>
         </w:r>
         <w:r>
           <w:rPr>
-            <w:rStyle w:val="Hyperlink"/>
+            <w:rStyle w:val="af3"/>
             <w:lang w:val="en-US"/>
           </w:rPr>
           <w:t>code</w:t>
         </w:r>
         <w:r>
           <w:rPr>
-            <w:rStyle w:val="Hyperlink"/>
+            <w:rStyle w:val="af3"/>
           </w:rPr>
           <w:t>/</w:t>
         </w:r>
         <w:r>
           <w:rPr>
-            <w:rStyle w:val="Hyperlink"/>
+            <w:rStyle w:val="af3"/>
             <w:lang w:val="en-US"/>
           </w:rPr>
           <w:t>add</w:t>
         </w:r>
         <w:r>
           <w:rPr>
-            <w:rStyle w:val="Hyperlink"/>
-          </w:rPr>
-          <w:t>4</w:t>
-        </w:r>
-        <w:r>
-          <w:rPr>
-            <w:rStyle w:val="Hyperlink"/>
-          </w:rPr>
-          <w:t>.</w:t>
-        </w:r>
-        <w:r>
-          <w:rPr>
-            <w:rStyle w:val="Hyperlink"/>
+            <w:rStyle w:val="af3"/>
+          </w:rPr>
+          <w:t>4.</w:t>
+        </w:r>
+        <w:proofErr w:type="spellStart"/>
+        <w:r>
+          <w:rPr>
+            <w:rStyle w:val="af3"/>
             <w:lang w:val="en-US"/>
           </w:rPr>
           <w:t>py</w:t>
         </w:r>
+        <w:proofErr w:type="spellEnd"/>
       </w:hyperlink>
       <w:r>
         <w:t xml:space="preserve">, дата обращения </w:t>
@@ -3475,6 +3495,7 @@
     </w:p>
     <w:p>
       <w:pPr>
+        <w:jc w:val="both"/>
         <w:rPr>
           <w:lang w:val="en-US"/>
         </w:rPr>
@@ -3491,7 +3512,7 @@
     </w:p>
     <w:tbl>
       <w:tblPr>
-        <w:tblStyle w:val="TableGrid"/>
+        <w:tblStyle w:val="af8"/>
         <w:tblW w:w="0" w:type="auto"/>
         <w:tblLook w:val="04A0" w:firstRow="1" w:lastRow="0" w:firstColumn="1" w:lastColumn="0" w:noHBand="0" w:noVBand="1"/>
       </w:tblPr>
@@ -3634,8 +3655,16 @@
               <w:rPr>
                 <w:lang w:val="en-US"/>
               </w:rPr>
-              <w:t xml:space="preserve"> -&gt; hcl</w:t>
-            </w:r>
+              <w:t xml:space="preserve"> -&gt; </w:t>
+            </w:r>
+            <w:proofErr w:type="spellStart"/>
+            <w:r>
+              <w:rPr>
+                <w:lang w:val="en-US"/>
+              </w:rPr>
+              <w:t>hcl</w:t>
+            </w:r>
+            <w:proofErr w:type="spellEnd"/>
           </w:p>
         </w:tc>
         <w:tc>
@@ -3666,6 +3695,9 @@
       </w:pPr>
     </w:p>
     <w:p>
+      <w:pPr>
+        <w:jc w:val="both"/>
+      </w:pPr>
       <w:r>
         <w:t>Преимущество в скорости моего алгоритма может быть объяснено несколькими путями</w:t>
       </w:r>
@@ -3677,13 +3709,24 @@
         <w:t xml:space="preserve">1. </w:t>
       </w:r>
       <w:r>
-        <w:t>Библиотеки обрабатывают все случаи описанные спецификацией</w:t>
+        <w:t xml:space="preserve">Библиотеки обрабатывают </w:t>
+      </w:r>
+      <w:proofErr w:type="gramStart"/>
+      <w:r>
+        <w:t>все случаи</w:t>
+      </w:r>
+      <w:proofErr w:type="gramEnd"/>
+      <w:r>
+        <w:t xml:space="preserve"> описанные спецификацией</w:t>
       </w:r>
       <w:r>
         <w:t>.</w:t>
       </w:r>
     </w:p>
     <w:p>
+      <w:pPr>
+        <w:jc w:val="both"/>
+      </w:pPr>
       <w:r>
         <w:t>2</w:t>
       </w:r>
@@ -3691,10 +3734,7 @@
         <w:t xml:space="preserve">. </w:t>
       </w:r>
       <w:r>
-        <w:t xml:space="preserve">Библиотеки </w:t>
-      </w:r>
-      <w:r>
-        <w:t>создают сложные деревья</w:t>
+        <w:t>Библиотеки создают сложные деревья</w:t>
       </w:r>
       <w:r>
         <w:t>,</w:t>
@@ -3723,8 +3763,9 @@
     </w:p>
     <w:p>
       <w:pPr>
-        <w:rPr>
-          <w:lang w:val="en-RU"/>
+        <w:jc w:val="both"/>
+        <w:rPr>
+          <w:lang/>
         </w:rPr>
       </w:pPr>
       <w:r>
@@ -3735,7 +3776,7 @@
       </w:r>
       <w:r>
         <w:rPr>
-          <w:lang w:val="en-RU"/>
+          <w:lang/>
         </w:rPr>
         <w:t xml:space="preserve">Библиотеки создают несколько промежуточных структур, что увеличивает расход памяти и время выполнения. </w:t>
       </w:r>
@@ -3744,7 +3785,7 @@
       </w:r>
       <w:r>
         <w:rPr>
-          <w:lang w:val="en-RU"/>
+          <w:lang/>
         </w:rPr>
         <w:t xml:space="preserve"> алгоритм сразу преобразует Python-структуры в HCL, минуя сложные объекты.</w:t>
       </w:r>
@@ -3752,7 +3793,7 @@
     <w:p>
       <w:pPr>
         <w:rPr>
-          <w:lang w:val="en-RU"/>
+          <w:lang/>
         </w:rPr>
       </w:pPr>
     </w:p>
@@ -3765,7 +3806,7 @@
     <w:p/>
     <w:p>
       <w:pPr>
-        <w:pStyle w:val="Heading1"/>
+        <w:pStyle w:val="1"/>
         <w:jc w:val="center"/>
         <w:rPr>
           <w:b/>
@@ -3796,6 +3837,72 @@
       </w:r>
       <w:r>
         <w:t xml:space="preserve"> </w:t>
+      </w:r>
+      <w:r>
+        <w:t>разобрался в разных форматах обмена информации</w:t>
+      </w:r>
+      <w:r>
+        <w:t xml:space="preserve">, </w:t>
+      </w:r>
+      <w:r>
+        <w:t>таких как</w:t>
+      </w:r>
+      <w:r>
+        <w:t xml:space="preserve"> </w:t>
+      </w:r>
+      <w:proofErr w:type="spellStart"/>
+      <w:r>
+        <w:rPr>
+          <w:lang w:val="en-US"/>
+        </w:rPr>
+        <w:t>yaml</w:t>
+      </w:r>
+      <w:proofErr w:type="spellEnd"/>
+      <w:r>
+        <w:t xml:space="preserve">, </w:t>
+      </w:r>
+      <w:proofErr w:type="spellStart"/>
+      <w:r>
+        <w:rPr>
+          <w:lang w:val="en-US"/>
+        </w:rPr>
+        <w:t>hcl</w:t>
+      </w:r>
+      <w:proofErr w:type="spellEnd"/>
+      <w:r>
+        <w:t xml:space="preserve">, </w:t>
+      </w:r>
+      <w:r>
+        <w:rPr>
+          <w:lang w:val="en-US"/>
+        </w:rPr>
+        <w:t>xml</w:t>
+      </w:r>
+      <w:r>
+        <w:t xml:space="preserve"> и других</w:t>
+      </w:r>
+      <w:r>
+        <w:t xml:space="preserve">, </w:t>
+      </w:r>
+      <w:r>
+        <w:t>а также</w:t>
+      </w:r>
+      <w:r>
+        <w:t xml:space="preserve"> </w:t>
+      </w:r>
+      <w:r>
+        <w:t xml:space="preserve">разобрался в основах формальных грамматик и создал программы совершающие сериализацию и </w:t>
+      </w:r>
+      <w:proofErr w:type="spellStart"/>
+      <w:r>
+        <w:t>десериализацию</w:t>
+      </w:r>
+      <w:proofErr w:type="spellEnd"/>
+      <w:r>
+        <w:t xml:space="preserve"> разных форматов</w:t>
+      </w:r>
+      <w:r>
+        <w:t>.</w:t>
       </w:r>
     </w:p>
     <w:p/>
@@ -3811,14 +3918,24 @@
     <w:p/>
     <w:p/>
     <w:p/>
+    <w:p>
+      <w:pPr>
+        <w:rPr>
+          <w:lang w:val="en-US"/>
+        </w:rPr>
+      </w:pPr>
+    </w:p>
+    <w:p>
+      <w:pPr>
+        <w:rPr>
+          <w:lang w:val="en-US"/>
+        </w:rPr>
+      </w:pPr>
+    </w:p>
     <w:p/>
-    <w:p/>
-    <w:p/>
-    <w:p/>
-    <w:p/>
-    <w:p>
-      <w:pPr>
-        <w:pStyle w:val="Heading1"/>
+    <w:p>
+      <w:pPr>
+        <w:pStyle w:val="1"/>
         <w:tabs>
           <w:tab w:val="left" w:pos="2140"/>
           <w:tab w:val="center" w:pos="4677"/>
@@ -3874,9 +3991,21 @@
       <w:hyperlink r:id="rId17" w:history="1">
         <w:r>
           <w:rPr>
-            <w:rStyle w:val="Hyperlink"/>
-          </w:rPr>
-          <w:t>https://books.ifmo.ru/book/2248/informatika:_laboratornye_raboty_i_testy:_uchebno-metodicheskoe_posobie_/_recenzent:_polyakov_v.i..htm</w:t>
+            <w:rStyle w:val="af3"/>
+          </w:rPr>
+          <w:t>https://books.ifmo.ru/book/2248/informatika:_laboratornye_raboty_i_testy:_uchebno-metodicheskoe_posobie_/_recenzent:_</w:t>
+        </w:r>
+        <w:r>
+          <w:rPr>
+            <w:rStyle w:val="af3"/>
+          </w:rPr>
+          <w:t>p</w:t>
+        </w:r>
+        <w:r>
+          <w:rPr>
+            <w:rStyle w:val="af3"/>
+          </w:rPr>
+          <w:t>olyakov_v.i..htm</w:t>
         </w:r>
       </w:hyperlink>
       <w:r>
@@ -3892,29 +4021,43 @@
         <w:jc w:val="both"/>
       </w:pPr>
       <w:r>
-        <w:t xml:space="preserve">Грошев А.С. Г89 Информатика: Учебник для вузов / А.С. Грошев. – Архангельск, </w:t>
+        <w:t xml:space="preserve">Лямин А.В., </w:t>
       </w:r>
       <w:proofErr w:type="spellStart"/>
       <w:r>
-        <w:t>Арханг</w:t>
+        <w:t>Череповская</w:t>
       </w:r>
       <w:proofErr w:type="spellEnd"/>
       <w:r>
-        <w:t xml:space="preserve">. гос. техн. ун-т, 2010. -470с. -Режим доступа </w:t>
-      </w:r>
-      <w:hyperlink r:id="rId18" w:history="1">
-        <w:r>
-          <w:rPr>
-            <w:rStyle w:val="Hyperlink"/>
-          </w:rPr>
-          <w:t>https://narfu.ru/university/library/books/0690.pdf</w:t>
+        <w:t xml:space="preserve"> Е.Н. Объектно-ориентированное программирование. Компьютерный практикум</w:t>
+      </w:r>
+      <w:r>
+        <w:t xml:space="preserve"> </w:t>
+      </w:r>
+      <w:r>
+        <w:t xml:space="preserve">– СПб: Университет ИТМО, 2017. – 143 с. – Режим доступа: </w:t>
+      </w:r>
+      <w:hyperlink r:id="rId18" w:tgtFrame="_new" w:history="1">
+        <w:r>
+          <w:rPr>
+            <w:rStyle w:val="af3"/>
+          </w:rPr>
+          <w:t>https://books.ifmo.ru/file</w:t>
+        </w:r>
+        <w:r>
+          <w:rPr>
+            <w:rStyle w:val="af3"/>
+          </w:rPr>
+          <w:t>/</w:t>
+        </w:r>
+        <w:r>
+          <w:rPr>
+            <w:rStyle w:val="af3"/>
+          </w:rPr>
+          <w:t>pdf/2256.pdf</w:t>
         </w:r>
       </w:hyperlink>
-      <w:r>
-        <w:t xml:space="preserve"> </w:t>
-      </w:r>
-    </w:p>
-    <w:p/>
+    </w:p>
     <w:p/>
     <w:sectPr>
       <w:footerReference w:type="default" r:id="rId19"/>
@@ -3929,7 +4072,7 @@
 </file>
 
 <file path=word/endnotes.xml><?xml version="1.0" encoding="utf-8"?>
-<w:endnotes xmlns:wpc="http://schemas.microsoft.com/office/word/2010/wordprocessingCanvas" xmlns:cx="http://schemas.microsoft.com/office/drawing/2014/chartex" xmlns:cx1="http://schemas.microsoft.com/office/drawing/2015/9/8/chartex" xmlns:cx2="http://schemas.microsoft.com/office/drawing/2015/10/21/chartex" xmlns:cx3="http://schemas.microsoft.com/office/drawing/2016/5/9/chartex" xmlns:cx4="http://schemas.microsoft.com/office/drawing/2016/5/10/chartex" xmlns:cx5="http://schemas.microsoft.com/office/drawing/2016/5/11/chartex" xmlns:cx6="http://schemas.microsoft.com/office/drawing/2016/5/12/chartex" xmlns:cx7="http://schemas.microsoft.com/office/drawing/2016/5/13/chartex" xmlns:cx8="http://schemas.microsoft.com/office/drawing/2016/5/14/chartex" xmlns:mc="http://schemas.openxmlformats.org/markup-compatibility/2006" xmlns:aink="http://schemas.microsoft.com/office/drawing/2016/ink" xmlns:am3d="http://schemas.microsoft.com/office/drawing/2017/model3d" xmlns:o="urn:schemas-microsoft-com:office:office" xmlns:oel="http://schemas.microsoft.com/office/2019/extlst" xmlns:r="http://schemas.openxmlformats.org/officeDocument/2006/relationships" xmlns:m="http://schemas.openxmlformats.org/officeDocument/2006/math" xmlns:v="urn:schemas-microsoft-com:vml" xmlns:wp14="http://schemas.microsoft.com/office/word/2010/wordprocessingDrawing" xmlns:wp="http://schemas.openxmlformats.org/drawingml/2006/wordprocessingDrawing" xmlns:w10="urn:schemas-microsoft-com:office:word" xmlns:w="http://schemas.openxmlformats.org/wordprocessingml/2006/main" xmlns:w14="http://schemas.microsoft.com/office/word/2010/wordml" xmlns:w15="http://schemas.microsoft.com/office/word/2012/wordml" xmlns:w16cex="http://schemas.microsoft.com/office/word/2018/wordml/cex" xmlns:w16cid="http://schemas.microsoft.com/office/word/2016/wordml/cid" xmlns:w16="http://schemas.microsoft.com/office/word/2018/wordml" xmlns:w16du="http://schemas.microsoft.com/office/word/2023/wordml/word16du" xmlns:w16sdtdh="http://schemas.microsoft.com/office/word/2020/wordml/sdtdatahash" xmlns:w16sdtfl="http://schemas.microsoft.com/office/word/2024/wordml/sdtformatlock" xmlns:w16se="http://schemas.microsoft.com/office/word/2015/wordml/symex" xmlns:wpg="http://schemas.microsoft.com/office/word/2010/wordprocessingGroup" xmlns:wpi="http://schemas.microsoft.com/office/word/2010/wordprocessingInk" xmlns:wne="http://schemas.microsoft.com/office/word/2006/wordml" xmlns:wps="http://schemas.microsoft.com/office/word/2010/wordprocessingShape" mc:Ignorable="w14 w15 w16se w16cid w16 w16cex w16sdtdh w16sdtfl w16du wp14">
+<w:endnotes xmlns:wpc="http://schemas.microsoft.com/office/word/2010/wordprocessingCanvas" xmlns:cx="http://schemas.microsoft.com/office/drawing/2014/chartex" xmlns:cx1="http://schemas.microsoft.com/office/drawing/2015/9/8/chartex" xmlns:cx2="http://schemas.microsoft.com/office/drawing/2015/10/21/chartex" xmlns:cx3="http://schemas.microsoft.com/office/drawing/2016/5/9/chartex" xmlns:cx4="http://schemas.microsoft.com/office/drawing/2016/5/10/chartex" xmlns:cx5="http://schemas.microsoft.com/office/drawing/2016/5/11/chartex" xmlns:cx6="http://schemas.microsoft.com/office/drawing/2016/5/12/chartex" xmlns:cx7="http://schemas.microsoft.com/office/drawing/2016/5/13/chartex" xmlns:cx8="http://schemas.microsoft.com/office/drawing/2016/5/14/chartex" xmlns:mc="http://schemas.openxmlformats.org/markup-compatibility/2006" xmlns:aink="http://schemas.microsoft.com/office/drawing/2016/ink" xmlns:am3d="http://schemas.microsoft.com/office/drawing/2017/model3d" xmlns:o="urn:schemas-microsoft-com:office:office" xmlns:oel="http://schemas.microsoft.com/office/2019/extlst" xmlns:r="http://schemas.openxmlformats.org/officeDocument/2006/relationships" xmlns:m="http://schemas.openxmlformats.org/officeDocument/2006/math" xmlns:v="urn:schemas-microsoft-com:vml" xmlns:wp14="http://schemas.microsoft.com/office/word/2010/wordprocessingDrawing" xmlns:wp="http://schemas.openxmlformats.org/drawingml/2006/wordprocessingDrawing" xmlns:w10="urn:schemas-microsoft-com:office:word" xmlns:w="http://schemas.openxmlformats.org/wordprocessingml/2006/main" xmlns:w14="http://schemas.microsoft.com/office/word/2010/wordml" xmlns:w15="http://schemas.microsoft.com/office/word/2012/wordml" xmlns:w16cex="http://schemas.microsoft.com/office/word/2018/wordml/cex" xmlns:w16cid="http://schemas.microsoft.com/office/word/2016/wordml/cid" xmlns:w16="http://schemas.microsoft.com/office/word/2018/wordml" xmlns:w16sdtdh="http://schemas.microsoft.com/office/word/2020/wordml/sdtdatahash" xmlns:w16se="http://schemas.microsoft.com/office/word/2015/wordml/symex" xmlns:wpg="http://schemas.microsoft.com/office/word/2010/wordprocessingGroup" xmlns:wpi="http://schemas.microsoft.com/office/word/2010/wordprocessingInk" xmlns:wne="http://schemas.microsoft.com/office/word/2006/wordml" xmlns:wps="http://schemas.microsoft.com/office/word/2010/wordprocessingShape" mc:Ignorable="w14 w15 w16se w16cid w16 w16cex w16sdtdh wp14">
   <w:endnote w:type="separator" w:id="-1">
     <w:p>
       <w:pPr>
@@ -3954,7 +4097,7 @@
 </file>
 
 <file path=word/footer1.xml><?xml version="1.0" encoding="utf-8"?>
-<w:ftr xmlns:wpc="http://schemas.microsoft.com/office/word/2010/wordprocessingCanvas" xmlns:cx="http://schemas.microsoft.com/office/drawing/2014/chartex" xmlns:cx1="http://schemas.microsoft.com/office/drawing/2015/9/8/chartex" xmlns:cx2="http://schemas.microsoft.com/office/drawing/2015/10/21/chartex" xmlns:cx3="http://schemas.microsoft.com/office/drawing/2016/5/9/chartex" xmlns:cx4="http://schemas.microsoft.com/office/drawing/2016/5/10/chartex" xmlns:cx5="http://schemas.microsoft.com/office/drawing/2016/5/11/chartex" xmlns:cx6="http://schemas.microsoft.com/office/drawing/2016/5/12/chartex" xmlns:cx7="http://schemas.microsoft.com/office/drawing/2016/5/13/chartex" xmlns:cx8="http://schemas.microsoft.com/office/drawing/2016/5/14/chartex" xmlns:mc="http://schemas.openxmlformats.org/markup-compatibility/2006" xmlns:aink="http://schemas.microsoft.com/office/drawing/2016/ink" xmlns:am3d="http://schemas.microsoft.com/office/drawing/2017/model3d" xmlns:o="urn:schemas-microsoft-com:office:office" xmlns:oel="http://schemas.microsoft.com/office/2019/extlst" xmlns:r="http://schemas.openxmlformats.org/officeDocument/2006/relationships" xmlns:m="http://schemas.openxmlformats.org/officeDocument/2006/math" xmlns:v="urn:schemas-microsoft-com:vml" xmlns:wp14="http://schemas.microsoft.com/office/word/2010/wordprocessingDrawing" xmlns:wp="http://schemas.openxmlformats.org/drawingml/2006/wordprocessingDrawing" xmlns:w10="urn:schemas-microsoft-com:office:word" xmlns:w="http://schemas.openxmlformats.org/wordprocessingml/2006/main" xmlns:w14="http://schemas.microsoft.com/office/word/2010/wordml" xmlns:w15="http://schemas.microsoft.com/office/word/2012/wordml" xmlns:w16cex="http://schemas.microsoft.com/office/word/2018/wordml/cex" xmlns:w16cid="http://schemas.microsoft.com/office/word/2016/wordml/cid" xmlns:w16="http://schemas.microsoft.com/office/word/2018/wordml" xmlns:w16du="http://schemas.microsoft.com/office/word/2023/wordml/word16du" xmlns:w16sdtdh="http://schemas.microsoft.com/office/word/2020/wordml/sdtdatahash" xmlns:w16sdtfl="http://schemas.microsoft.com/office/word/2024/wordml/sdtformatlock" xmlns:w16se="http://schemas.microsoft.com/office/word/2015/wordml/symex" xmlns:wpg="http://schemas.microsoft.com/office/word/2010/wordprocessingGroup" xmlns:wpi="http://schemas.microsoft.com/office/word/2010/wordprocessingInk" xmlns:wne="http://schemas.microsoft.com/office/word/2006/wordml" xmlns:wps="http://schemas.microsoft.com/office/word/2010/wordprocessingShape" mc:Ignorable="w14 w15 w16se w16cid w16 w16cex w16sdtdh w16sdtfl w16du wp14">
+<w:ftr xmlns:wpc="http://schemas.microsoft.com/office/word/2010/wordprocessingCanvas" xmlns:cx="http://schemas.microsoft.com/office/drawing/2014/chartex" xmlns:cx1="http://schemas.microsoft.com/office/drawing/2015/9/8/chartex" xmlns:cx2="http://schemas.microsoft.com/office/drawing/2015/10/21/chartex" xmlns:cx3="http://schemas.microsoft.com/office/drawing/2016/5/9/chartex" xmlns:cx4="http://schemas.microsoft.com/office/drawing/2016/5/10/chartex" xmlns:cx5="http://schemas.microsoft.com/office/drawing/2016/5/11/chartex" xmlns:cx6="http://schemas.microsoft.com/office/drawing/2016/5/12/chartex" xmlns:cx7="http://schemas.microsoft.com/office/drawing/2016/5/13/chartex" xmlns:cx8="http://schemas.microsoft.com/office/drawing/2016/5/14/chartex" xmlns:mc="http://schemas.openxmlformats.org/markup-compatibility/2006" xmlns:aink="http://schemas.microsoft.com/office/drawing/2016/ink" xmlns:am3d="http://schemas.microsoft.com/office/drawing/2017/model3d" xmlns:o="urn:schemas-microsoft-com:office:office" xmlns:oel="http://schemas.microsoft.com/office/2019/extlst" xmlns:r="http://schemas.openxmlformats.org/officeDocument/2006/relationships" xmlns:m="http://schemas.openxmlformats.org/officeDocument/2006/math" xmlns:v="urn:schemas-microsoft-com:vml" xmlns:wp14="http://schemas.microsoft.com/office/word/2010/wordprocessingDrawing" xmlns:wp="http://schemas.openxmlformats.org/drawingml/2006/wordprocessingDrawing" xmlns:w10="urn:schemas-microsoft-com:office:word" xmlns:w="http://schemas.openxmlformats.org/wordprocessingml/2006/main" xmlns:w14="http://schemas.microsoft.com/office/word/2010/wordml" xmlns:w15="http://schemas.microsoft.com/office/word/2012/wordml" xmlns:w16cex="http://schemas.microsoft.com/office/word/2018/wordml/cex" xmlns:w16cid="http://schemas.microsoft.com/office/word/2016/wordml/cid" xmlns:w16="http://schemas.microsoft.com/office/word/2018/wordml" xmlns:w16sdtdh="http://schemas.microsoft.com/office/word/2020/wordml/sdtdatahash" xmlns:w16se="http://schemas.microsoft.com/office/word/2015/wordml/symex" xmlns:wpg="http://schemas.microsoft.com/office/word/2010/wordprocessingGroup" xmlns:wpi="http://schemas.microsoft.com/office/word/2010/wordprocessingInk" xmlns:wne="http://schemas.microsoft.com/office/word/2006/wordml" xmlns:wps="http://schemas.microsoft.com/office/word/2010/wordprocessingShape" mc:Ignorable="w14 w15 w16se w16cid w16 w16cex w16sdtdh wp14">
   <w:sdt>
     <w:sdtPr>
       <w:id w:val="788556981"/>
@@ -3966,7 +4109,7 @@
     <w:sdtContent>
       <w:p>
         <w:pPr>
-          <w:pStyle w:val="Footer"/>
+          <w:pStyle w:val="ae"/>
           <w:jc w:val="center"/>
         </w:pPr>
         <w:r>
@@ -3991,7 +4134,7 @@
 </file>
 
 <file path=word/footnotes.xml><?xml version="1.0" encoding="utf-8"?>
-<w:footnotes xmlns:wpc="http://schemas.microsoft.com/office/word/2010/wordprocessingCanvas" xmlns:cx="http://schemas.microsoft.com/office/drawing/2014/chartex" xmlns:cx1="http://schemas.microsoft.com/office/drawing/2015/9/8/chartex" xmlns:cx2="http://schemas.microsoft.com/office/drawing/2015/10/21/chartex" xmlns:cx3="http://schemas.microsoft.com/office/drawing/2016/5/9/chartex" xmlns:cx4="http://schemas.microsoft.com/office/drawing/2016/5/10/chartex" xmlns:cx5="http://schemas.microsoft.com/office/drawing/2016/5/11/chartex" xmlns:cx6="http://schemas.microsoft.com/office/drawing/2016/5/12/chartex" xmlns:cx7="http://schemas.microsoft.com/office/drawing/2016/5/13/chartex" xmlns:cx8="http://schemas.microsoft.com/office/drawing/2016/5/14/chartex" xmlns:mc="http://schemas.openxmlformats.org/markup-compatibility/2006" xmlns:aink="http://schemas.microsoft.com/office/drawing/2016/ink" xmlns:am3d="http://schemas.microsoft.com/office/drawing/2017/model3d" xmlns:o="urn:schemas-microsoft-com:office:office" xmlns:oel="http://schemas.microsoft.com/office/2019/extlst" xmlns:r="http://schemas.openxmlformats.org/officeDocument/2006/relationships" xmlns:m="http://schemas.openxmlformats.org/officeDocument/2006/math" xmlns:v="urn:schemas-microsoft-com:vml" xmlns:wp14="http://schemas.microsoft.com/office/word/2010/wordprocessingDrawing" xmlns:wp="http://schemas.openxmlformats.org/drawingml/2006/wordprocessingDrawing" xmlns:w10="urn:schemas-microsoft-com:office:word" xmlns:w="http://schemas.openxmlformats.org/wordprocessingml/2006/main" xmlns:w14="http://schemas.microsoft.com/office/word/2010/wordml" xmlns:w15="http://schemas.microsoft.com/office/word/2012/wordml" xmlns:w16cex="http://schemas.microsoft.com/office/word/2018/wordml/cex" xmlns:w16cid="http://schemas.microsoft.com/office/word/2016/wordml/cid" xmlns:w16="http://schemas.microsoft.com/office/word/2018/wordml" xmlns:w16du="http://schemas.microsoft.com/office/word/2023/wordml/word16du" xmlns:w16sdtdh="http://schemas.microsoft.com/office/word/2020/wordml/sdtdatahash" xmlns:w16sdtfl="http://schemas.microsoft.com/office/word/2024/wordml/sdtformatlock" xmlns:w16se="http://schemas.microsoft.com/office/word/2015/wordml/symex" xmlns:wpg="http://schemas.microsoft.com/office/word/2010/wordprocessingGroup" xmlns:wpi="http://schemas.microsoft.com/office/word/2010/wordprocessingInk" xmlns:wne="http://schemas.microsoft.com/office/word/2006/wordml" xmlns:wps="http://schemas.microsoft.com/office/word/2010/wordprocessingShape" mc:Ignorable="w14 w15 w16se w16cid w16 w16cex w16sdtdh w16sdtfl w16du wp14">
+<w:footnotes xmlns:wpc="http://schemas.microsoft.com/office/word/2010/wordprocessingCanvas" xmlns:cx="http://schemas.microsoft.com/office/drawing/2014/chartex" xmlns:cx1="http://schemas.microsoft.com/office/drawing/2015/9/8/chartex" xmlns:cx2="http://schemas.microsoft.com/office/drawing/2015/10/21/chartex" xmlns:cx3="http://schemas.microsoft.com/office/drawing/2016/5/9/chartex" xmlns:cx4="http://schemas.microsoft.com/office/drawing/2016/5/10/chartex" xmlns:cx5="http://schemas.microsoft.com/office/drawing/2016/5/11/chartex" xmlns:cx6="http://schemas.microsoft.com/office/drawing/2016/5/12/chartex" xmlns:cx7="http://schemas.microsoft.com/office/drawing/2016/5/13/chartex" xmlns:cx8="http://schemas.microsoft.com/office/drawing/2016/5/14/chartex" xmlns:mc="http://schemas.openxmlformats.org/markup-compatibility/2006" xmlns:aink="http://schemas.microsoft.com/office/drawing/2016/ink" xmlns:am3d="http://schemas.microsoft.com/office/drawing/2017/model3d" xmlns:o="urn:schemas-microsoft-com:office:office" xmlns:oel="http://schemas.microsoft.com/office/2019/extlst" xmlns:r="http://schemas.openxmlformats.org/officeDocument/2006/relationships" xmlns:m="http://schemas.openxmlformats.org/officeDocument/2006/math" xmlns:v="urn:schemas-microsoft-com:vml" xmlns:wp14="http://schemas.microsoft.com/office/word/2010/wordprocessingDrawing" xmlns:wp="http://schemas.openxmlformats.org/drawingml/2006/wordprocessingDrawing" xmlns:w10="urn:schemas-microsoft-com:office:word" xmlns:w="http://schemas.openxmlformats.org/wordprocessingml/2006/main" xmlns:w14="http://schemas.microsoft.com/office/word/2010/wordml" xmlns:w15="http://schemas.microsoft.com/office/word/2012/wordml" xmlns:w16cex="http://schemas.microsoft.com/office/word/2018/wordml/cex" xmlns:w16cid="http://schemas.microsoft.com/office/word/2016/wordml/cid" xmlns:w16="http://schemas.microsoft.com/office/word/2018/wordml" xmlns:w16sdtdh="http://schemas.microsoft.com/office/word/2020/wordml/sdtdatahash" xmlns:w16se="http://schemas.microsoft.com/office/word/2015/wordml/symex" xmlns:wpg="http://schemas.microsoft.com/office/word/2010/wordprocessingGroup" xmlns:wpi="http://schemas.microsoft.com/office/word/2010/wordprocessingInk" xmlns:wne="http://schemas.microsoft.com/office/word/2006/wordml" xmlns:wps="http://schemas.microsoft.com/office/word/2010/wordprocessingShape" mc:Ignorable="w14 w15 w16se w16cid w16 w16cex w16sdtdh wp14">
   <w:footnote w:type="separator" w:id="-1">
     <w:p>
       <w:pPr>
@@ -4016,7 +4159,7 @@
 </file>
 
 <file path=word/numbering.xml><?xml version="1.0" encoding="utf-8"?>
-<w:numbering xmlns:wpc="http://schemas.microsoft.com/office/word/2010/wordprocessingCanvas" xmlns:cx="http://schemas.microsoft.com/office/drawing/2014/chartex" xmlns:cx1="http://schemas.microsoft.com/office/drawing/2015/9/8/chartex" xmlns:cx2="http://schemas.microsoft.com/office/drawing/2015/10/21/chartex" xmlns:cx3="http://schemas.microsoft.com/office/drawing/2016/5/9/chartex" xmlns:cx4="http://schemas.microsoft.com/office/drawing/2016/5/10/chartex" xmlns:cx5="http://schemas.microsoft.com/office/drawing/2016/5/11/chartex" xmlns:cx6="http://schemas.microsoft.com/office/drawing/2016/5/12/chartex" xmlns:cx7="http://schemas.microsoft.com/office/drawing/2016/5/13/chartex" xmlns:cx8="http://schemas.microsoft.com/office/drawing/2016/5/14/chartex" xmlns:mc="http://schemas.openxmlformats.org/markup-compatibility/2006" xmlns:aink="http://schemas.microsoft.com/office/drawing/2016/ink" xmlns:am3d="http://schemas.microsoft.com/office/drawing/2017/model3d" xmlns:o="urn:schemas-microsoft-com:office:office" xmlns:oel="http://schemas.microsoft.com/office/2019/extlst" xmlns:r="http://schemas.openxmlformats.org/officeDocument/2006/relationships" xmlns:m="http://schemas.openxmlformats.org/officeDocument/2006/math" xmlns:v="urn:schemas-microsoft-com:vml" xmlns:wp14="http://schemas.microsoft.com/office/word/2010/wordprocessingDrawing" xmlns:wp="http://schemas.openxmlformats.org/drawingml/2006/wordprocessingDrawing" xmlns:w10="urn:schemas-microsoft-com:office:word" xmlns:w="http://schemas.openxmlformats.org/wordprocessingml/2006/main" xmlns:w14="http://schemas.microsoft.com/office/word/2010/wordml" xmlns:w15="http://schemas.microsoft.com/office/word/2012/wordml" xmlns:w16cex="http://schemas.microsoft.com/office/word/2018/wordml/cex" xmlns:w16cid="http://schemas.microsoft.com/office/word/2016/wordml/cid" xmlns:w16="http://schemas.microsoft.com/office/word/2018/wordml" xmlns:w16du="http://schemas.microsoft.com/office/word/2023/wordml/word16du" xmlns:w16sdtdh="http://schemas.microsoft.com/office/word/2020/wordml/sdtdatahash" xmlns:w16sdtfl="http://schemas.microsoft.com/office/word/2024/wordml/sdtformatlock" xmlns:w16se="http://schemas.microsoft.com/office/word/2015/wordml/symex" xmlns:wpg="http://schemas.microsoft.com/office/word/2010/wordprocessingGroup" xmlns:wpi="http://schemas.microsoft.com/office/word/2010/wordprocessingInk" xmlns:wne="http://schemas.microsoft.com/office/word/2006/wordml" xmlns:wps="http://schemas.microsoft.com/office/word/2010/wordprocessingShape" mc:Ignorable="w14 w15 w16se w16cid w16 w16cex w16sdtdh w16sdtfl w16du wp14">
+<w:numbering xmlns:wpc="http://schemas.microsoft.com/office/word/2010/wordprocessingCanvas" xmlns:cx="http://schemas.microsoft.com/office/drawing/2014/chartex" xmlns:cx1="http://schemas.microsoft.com/office/drawing/2015/9/8/chartex" xmlns:cx2="http://schemas.microsoft.com/office/drawing/2015/10/21/chartex" xmlns:cx3="http://schemas.microsoft.com/office/drawing/2016/5/9/chartex" xmlns:cx4="http://schemas.microsoft.com/office/drawing/2016/5/10/chartex" xmlns:cx5="http://schemas.microsoft.com/office/drawing/2016/5/11/chartex" xmlns:cx6="http://schemas.microsoft.com/office/drawing/2016/5/12/chartex" xmlns:cx7="http://schemas.microsoft.com/office/drawing/2016/5/13/chartex" xmlns:cx8="http://schemas.microsoft.com/office/drawing/2016/5/14/chartex" xmlns:mc="http://schemas.openxmlformats.org/markup-compatibility/2006" xmlns:aink="http://schemas.microsoft.com/office/drawing/2016/ink" xmlns:am3d="http://schemas.microsoft.com/office/drawing/2017/model3d" xmlns:o="urn:schemas-microsoft-com:office:office" xmlns:oel="http://schemas.microsoft.com/office/2019/extlst" xmlns:r="http://schemas.openxmlformats.org/officeDocument/2006/relationships" xmlns:m="http://schemas.openxmlformats.org/officeDocument/2006/math" xmlns:v="urn:schemas-microsoft-com:vml" xmlns:wp14="http://schemas.microsoft.com/office/word/2010/wordprocessingDrawing" xmlns:wp="http://schemas.openxmlformats.org/drawingml/2006/wordprocessingDrawing" xmlns:w10="urn:schemas-microsoft-com:office:word" xmlns:w="http://schemas.openxmlformats.org/wordprocessingml/2006/main" xmlns:w14="http://schemas.microsoft.com/office/word/2010/wordml" xmlns:w15="http://schemas.microsoft.com/office/word/2012/wordml" xmlns:w16cex="http://schemas.microsoft.com/office/word/2018/wordml/cex" xmlns:w16cid="http://schemas.microsoft.com/office/word/2016/wordml/cid" xmlns:w16="http://schemas.microsoft.com/office/word/2018/wordml" xmlns:w16sdtdh="http://schemas.microsoft.com/office/word/2020/wordml/sdtdatahash" xmlns:w16se="http://schemas.microsoft.com/office/word/2015/wordml/symex" xmlns:wpg="http://schemas.microsoft.com/office/word/2010/wordprocessingGroup" xmlns:wpi="http://schemas.microsoft.com/office/word/2010/wordprocessingInk" xmlns:wne="http://schemas.microsoft.com/office/word/2006/wordml" xmlns:wps="http://schemas.microsoft.com/office/word/2010/wordprocessingShape" mc:Ignorable="w14 w15 w16se w16cid w16 w16cex w16sdtdh wp14">
   <w:abstractNum w:abstractNumId="0" w15:restartNumberingAfterBreak="0">
     <w:nsid w:val="0A9B0519"/>
     <w:multiLevelType w:val="hybridMultilevel"/>
@@ -4779,7 +4922,7 @@
 </file>
 
 <file path=word/styles.xml><?xml version="1.0" encoding="utf-8"?>
-<w:styles xmlns:mc="http://schemas.openxmlformats.org/markup-compatibility/2006" xmlns:r="http://schemas.openxmlformats.org/officeDocument/2006/relationships" xmlns:w="http://schemas.openxmlformats.org/wordprocessingml/2006/main" xmlns:w14="http://schemas.microsoft.com/office/word/2010/wordml" xmlns:w15="http://schemas.microsoft.com/office/word/2012/wordml" xmlns:w16cex="http://schemas.microsoft.com/office/word/2018/wordml/cex" xmlns:w16cid="http://schemas.microsoft.com/office/word/2016/wordml/cid" xmlns:w16="http://schemas.microsoft.com/office/word/2018/wordml" xmlns:w16du="http://schemas.microsoft.com/office/word/2023/wordml/word16du" xmlns:w16sdtdh="http://schemas.microsoft.com/office/word/2020/wordml/sdtdatahash" xmlns:w16sdtfl="http://schemas.microsoft.com/office/word/2024/wordml/sdtformatlock" xmlns:w16se="http://schemas.microsoft.com/office/word/2015/wordml/symex" mc:Ignorable="w14 w15 w16se w16cid w16 w16cex w16sdtdh w16sdtfl w16du">
+<w:styles xmlns:mc="http://schemas.openxmlformats.org/markup-compatibility/2006" xmlns:r="http://schemas.openxmlformats.org/officeDocument/2006/relationships" xmlns:w="http://schemas.openxmlformats.org/wordprocessingml/2006/main" xmlns:w14="http://schemas.microsoft.com/office/word/2010/wordml" xmlns:w15="http://schemas.microsoft.com/office/word/2012/wordml" xmlns:w16cex="http://schemas.microsoft.com/office/word/2018/wordml/cex" xmlns:w16cid="http://schemas.microsoft.com/office/word/2016/wordml/cid" xmlns:w16="http://schemas.microsoft.com/office/word/2018/wordml" xmlns:w16sdtdh="http://schemas.microsoft.com/office/word/2020/wordml/sdtdatahash" xmlns:w16se="http://schemas.microsoft.com/office/word/2015/wordml/symex" mc:Ignorable="w14 w15 w16se w16cid w16 w16cex w16sdtdh">
   <w:docDefaults>
     <w:rPrDefault>
       <w:rPr>
@@ -5175,7 +5318,7 @@
     <w:lsdException w:name="Unresolved Mention" w:semiHidden="1" w:unhideWhenUsed="1"/>
     <w:lsdException w:name="Smart Link" w:semiHidden="1" w:unhideWhenUsed="1"/>
   </w:latentStyles>
-  <w:style w:type="paragraph" w:default="1" w:styleId="Normal">
+  <w:style w:type="paragraph" w:default="1" w:styleId="a">
     <w:name w:val="Normal"/>
     <w:qFormat/>
     <w:rsid w:val="00A51775"/>
@@ -5184,11 +5327,11 @@
       <w:sz w:val="28"/>
     </w:rPr>
   </w:style>
-  <w:style w:type="paragraph" w:styleId="Heading1">
+  <w:style w:type="paragraph" w:styleId="1">
     <w:name w:val="heading 1"/>
-    <w:basedOn w:val="Normal"/>
-    <w:next w:val="Normal"/>
-    <w:link w:val="Heading1Char"/>
+    <w:basedOn w:val="a"/>
+    <w:next w:val="a"/>
+    <w:link w:val="10"/>
     <w:uiPriority w:val="9"/>
     <w:qFormat/>
     <w:rsid w:val="00D63F26"/>
@@ -5204,11 +5347,11 @@
       <w:szCs w:val="40"/>
     </w:rPr>
   </w:style>
-  <w:style w:type="paragraph" w:styleId="Heading2">
+  <w:style w:type="paragraph" w:styleId="2">
     <w:name w:val="heading 2"/>
-    <w:basedOn w:val="Normal"/>
-    <w:next w:val="Normal"/>
-    <w:link w:val="Heading2Char"/>
+    <w:basedOn w:val="a"/>
+    <w:next w:val="a"/>
+    <w:link w:val="20"/>
     <w:uiPriority w:val="9"/>
     <w:unhideWhenUsed/>
     <w:qFormat/>
@@ -5225,11 +5368,11 @@
       <w:szCs w:val="32"/>
     </w:rPr>
   </w:style>
-  <w:style w:type="paragraph" w:styleId="Heading3">
+  <w:style w:type="paragraph" w:styleId="3">
     <w:name w:val="heading 3"/>
-    <w:basedOn w:val="Normal"/>
-    <w:next w:val="Normal"/>
-    <w:link w:val="Heading3Char"/>
+    <w:basedOn w:val="a"/>
+    <w:next w:val="a"/>
+    <w:link w:val="30"/>
     <w:uiPriority w:val="9"/>
     <w:unhideWhenUsed/>
     <w:qFormat/>
@@ -5246,11 +5389,11 @@
       <w:szCs w:val="28"/>
     </w:rPr>
   </w:style>
-  <w:style w:type="paragraph" w:styleId="Heading4">
+  <w:style w:type="paragraph" w:styleId="4">
     <w:name w:val="heading 4"/>
-    <w:basedOn w:val="Normal"/>
-    <w:next w:val="Normal"/>
-    <w:link w:val="Heading4Char"/>
+    <w:basedOn w:val="a"/>
+    <w:next w:val="a"/>
+    <w:link w:val="40"/>
     <w:uiPriority w:val="9"/>
     <w:semiHidden/>
     <w:unhideWhenUsed/>
@@ -5269,11 +5412,11 @@
       <w:color w:val="0F4761" w:themeColor="accent1" w:themeShade="BF"/>
     </w:rPr>
   </w:style>
-  <w:style w:type="paragraph" w:styleId="Heading5">
+  <w:style w:type="paragraph" w:styleId="5">
     <w:name w:val="heading 5"/>
-    <w:basedOn w:val="Normal"/>
-    <w:next w:val="Normal"/>
-    <w:link w:val="Heading5Char"/>
+    <w:basedOn w:val="a"/>
+    <w:next w:val="a"/>
+    <w:link w:val="50"/>
     <w:uiPriority w:val="9"/>
     <w:semiHidden/>
     <w:unhideWhenUsed/>
@@ -5290,11 +5433,11 @@
       <w:color w:val="0F4761" w:themeColor="accent1" w:themeShade="BF"/>
     </w:rPr>
   </w:style>
-  <w:style w:type="paragraph" w:styleId="Heading6">
+  <w:style w:type="paragraph" w:styleId="6">
     <w:name w:val="heading 6"/>
-    <w:basedOn w:val="Normal"/>
-    <w:next w:val="Normal"/>
-    <w:link w:val="Heading6Char"/>
+    <w:basedOn w:val="a"/>
+    <w:next w:val="a"/>
+    <w:link w:val="60"/>
     <w:uiPriority w:val="9"/>
     <w:semiHidden/>
     <w:unhideWhenUsed/>
@@ -5313,11 +5456,11 @@
       <w:color w:val="595959" w:themeColor="text1" w:themeTint="A6"/>
     </w:rPr>
   </w:style>
-  <w:style w:type="paragraph" w:styleId="Heading7">
+  <w:style w:type="paragraph" w:styleId="7">
     <w:name w:val="heading 7"/>
-    <w:basedOn w:val="Normal"/>
-    <w:next w:val="Normal"/>
-    <w:link w:val="Heading7Char"/>
+    <w:basedOn w:val="a"/>
+    <w:next w:val="a"/>
+    <w:link w:val="70"/>
     <w:uiPriority w:val="9"/>
     <w:semiHidden/>
     <w:unhideWhenUsed/>
@@ -5334,11 +5477,11 @@
       <w:color w:val="595959" w:themeColor="text1" w:themeTint="A6"/>
     </w:rPr>
   </w:style>
-  <w:style w:type="paragraph" w:styleId="Heading8">
+  <w:style w:type="paragraph" w:styleId="8">
     <w:name w:val="heading 8"/>
-    <w:basedOn w:val="Normal"/>
-    <w:next w:val="Normal"/>
-    <w:link w:val="Heading8Char"/>
+    <w:basedOn w:val="a"/>
+    <w:next w:val="a"/>
+    <w:link w:val="80"/>
     <w:uiPriority w:val="9"/>
     <w:semiHidden/>
     <w:unhideWhenUsed/>
@@ -5357,11 +5500,11 @@
       <w:color w:val="272727" w:themeColor="text1" w:themeTint="D8"/>
     </w:rPr>
   </w:style>
-  <w:style w:type="paragraph" w:styleId="Heading9">
+  <w:style w:type="paragraph" w:styleId="9">
     <w:name w:val="heading 9"/>
-    <w:basedOn w:val="Normal"/>
-    <w:next w:val="Normal"/>
-    <w:link w:val="Heading9Char"/>
+    <w:basedOn w:val="a"/>
+    <w:next w:val="a"/>
+    <w:link w:val="90"/>
     <w:uiPriority w:val="9"/>
     <w:semiHidden/>
     <w:unhideWhenUsed/>
@@ -5378,12 +5521,12 @@
       <w:color w:val="272727" w:themeColor="text1" w:themeTint="D8"/>
     </w:rPr>
   </w:style>
-  <w:style w:type="character" w:default="1" w:styleId="DefaultParagraphFont">
+  <w:style w:type="character" w:default="1" w:styleId="a0">
     <w:name w:val="Default Paragraph Font"/>
     <w:uiPriority w:val="1"/>
     <w:unhideWhenUsed/>
   </w:style>
-  <w:style w:type="table" w:default="1" w:styleId="TableNormal">
+  <w:style w:type="table" w:default="1" w:styleId="a1">
     <w:name w:val="Normal Table"/>
     <w:uiPriority w:val="99"/>
     <w:semiHidden/>
@@ -5398,16 +5541,16 @@
       </w:tblCellMar>
     </w:tblPr>
   </w:style>
-  <w:style w:type="numbering" w:default="1" w:styleId="NoList">
+  <w:style w:type="numbering" w:default="1" w:styleId="a2">
     <w:name w:val="No List"/>
     <w:uiPriority w:val="99"/>
     <w:semiHidden/>
     <w:unhideWhenUsed/>
   </w:style>
-  <w:style w:type="character" w:customStyle="1" w:styleId="Heading1Char">
-    <w:name w:val="Heading 1 Char"/>
-    <w:basedOn w:val="DefaultParagraphFont"/>
-    <w:link w:val="Heading1"/>
+  <w:style w:type="character" w:customStyle="1" w:styleId="10">
+    <w:name w:val="Заголовок 1 Знак"/>
+    <w:basedOn w:val="a0"/>
+    <w:link w:val="1"/>
     <w:uiPriority w:val="9"/>
     <w:rsid w:val="00D63F26"/>
     <w:rPr>
@@ -5416,10 +5559,10 @@
       <w:szCs w:val="40"/>
     </w:rPr>
   </w:style>
-  <w:style w:type="character" w:customStyle="1" w:styleId="Heading2Char">
-    <w:name w:val="Heading 2 Char"/>
-    <w:basedOn w:val="DefaultParagraphFont"/>
-    <w:link w:val="Heading2"/>
+  <w:style w:type="character" w:customStyle="1" w:styleId="20">
+    <w:name w:val="Заголовок 2 Знак"/>
+    <w:basedOn w:val="a0"/>
+    <w:link w:val="2"/>
     <w:uiPriority w:val="9"/>
     <w:rsid w:val="007F479D"/>
     <w:rPr>
@@ -5428,10 +5571,10 @@
       <w:szCs w:val="32"/>
     </w:rPr>
   </w:style>
-  <w:style w:type="character" w:customStyle="1" w:styleId="Heading3Char">
-    <w:name w:val="Heading 3 Char"/>
-    <w:basedOn w:val="DefaultParagraphFont"/>
-    <w:link w:val="Heading3"/>
+  <w:style w:type="character" w:customStyle="1" w:styleId="30">
+    <w:name w:val="Заголовок 3 Знак"/>
+    <w:basedOn w:val="a0"/>
+    <w:link w:val="3"/>
     <w:uiPriority w:val="9"/>
     <w:rsid w:val="00584A9D"/>
     <w:rPr>
@@ -5441,10 +5584,10 @@
       <w:szCs w:val="28"/>
     </w:rPr>
   </w:style>
-  <w:style w:type="character" w:customStyle="1" w:styleId="Heading4Char">
-    <w:name w:val="Heading 4 Char"/>
-    <w:basedOn w:val="DefaultParagraphFont"/>
-    <w:link w:val="Heading4"/>
+  <w:style w:type="character" w:customStyle="1" w:styleId="40">
+    <w:name w:val="Заголовок 4 Знак"/>
+    <w:basedOn w:val="a0"/>
+    <w:link w:val="4"/>
     <w:uiPriority w:val="9"/>
     <w:semiHidden/>
     <w:rsid w:val="0048629A"/>
@@ -5455,10 +5598,10 @@
       <w:color w:val="0F4761" w:themeColor="accent1" w:themeShade="BF"/>
     </w:rPr>
   </w:style>
-  <w:style w:type="character" w:customStyle="1" w:styleId="Heading5Char">
-    <w:name w:val="Heading 5 Char"/>
-    <w:basedOn w:val="DefaultParagraphFont"/>
-    <w:link w:val="Heading5"/>
+  <w:style w:type="character" w:customStyle="1" w:styleId="50">
+    <w:name w:val="Заголовок 5 Знак"/>
+    <w:basedOn w:val="a0"/>
+    <w:link w:val="5"/>
     <w:uiPriority w:val="9"/>
     <w:semiHidden/>
     <w:rsid w:val="0048629A"/>
@@ -5467,10 +5610,10 @@
       <w:color w:val="0F4761" w:themeColor="accent1" w:themeShade="BF"/>
     </w:rPr>
   </w:style>
-  <w:style w:type="character" w:customStyle="1" w:styleId="Heading6Char">
-    <w:name w:val="Heading 6 Char"/>
-    <w:basedOn w:val="DefaultParagraphFont"/>
-    <w:link w:val="Heading6"/>
+  <w:style w:type="character" w:customStyle="1" w:styleId="60">
+    <w:name w:val="Заголовок 6 Знак"/>
+    <w:basedOn w:val="a0"/>
+    <w:link w:val="6"/>
     <w:uiPriority w:val="9"/>
     <w:semiHidden/>
     <w:rsid w:val="0048629A"/>
@@ -5481,10 +5624,10 @@
       <w:color w:val="595959" w:themeColor="text1" w:themeTint="A6"/>
     </w:rPr>
   </w:style>
-  <w:style w:type="character" w:customStyle="1" w:styleId="Heading7Char">
-    <w:name w:val="Heading 7 Char"/>
-    <w:basedOn w:val="DefaultParagraphFont"/>
-    <w:link w:val="Heading7"/>
+  <w:style w:type="character" w:customStyle="1" w:styleId="70">
+    <w:name w:val="Заголовок 7 Знак"/>
+    <w:basedOn w:val="a0"/>
+    <w:link w:val="7"/>
     <w:uiPriority w:val="9"/>
     <w:semiHidden/>
     <w:rsid w:val="0048629A"/>
@@ -5493,10 +5636,10 @@
       <w:color w:val="595959" w:themeColor="text1" w:themeTint="A6"/>
     </w:rPr>
   </w:style>
-  <w:style w:type="character" w:customStyle="1" w:styleId="Heading8Char">
-    <w:name w:val="Heading 8 Char"/>
-    <w:basedOn w:val="DefaultParagraphFont"/>
-    <w:link w:val="Heading8"/>
+  <w:style w:type="character" w:customStyle="1" w:styleId="80">
+    <w:name w:val="Заголовок 8 Знак"/>
+    <w:basedOn w:val="a0"/>
+    <w:link w:val="8"/>
     <w:uiPriority w:val="9"/>
     <w:semiHidden/>
     <w:rsid w:val="0048629A"/>
@@ -5507,10 +5650,10 @@
       <w:color w:val="272727" w:themeColor="text1" w:themeTint="D8"/>
     </w:rPr>
   </w:style>
-  <w:style w:type="character" w:customStyle="1" w:styleId="Heading9Char">
-    <w:name w:val="Heading 9 Char"/>
-    <w:basedOn w:val="DefaultParagraphFont"/>
-    <w:link w:val="Heading9"/>
+  <w:style w:type="character" w:customStyle="1" w:styleId="90">
+    <w:name w:val="Заголовок 9 Знак"/>
+    <w:basedOn w:val="a0"/>
+    <w:link w:val="9"/>
     <w:uiPriority w:val="9"/>
     <w:semiHidden/>
     <w:rsid w:val="0048629A"/>
@@ -5519,11 +5662,11 @@
       <w:color w:val="272727" w:themeColor="text1" w:themeTint="D8"/>
     </w:rPr>
   </w:style>
-  <w:style w:type="paragraph" w:styleId="Title">
+  <w:style w:type="paragraph" w:styleId="a3">
     <w:name w:val="Title"/>
-    <w:basedOn w:val="Normal"/>
-    <w:next w:val="Normal"/>
-    <w:link w:val="TitleChar"/>
+    <w:basedOn w:val="a"/>
+    <w:next w:val="a"/>
+    <w:link w:val="a4"/>
     <w:uiPriority w:val="10"/>
     <w:qFormat/>
     <w:rsid w:val="007F479D"/>
@@ -5539,10 +5682,10 @@
       <w:szCs w:val="56"/>
     </w:rPr>
   </w:style>
-  <w:style w:type="character" w:customStyle="1" w:styleId="TitleChar">
-    <w:name w:val="Title Char"/>
-    <w:basedOn w:val="DefaultParagraphFont"/>
-    <w:link w:val="Title"/>
+  <w:style w:type="character" w:customStyle="1" w:styleId="a4">
+    <w:name w:val="Заголовок Знак"/>
+    <w:basedOn w:val="a0"/>
+    <w:link w:val="a3"/>
     <w:uiPriority w:val="10"/>
     <w:rsid w:val="007F479D"/>
     <w:rPr>
@@ -5553,11 +5696,11 @@
       <w:szCs w:val="56"/>
     </w:rPr>
   </w:style>
-  <w:style w:type="paragraph" w:styleId="Subtitle">
+  <w:style w:type="paragraph" w:styleId="a5">
     <w:name w:val="Subtitle"/>
-    <w:basedOn w:val="Normal"/>
-    <w:next w:val="Normal"/>
-    <w:link w:val="SubtitleChar"/>
+    <w:basedOn w:val="a"/>
+    <w:next w:val="a"/>
+    <w:link w:val="a6"/>
     <w:uiPriority w:val="11"/>
     <w:qFormat/>
     <w:rsid w:val="0048629A"/>
@@ -5573,10 +5716,10 @@
       <w:szCs w:val="28"/>
     </w:rPr>
   </w:style>
-  <w:style w:type="character" w:customStyle="1" w:styleId="SubtitleChar">
-    <w:name w:val="Subtitle Char"/>
-    <w:basedOn w:val="DefaultParagraphFont"/>
-    <w:link w:val="Subtitle"/>
+  <w:style w:type="character" w:customStyle="1" w:styleId="a6">
+    <w:name w:val="Подзаголовок Знак"/>
+    <w:basedOn w:val="a0"/>
+    <w:link w:val="a5"/>
     <w:uiPriority w:val="11"/>
     <w:rsid w:val="0048629A"/>
     <w:rPr>
@@ -5587,11 +5730,11 @@
       <w:szCs w:val="28"/>
     </w:rPr>
   </w:style>
-  <w:style w:type="paragraph" w:styleId="Quote">
+  <w:style w:type="paragraph" w:styleId="21">
     <w:name w:val="Quote"/>
-    <w:basedOn w:val="Normal"/>
-    <w:next w:val="Normal"/>
-    <w:link w:val="QuoteChar"/>
+    <w:basedOn w:val="a"/>
+    <w:next w:val="a"/>
+    <w:link w:val="22"/>
     <w:uiPriority w:val="29"/>
     <w:qFormat/>
     <w:rsid w:val="0048629A"/>
@@ -5605,10 +5748,10 @@
       <w:color w:val="404040" w:themeColor="text1" w:themeTint="BF"/>
     </w:rPr>
   </w:style>
-  <w:style w:type="character" w:customStyle="1" w:styleId="QuoteChar">
-    <w:name w:val="Quote Char"/>
-    <w:basedOn w:val="DefaultParagraphFont"/>
-    <w:link w:val="Quote"/>
+  <w:style w:type="character" w:customStyle="1" w:styleId="22">
+    <w:name w:val="Цитата 2 Знак"/>
+    <w:basedOn w:val="a0"/>
+    <w:link w:val="21"/>
     <w:uiPriority w:val="29"/>
     <w:rsid w:val="0048629A"/>
     <w:rPr>
@@ -5617,9 +5760,9 @@
       <w:color w:val="404040" w:themeColor="text1" w:themeTint="BF"/>
     </w:rPr>
   </w:style>
-  <w:style w:type="paragraph" w:styleId="ListParagraph">
+  <w:style w:type="paragraph" w:styleId="a7">
     <w:name w:val="List Paragraph"/>
-    <w:basedOn w:val="Normal"/>
+    <w:basedOn w:val="a"/>
     <w:uiPriority w:val="34"/>
     <w:qFormat/>
     <w:rsid w:val="0048629A"/>
@@ -5628,9 +5771,9 @@
       <w:contextualSpacing/>
     </w:pPr>
   </w:style>
-  <w:style w:type="character" w:styleId="IntenseEmphasis">
+  <w:style w:type="character" w:styleId="a8">
     <w:name w:val="Intense Emphasis"/>
-    <w:basedOn w:val="DefaultParagraphFont"/>
+    <w:basedOn w:val="a0"/>
     <w:uiPriority w:val="21"/>
     <w:qFormat/>
     <w:rsid w:val="0048629A"/>
@@ -5640,11 +5783,11 @@
       <w:color w:val="0F4761" w:themeColor="accent1" w:themeShade="BF"/>
     </w:rPr>
   </w:style>
-  <w:style w:type="paragraph" w:styleId="IntenseQuote">
+  <w:style w:type="paragraph" w:styleId="a9">
     <w:name w:val="Intense Quote"/>
-    <w:basedOn w:val="Normal"/>
-    <w:next w:val="Normal"/>
-    <w:link w:val="IntenseQuoteChar"/>
+    <w:basedOn w:val="a"/>
+    <w:next w:val="a"/>
+    <w:link w:val="aa"/>
     <w:uiPriority w:val="30"/>
     <w:qFormat/>
     <w:rsid w:val="0048629A"/>
@@ -5663,10 +5806,10 @@
       <w:color w:val="0F4761" w:themeColor="accent1" w:themeShade="BF"/>
     </w:rPr>
   </w:style>
-  <w:style w:type="character" w:customStyle="1" w:styleId="IntenseQuoteChar">
-    <w:name w:val="Intense Quote Char"/>
-    <w:basedOn w:val="DefaultParagraphFont"/>
-    <w:link w:val="IntenseQuote"/>
+  <w:style w:type="character" w:customStyle="1" w:styleId="aa">
+    <w:name w:val="Выделенная цитата Знак"/>
+    <w:basedOn w:val="a0"/>
+    <w:link w:val="a9"/>
     <w:uiPriority w:val="30"/>
     <w:rsid w:val="0048629A"/>
     <w:rPr>
@@ -5675,9 +5818,9 @@
       <w:color w:val="0F4761" w:themeColor="accent1" w:themeShade="BF"/>
     </w:rPr>
   </w:style>
-  <w:style w:type="character" w:styleId="IntenseReference">
+  <w:style w:type="character" w:styleId="ab">
     <w:name w:val="Intense Reference"/>
-    <w:basedOn w:val="DefaultParagraphFont"/>
+    <w:basedOn w:val="a0"/>
     <w:uiPriority w:val="32"/>
     <w:qFormat/>
     <w:rsid w:val="0048629A"/>
@@ -5689,10 +5832,10 @@
       <w:spacing w:val="5"/>
     </w:rPr>
   </w:style>
-  <w:style w:type="paragraph" w:styleId="Header">
+  <w:style w:type="paragraph" w:styleId="ac">
     <w:name w:val="header"/>
-    <w:basedOn w:val="Normal"/>
-    <w:link w:val="HeaderChar"/>
+    <w:basedOn w:val="a"/>
+    <w:link w:val="ad"/>
     <w:uiPriority w:val="99"/>
     <w:unhideWhenUsed/>
     <w:rsid w:val="00EC6723"/>
@@ -5704,20 +5847,20 @@
       <w:spacing w:after="0" w:line="240" w:lineRule="auto"/>
     </w:pPr>
   </w:style>
-  <w:style w:type="character" w:customStyle="1" w:styleId="HeaderChar">
-    <w:name w:val="Header Char"/>
-    <w:basedOn w:val="DefaultParagraphFont"/>
-    <w:link w:val="Header"/>
+  <w:style w:type="character" w:customStyle="1" w:styleId="ad">
+    <w:name w:val="Верхний колонтитул Знак"/>
+    <w:basedOn w:val="a0"/>
+    <w:link w:val="ac"/>
     <w:uiPriority w:val="99"/>
     <w:rsid w:val="00EC6723"/>
     <w:rPr>
       <w:rFonts w:ascii="Times New Roman" w:hAnsi="Times New Roman"/>
     </w:rPr>
   </w:style>
-  <w:style w:type="paragraph" w:styleId="Footer">
+  <w:style w:type="paragraph" w:styleId="ae">
     <w:name w:val="footer"/>
-    <w:basedOn w:val="Normal"/>
-    <w:link w:val="FooterChar"/>
+    <w:basedOn w:val="a"/>
+    <w:link w:val="af"/>
     <w:uiPriority w:val="99"/>
     <w:unhideWhenUsed/>
     <w:rsid w:val="00EC6723"/>
@@ -5729,19 +5872,19 @@
       <w:spacing w:after="0" w:line="240" w:lineRule="auto"/>
     </w:pPr>
   </w:style>
-  <w:style w:type="character" w:customStyle="1" w:styleId="FooterChar">
-    <w:name w:val="Footer Char"/>
-    <w:basedOn w:val="DefaultParagraphFont"/>
-    <w:link w:val="Footer"/>
+  <w:style w:type="character" w:customStyle="1" w:styleId="af">
+    <w:name w:val="Нижний колонтитул Знак"/>
+    <w:basedOn w:val="a0"/>
+    <w:link w:val="ae"/>
     <w:uiPriority w:val="99"/>
     <w:rsid w:val="00EC6723"/>
     <w:rPr>
       <w:rFonts w:ascii="Times New Roman" w:hAnsi="Times New Roman"/>
     </w:rPr>
   </w:style>
-  <w:style w:type="paragraph" w:styleId="NoSpacing">
+  <w:style w:type="paragraph" w:styleId="af0">
     <w:name w:val="No Spacing"/>
-    <w:link w:val="NoSpacingChar"/>
+    <w:link w:val="af1"/>
     <w:uiPriority w:val="1"/>
     <w:qFormat/>
     <w:rsid w:val="00C46936"/>
@@ -5757,10 +5900,10 @@
       <w14:ligatures w14:val="none"/>
     </w:rPr>
   </w:style>
-  <w:style w:type="character" w:customStyle="1" w:styleId="NoSpacingChar">
-    <w:name w:val="No Spacing Char"/>
-    <w:basedOn w:val="DefaultParagraphFont"/>
-    <w:link w:val="NoSpacing"/>
+  <w:style w:type="character" w:customStyle="1" w:styleId="af1">
+    <w:name w:val="Без интервала Знак"/>
+    <w:basedOn w:val="a0"/>
+    <w:link w:val="af0"/>
     <w:uiPriority w:val="1"/>
     <w:rsid w:val="00C46936"/>
     <w:rPr>
@@ -5772,10 +5915,10 @@
       <w14:ligatures w14:val="none"/>
     </w:rPr>
   </w:style>
-  <w:style w:type="paragraph" w:styleId="TOCHeading">
+  <w:style w:type="paragraph" w:styleId="af2">
     <w:name w:val="TOC Heading"/>
-    <w:basedOn w:val="Heading1"/>
-    <w:next w:val="Normal"/>
+    <w:basedOn w:val="1"/>
+    <w:next w:val="a"/>
     <w:uiPriority w:val="39"/>
     <w:unhideWhenUsed/>
     <w:qFormat/>
@@ -5794,10 +5937,10 @@
       <w14:ligatures w14:val="none"/>
     </w:rPr>
   </w:style>
-  <w:style w:type="paragraph" w:styleId="TOC2">
+  <w:style w:type="paragraph" w:styleId="23">
     <w:name w:val="toc 2"/>
-    <w:basedOn w:val="Normal"/>
-    <w:next w:val="Normal"/>
+    <w:basedOn w:val="a"/>
+    <w:next w:val="a"/>
     <w:autoRedefine/>
     <w:uiPriority w:val="39"/>
     <w:unhideWhenUsed/>
@@ -5807,10 +5950,10 @@
       <w:ind w:left="240"/>
     </w:pPr>
   </w:style>
-  <w:style w:type="paragraph" w:styleId="TOC1">
+  <w:style w:type="paragraph" w:styleId="11">
     <w:name w:val="toc 1"/>
-    <w:basedOn w:val="Normal"/>
-    <w:next w:val="Normal"/>
+    <w:basedOn w:val="a"/>
+    <w:next w:val="a"/>
     <w:autoRedefine/>
     <w:uiPriority w:val="39"/>
     <w:unhideWhenUsed/>
@@ -5819,9 +5962,9 @@
       <w:spacing w:after="100"/>
     </w:pPr>
   </w:style>
-  <w:style w:type="character" w:styleId="Hyperlink">
+  <w:style w:type="character" w:styleId="af3">
     <w:name w:val="Hyperlink"/>
-    <w:basedOn w:val="DefaultParagraphFont"/>
+    <w:basedOn w:val="a0"/>
     <w:uiPriority w:val="99"/>
     <w:unhideWhenUsed/>
     <w:rsid w:val="00DC1291"/>
@@ -5830,10 +5973,10 @@
       <w:u w:val="single"/>
     </w:rPr>
   </w:style>
-  <w:style w:type="paragraph" w:styleId="Caption">
+  <w:style w:type="paragraph" w:styleId="af4">
     <w:name w:val="caption"/>
-    <w:basedOn w:val="Normal"/>
-    <w:next w:val="Normal"/>
+    <w:basedOn w:val="a"/>
+    <w:next w:val="a"/>
     <w:uiPriority w:val="35"/>
     <w:unhideWhenUsed/>
     <w:qFormat/>
@@ -5849,9 +5992,9 @@
       <w:szCs w:val="18"/>
     </w:rPr>
   </w:style>
-  <w:style w:type="character" w:styleId="UnresolvedMention">
+  <w:style w:type="character" w:styleId="af5">
     <w:name w:val="Unresolved Mention"/>
-    <w:basedOn w:val="DefaultParagraphFont"/>
+    <w:basedOn w:val="a0"/>
     <w:uiPriority w:val="99"/>
     <w:semiHidden/>
     <w:unhideWhenUsed/>
@@ -5861,9 +6004,9 @@
       <w:shd w:val="clear" w:color="auto" w:fill="E1DFDD"/>
     </w:rPr>
   </w:style>
-  <w:style w:type="character" w:styleId="FollowedHyperlink">
+  <w:style w:type="character" w:styleId="af6">
     <w:name w:val="FollowedHyperlink"/>
-    <w:basedOn w:val="DefaultParagraphFont"/>
+    <w:basedOn w:val="a0"/>
     <w:uiPriority w:val="99"/>
     <w:semiHidden/>
     <w:unhideWhenUsed/>
@@ -5873,7 +6016,7 @@
       <w:u w:val="single"/>
     </w:rPr>
   </w:style>
-  <w:style w:type="paragraph" w:styleId="Revision">
+  <w:style w:type="paragraph" w:styleId="af7">
     <w:name w:val="Revision"/>
     <w:hidden/>
     <w:uiPriority w:val="99"/>
@@ -5887,10 +6030,10 @@
       <w:sz w:val="28"/>
     </w:rPr>
   </w:style>
-  <w:style w:type="paragraph" w:styleId="TOC3">
+  <w:style w:type="paragraph" w:styleId="31">
     <w:name w:val="toc 3"/>
-    <w:basedOn w:val="Normal"/>
-    <w:next w:val="Normal"/>
+    <w:basedOn w:val="a"/>
+    <w:next w:val="a"/>
     <w:autoRedefine/>
     <w:uiPriority w:val="39"/>
     <w:unhideWhenUsed/>
@@ -5900,9 +6043,9 @@
       <w:ind w:left="560"/>
     </w:pPr>
   </w:style>
-  <w:style w:type="table" w:styleId="TableGrid">
+  <w:style w:type="table" w:styleId="af8">
     <w:name w:val="Table Grid"/>
-    <w:basedOn w:val="TableNormal"/>
+    <w:basedOn w:val="a1"/>
     <w:uiPriority w:val="39"/>
     <w:rsid w:val="00FA43B4"/>
     <w:pPr>
@@ -5921,7 +6064,7 @@
   </w:style>
   <w:style w:type="paragraph" w:customStyle="1" w:styleId="p1">
     <w:name w:val="p1"/>
-    <w:basedOn w:val="Normal"/>
+    <w:basedOn w:val="a"/>
     <w:rsid w:val="00C3779A"/>
     <w:pPr>
       <w:spacing w:before="100" w:beforeAutospacing="1" w:after="100" w:afterAutospacing="1" w:line="240" w:lineRule="auto"/>
@@ -5930,7 +6073,7 @@
       <w:rFonts w:eastAsia="Times New Roman" w:cs="Times New Roman"/>
       <w:kern w:val="0"/>
       <w:sz w:val="24"/>
-      <w:lang w:val="en-RU" w:eastAsia="en-GB"/>
+      <w:lang w:eastAsia="en-GB"/>
       <w14:ligatures w14:val="none"/>
     </w:rPr>
   </w:style>

</xml_diff>